<commit_message>
Refine FMA validation and reporting artifacts
</commit_message>
<xml_diff>
--- a/paper/kbs_submission/final_package/supplementary.docx
+++ b/paper/kbs_submission/final_package/supplementary.docx
@@ -4,11 +4,14 @@
   <w:body>
     <w:p>
       <w:pPr>
-        <w:pStyle w:val="Heading1"/>
         <w:jc w:val="center"/>
       </w:pPr>
       <w:r>
-        <w:t>Supplementary Material for Structurally-Calibrated Functional Attribution for Audit Prioritization in Knowledge-Intensive Reasoning</w:t>
+        <w:rPr>
+          <w:b/>
+          <w:sz w:val="36"/>
+        </w:rPr>
+        <w:t>Supplementary Material</w:t>
       </w:r>
     </w:p>
     <w:p>
@@ -16,26 +19,41 @@
         <w:jc w:val="center"/>
       </w:pPr>
       <w:r>
-        <w:rPr>
-          <w:rFonts w:ascii="Calibri" w:hAnsi="Calibri"/>
-        </w:rPr>
-        <w:t>Haoran Ma, Ningning Wang</w:t>
+        <w:t>Structurally-Calibrated Functional Attribution for Audit Prioritization in Knowledge-Intensive Reasoning</w:t>
+      </w:r>
+    </w:p>
+    <w:p>
+      <w:pPr>
+        <w:jc w:val="center"/>
+      </w:pPr>
+      <w:r>
+        <w:t>Haoran Ma</w:t>
+      </w:r>
+    </w:p>
+    <w:p>
+      <w:pPr>
+        <w:jc w:val="center"/>
+      </w:pPr>
+      <w:r>
+        <w:t>Ningning Wang</w:t>
       </w:r>
     </w:p>
     <w:p>
       <w:r>
-        <w:rPr>
-          <w:rFonts w:ascii="Calibri" w:hAnsi="Calibri"/>
-        </w:rPr>
-        <w:t>Haoran Maa, Ningning Wanga,b,∗</w:t>
+        <w:t>Generated from final_source/supplementary.tex after moving detailed proofs, algorithms, extended tables, PRM800K variant details, audit-prioritization details, and KBS integration notes out of the compressed manuscript.</w:t>
+      </w:r>
+    </w:p>
+    <w:p>
+      <w:pPr>
+        <w:pStyle w:val="Heading1"/>
+      </w:pPr>
+      <w:r>
+        <w:t>Extended Proofs and Derivations</w:t>
       </w:r>
     </w:p>
     <w:p>
       <w:r>
-        <w:rPr>
-          <w:rFonts w:ascii="Calibri" w:hAnsi="Calibri"/>
-        </w:rPr>
-        <w:t>aCollege of Management Science and Engineering, Beijing Information Science and Technology University, Beijing, 102200, China bInstitute of Information Systems, ESG Intelligent Application Innovation Research Center, Beijing, 102200, China</w:t>
+        <w:t>This appendix provides supplementary derivations, edge-case analyses, and tightness constructions referenced in the main text. Full proofs of the variance-reduction and bottleneck-protection theorems, the bottleneck tightness construction, and SLSQP convergence diagnostics are provided in the supplementary materials (Supplementary Notes S2-S4).</w:t>
       </w:r>
     </w:p>
     <w:p>
@@ -43,10 +61,52 @@
         <w:pStyle w:val="Heading2"/>
       </w:pPr>
       <w:r>
-        <w:rPr>
-          <w:rFonts w:ascii="Calibri" w:hAnsi="Calibri"/>
-        </w:rPr>
-        <w:t>A R T I C L E I N F O A B S T R A C T</w:t>
+        <w:t>KKT Conditions for the SCU Objective</w:t>
+      </w:r>
+    </w:p>
+    <w:p>
+      <w:r>
+        <w:t>The Karush-Kuhn-Tucker (KKT) conditions for the SCU constrained optimization problem (Eqs.~1-2) are:</w:t>
+      </w:r>
+    </w:p>
+    <w:p>
+      <w:r>
+        <w:t>align</w:t>
+      </w:r>
+    </w:p>
+    <w:p>
+      <w:r>
+        <w:t>L w_i|_w^* - _i^* - ^*  | = 0, i</w:t>
+      </w:r>
+    </w:p>
+    <w:p>
+      <w:r>
+        <w:t>_i^*  |  0, i</w:t>
+      </w:r>
+    </w:p>
+    <w:p>
+      <w:r>
+        <w:t>_i^*(w_i^* - )  | = 0, i</w:t>
+      </w:r>
+    </w:p>
+    <w:p>
+      <w:r>
+        <w:t>w_i^*  |  , i</w:t>
+      </w:r>
+    </w:p>
+    <w:p>
+      <w:r>
+        <w:t>_i=1^k w_i^*  | = 1.</w:t>
+      </w:r>
+    </w:p>
+    <w:p>
+      <w:r>
+        <w:t>align</w:t>
+      </w:r>
+    </w:p>
+    <w:p>
+      <w:r>
+        <w:t>The partial derivative is L / w_i = 2(w_i - c_i) + 2(w_i - n_i) + 2(Rw)_i - b_i / w_i. The multiplier ^* R (unrestricted) captures the equality constraint; _i^* 0 enforce the floor constraints. By complementary slackness, _i^* &gt; 0 only when w_i^* = . The complete derivation and case-by-case analysis of boundary solutions are provided in Supplementary Note~S2.</w:t>
       </w:r>
     </w:p>
     <w:p>
@@ -54,34 +114,138 @@
         <w:pStyle w:val="Heading2"/>
       </w:pPr>
       <w:r>
-        <w:rPr>
-          <w:rFonts w:ascii="Calibri" w:hAnsi="Calibri"/>
-        </w:rPr>
-        <w:t>Keywords: This supplementary material contains extended proofs, additional controlled-benchmark results,</w:t>
+        <w:t>Derivation of the Variance Reduction Bound</w:t>
       </w:r>
     </w:p>
     <w:p>
       <w:r>
-        <w:rPr>
-          <w:rFonts w:ascii="Calibri" w:hAnsi="Calibri"/>
-        </w:rPr>
-        <w:t>supplementary material implementation details, and reproducibility notes separated from the main manuscript. The structural calibration synthetic labels discussed here are controlled proxy labels for method comparison, not external</w:t>
+        <w:t>The full algebraic derivation is provided in Supplementary Note~S2. The key steps are: (i) the two-term objective L_2(w) = \|w - c\|_2^2 + \|w - n\|_2^2 has unconstrained minimizer w = (c + n)/(+); (ii) variance decomposes as Var(w) = (/(+))^2Var(c) + (/(+))^2Var(n) + 2/(+)^2Cov(c, n); (iii) since Cov(c, n) 0.05-0.09 and Var(n) Var(c), the dominant shrinkage factor is /(+); (iv) projection onto the simplex W is non-expansive in variance~[wang2013projection], yielding the stated bound.</w:t>
+      </w:r>
+    </w:p>
+    <w:p>
+      <w:pPr>
+        <w:pStyle w:val="Heading2"/>
+      </w:pPr>
+      <w:r>
+        <w:t>Tightness Construction for Bottleneck Lower Bound</w:t>
       </w:r>
     </w:p>
     <w:p>
       <w:r>
-        <w:rPr>
-          <w:rFonts w:ascii="Calibri" w:hAnsi="Calibri"/>
-        </w:rPr>
-        <w:t>reproducibility ground truth.</w:t>
+        <w:t>The explicit tightness construction for the bottleneck lower-bound theorem is provided in Supplementary Note~S3.</w:t>
       </w:r>
     </w:p>
     <w:p>
       <w:r>
-        <w:rPr>
-          <w:rFonts w:ascii="Calibri" w:hAnsi="Calibri"/>
-        </w:rPr>
-        <w:t>knowledge graph pilot</w:t>
+        <w:t>Substituting w_2 = 1 - w_1:</w:t>
+      </w:r>
+    </w:p>
+    <w:p>
+      <w:r>
+        <w:t>equation</w:t>
+      </w:r>
+    </w:p>
+    <w:p>
+      <w:r>
+        <w:t>L(w_1) = (+)(w_1^2 + w_1^2) - (w_1) = 2(+)w_1^2 - (w_1).</w:t>
+      </w:r>
+    </w:p>
+    <w:p>
+      <w:r>
+        <w:t>equation</w:t>
+      </w:r>
+    </w:p>
+    <w:p>
+      <w:r>
+        <w:t>The first-order condition:</w:t>
+      </w:r>
+    </w:p>
+    <w:p>
+      <w:r>
+        <w:t>equation</w:t>
+      </w:r>
+    </w:p>
+    <w:p>
+      <w:r>
+        <w:t>dLdw_1 = 4(+)w_1 - w_1 = 0 w_1^* = 4(+).</w:t>
+      </w:r>
+    </w:p>
+    <w:p>
+      <w:r>
+        <w:t>equation</w:t>
+      </w:r>
+    </w:p>
+    <w:p>
+      <w:r>
+        <w:t>Setting = /(4(+)) makes the floor constraint binding and the lower bound in the bottleneck lower-bound theorem exact.</w:t>
+      </w:r>
+    </w:p>
+    <w:p>
+      <w:pPr>
+        <w:pStyle w:val="Heading2"/>
+      </w:pPr>
+      <w:r>
+        <w:t>Monotonicity Violation under Redundancy</w:t>
+      </w:r>
+    </w:p>
+    <w:p>
+      <w:r>
+        <w:t>The monotonicity theorem requires non-redundant steps (R_ik = R_jk for all k). When redundancy profiles differ, the term deliberately violates monotonicity. We illustrate with a minimal example.</w:t>
+      </w:r>
+    </w:p>
+    <w:p>
+      <w:r>
+        <w:t>Consider k = 2 with c = (0.6, 0.4)^, n = (0.5, 0.5)^, b_1 = b_2 = 0, and:</w:t>
+      </w:r>
+    </w:p>
+    <w:p>
+      <w:r>
+        <w:t>equation</w:t>
+      </w:r>
+    </w:p>
+    <w:p>
+      <w:r>
+        <w:t>R = bmatrix 1.0  |  0.9 0.9  |  1.0 bmatrix.</w:t>
+      </w:r>
+    </w:p>
+    <w:p>
+      <w:r>
+        <w:t>equation</w:t>
+      </w:r>
+    </w:p>
+    <w:p>
+      <w:r>
+        <w:t>Here c_1 &gt; c_2 and n_1 = n_2, so by CIU alone w_1^* should exceed w_2^*.</w:t>
+      </w:r>
+    </w:p>
+    <w:p>
+      <w:r>
+        <w:t>With = 1.0, = 0.5, = 0.2, = 0:</w:t>
+      </w:r>
+    </w:p>
+    <w:p>
+      <w:r>
+        <w:t>equation</w:t>
+      </w:r>
+    </w:p>
+    <w:p>
+      <w:r>
+        <w:t>L(w_1, w_2) = 1.0[(w_1-0.6)^2 + (w_2-0.4)^2] + 0.5[(w_1-0.5)^2 + (w_2-0.5)^2] + 0.2(w_1^2 + 20.9 w_1w_2 + w_2^2).</w:t>
+      </w:r>
+    </w:p>
+    <w:p>
+      <w:r>
+        <w:t>equation</w:t>
+      </w:r>
+    </w:p>
+    <w:p>
+      <w:r>
+        <w:t>Solving numerically yields w_1^* 0.47, w_2^* 0.53, i.e., w_2^* &gt; w_1^* despite c_1 &gt; c_2. The redundancy penalty equalizes the weights because steps 1 and 2 are highly similar (R_12 = 0.9), and this equalization outweighs the fidelity term. This is the designed behavior: structural calibration deliberately overrides local utility ordering when steps are substitutable, preventing the dilution of supervision across redundant operations.</w:t>
+      </w:r>
+    </w:p>
+    <w:p>
+      <w:r>
+        <w:t>Quantitative analysis across the full benchmark: among step pairs with R_ij &gt; 0.7, monotonicity violations occur in 31.2% of pairs, consistent with the deliberate equalization mechanism.</w:t>
       </w:r>
     </w:p>
     <w:p>
@@ -89,18 +253,12 @@
         <w:pStyle w:val="Heading1"/>
       </w:pPr>
       <w:r>
-        <w:rPr>
-          <w:rFonts w:ascii="Calibri" w:hAnsi="Calibri"/>
-        </w:rPr>
-        <w:t>A. Extended Proofs and Derivations</w:t>
+        <w:t>Additional Experimental Results and Figures</w:t>
       </w:r>
     </w:p>
     <w:p>
       <w:r>
-        <w:rPr>
-          <w:rFonts w:ascii="Calibri" w:hAnsi="Calibri"/>
-        </w:rPr>
-        <w:t>This appendix provides supplementary derivations, edge-case analyses, and tightness constructions referenced in the main text. Full proofs of the variance-reduction and bottleneck-protection theorems, the bottleneck tightness construction, and SLSQP convergence diagnostics are provided in the supplementary materials (Supplementary Notes</w:t>
+        <w:t>This appendix provides extended experimental results, supplementary figures, and detailed stratum analysis that support the main-text findings.</w:t>
       </w:r>
     </w:p>
     <w:p>
@@ -108,10 +266,81 @@
         <w:pStyle w:val="Heading2"/>
       </w:pPr>
       <w:r>
+        <w:t>Full Ranking Metrics per Trace Size</w:t>
+      </w:r>
+    </w:p>
+    <w:p>
+      <w:r>
+        <w:t>Table~[tab:per-size] breaks down the controlled synthetic ranking metrics by trace size (k = 3 to 8) for the three SC-FMA variants and raw CIU. Within this controlled proxy-label benchmark, SC-FMA QP is strongest at all k, with the largest gains at k 6 where redundancy effects are most pronounced.</w:t>
+      </w:r>
+    </w:p>
+    <w:p>
+      <w:r>
+        <w:t>table[ht]</w:t>
+      </w:r>
+    </w:p>
+    <w:p>
+      <w:r>
         <w:rPr>
-          <w:rFonts w:ascii="Calibri" w:hAnsi="Calibri"/>
+          <w:b/>
         </w:rPr>
-        <w:t>S2–S4).</w:t>
+        <w:t xml:space="preserve">Caption: </w:t>
+      </w:r>
+      <w:r>
+        <w:t>Step importance ranking metrics stratified by trace size k. Mean Spearman over traces of each size. Standard errors in parentheses (bootstrap, 10k resamples).</w:t>
+      </w:r>
+    </w:p>
+    <w:p>
+      <w:r>
+        <w:t>Method  |  k=3  |  k=4  |  k=5  |  k=6  |  k 7</w:t>
+      </w:r>
+    </w:p>
+    <w:p>
+      <w:r>
+        <w:t>SC-FMA QP  |  0.582 (0.041)  |  0.601 (0.038)  |  0.615 (0.035)  |  0.622 (0.033)  |  0.634 (0.029)</w:t>
+      </w:r>
+    </w:p>
+    <w:p>
+      <w:r>
+        <w:t>SC-FMA Ridge  |  0.521 (0.044)  |  0.534 (0.040)  |  0.540 (0.037)  |  0.538 (0.035)  |  0.542 (0.032)</w:t>
+      </w:r>
+    </w:p>
+    <w:p>
+      <w:r>
+        <w:t>SC-FMA Proj.  |  0.328 (0.048)  |  0.341 (0.044)  |  0.345 (0.041)  |  0.339 (0.039)  |  0.342 (0.036)</w:t>
+      </w:r>
+    </w:p>
+    <w:p>
+      <w:r>
+        <w:t>Raw CIU  |  0.471 (0.045)  |  0.485 (0.041)  |  0.490 (0.038)  |  0.482 (0.036)  |  0.486 (0.033)</w:t>
+      </w:r>
+    </w:p>
+    <w:p>
+      <w:r>
+        <w:t>(QP - CIU)  |  +0.111  |  +0.116  |  +0.125  |  +0.140  |  +0.148</w:t>
+      </w:r>
+    </w:p>
+    <w:p>
+      <w:r>
+        <w:t>table</w:t>
+      </w:r>
+    </w:p>
+    <w:p>
+      <w:r>
+        <w:t>The improvement (QP - CIU) increases monotonically with k (from +0.111 at k=3 to +0.148 at k 7), consistent with the structural calibration mechanism: larger traces contain more redundancy relationships (k2 grows quadratically), and the redundancy penalty term becomes increasingly informative.</w:t>
+      </w:r>
+    </w:p>
+    <w:p>
+      <w:pPr>
+        <w:pStyle w:val="Heading1"/>
+      </w:pPr>
+      <w:r>
+        <w:t>Main-Text Material Moved to Supplementary</w:t>
+      </w:r>
+    </w:p>
+    <w:p>
+      <w:r>
+        <w:t>This appendix records material that was removed from the compressed manuscript to keep the upload manuscript under the requested 20-page limit. The move is editorial only: it does not change the evidence boundary, hyperparameters, ranking metrics, or allowed claims.</w:t>
       </w:r>
     </w:p>
     <w:p>
@@ -119,18 +348,73 @@
         <w:pStyle w:val="Heading2"/>
       </w:pPr>
       <w:r>
-        <w:rPr>
-          <w:rFonts w:ascii="Calibri" w:hAnsi="Calibri"/>
-        </w:rPr>
-        <w:t>A.1. KKT Conditions for the SCU Objective</w:t>
+        <w:t>Notation and Positioning</w:t>
+      </w:r>
+    </w:p>
+    <w:p>
+      <w:r>
+        <w:t>table[ht]</w:t>
       </w:r>
     </w:p>
     <w:p>
       <w:r>
         <w:rPr>
-          <w:rFonts w:ascii="Calibri" w:hAnsi="Calibri"/>
+          <w:b/>
         </w:rPr>
-        <w:t>The Karush–Kuhn–Tucker (KKT) conditions for the SCU constrained optimization problem (Eqs. 1–2) are:</w:t>
+        <w:t xml:space="preserve">Caption: </w:t>
+      </w:r>
+      <w:r>
+        <w:t>Compact notation reference for the SC-FMA objective.</w:t>
+      </w:r>
+    </w:p>
+    <w:p>
+      <w:r>
+        <w:t>Symbol  |  Meaning</w:t>
+      </w:r>
+    </w:p>
+    <w:p>
+      <w:r>
+        <w:t>k  |  Number of reflective or verification steps in a trace.</w:t>
+      </w:r>
+    </w:p>
+    <w:p>
+      <w:r>
+        <w:t>w  |  Calibrated step-weight vector on the probability simplex.</w:t>
+      </w:r>
+    </w:p>
+    <w:p>
+      <w:r>
+        <w:t>c  |  Normalized utility or proxy-fidelity input.</w:t>
+      </w:r>
+    </w:p>
+    <w:p>
+      <w:r>
+        <w:t>n  |  Normalized graph-level structural necessity.</w:t>
+      </w:r>
+    </w:p>
+    <w:p>
+      <w:r>
+        <w:t>R  |  Pairwise redundancy matrix.</w:t>
+      </w:r>
+    </w:p>
+    <w:p>
+      <w:r>
+        <w:t>b  |  Bottleneck indicator vector.</w:t>
+      </w:r>
+    </w:p>
+    <w:p>
+      <w:r>
+        <w:t>,,,  |  Fidelity, structure, redundancy, and bottleneck weights.</w:t>
+      </w:r>
+    </w:p>
+    <w:p>
+      <w:r>
+        <w:t>table</w:t>
+      </w:r>
+    </w:p>
+    <w:p>
+      <w:r>
+        <w:t>SC-FMA is positioned between process supervision and graph-aware audit analysis. Process Reward Models supply step-level supervision signals; attribution methods supply local importance scores; graph diagnostics supply structural constraints. SC-FMA does not train a PRM, certify a KBS deployment, or identify causal estimands. It calibrates an existing fidelity signal using observable trace structure.</w:t>
       </w:r>
     </w:p>
     <w:p>
@@ -138,178 +422,109 @@
         <w:pStyle w:val="Heading2"/>
       </w:pPr>
       <w:r>
-        <w:rPr>
-          <w:rFonts w:ascii="Calibri" w:hAnsi="Calibri"/>
-        </w:rPr>
-        <w:t>𝜕𝐿 |</w:t>
+        <w:t>Structural Necessity and Optimization Algorithms</w:t>
+      </w:r>
+    </w:p>
+    <w:p>
+      <w:r>
+        <w:t>algorithm[ht]</w:t>
       </w:r>
     </w:p>
     <w:p>
       <w:r>
         <w:rPr>
-          <w:rFonts w:ascii="Calibri" w:hAnsi="Calibri"/>
+          <w:b/>
         </w:rPr>
-        <w:t>| − 𝜇∗ − 𝜆∗ = 0, ∀𝑖 (A.1)</w:t>
+        <w:t xml:space="preserve">Caption: </w:t>
+      </w:r>
+      <w:r>
+        <w:t>Structural Necessity Computation</w:t>
+      </w:r>
+    </w:p>
+    <w:p>
+      <w:r>
+        <w:t>Reflection DAG G=(V,E), node v_i, intervention mode m\Prune,Cascade,Bypass\</w:t>
+      </w:r>
+    </w:p>
+    <w:p>
+      <w:r>
+        <w:t>Necessity score n_i^m</w:t>
+      </w:r>
+    </w:p>
+    <w:p>
+      <w:r>
+        <w:t>Compute baseline graph utility S(G) from reachability, dependency coverage, and retained terminal support.</w:t>
+      </w:r>
+    </w:p>
+    <w:p>
+      <w:r>
+        <w:t>Apply intervention m to node v_i to obtain G_-i^m.</w:t>
+      </w:r>
+    </w:p>
+    <w:p>
+      <w:r>
+        <w:t>Recompute graph utility S(G_-i^m).</w:t>
+      </w:r>
+    </w:p>
+    <w:p>
+      <w:r>
+        <w:t>Return n_i^m=(0,S(G)-S(G_-i^m)).</w:t>
+      </w:r>
+    </w:p>
+    <w:p>
+      <w:r>
+        <w:t>algorithm</w:t>
+      </w:r>
+    </w:p>
+    <w:p>
+      <w:r>
+        <w:t>algorithm[ht]</w:t>
       </w:r>
     </w:p>
     <w:p>
       <w:r>
         <w:rPr>
-          <w:rFonts w:ascii="Calibri" w:hAnsi="Calibri"/>
+          <w:b/>
         </w:rPr>
-        <w:t>𝜕𝑤 | 𝑖</w:t>
+        <w:t xml:space="preserve">Caption: </w:t>
+      </w:r>
+      <w:r>
+        <w:t>SC-FMA QP Calibration</w:t>
       </w:r>
     </w:p>
     <w:p>
       <w:r>
-        <w:rPr>
-          <w:rFonts w:ascii="Calibri" w:hAnsi="Calibri"/>
-        </w:rPr>
-        <w:t>𝑖 |𝐰∗</w:t>
+        <w:t>c, n, R, b, hyperparameters ,,,</w:t>
       </w:r>
     </w:p>
     <w:p>
       <w:r>
-        <w:rPr>
-          <w:rFonts w:ascii="Calibri" w:hAnsi="Calibri"/>
-        </w:rPr>
-        <w:t>𝜇∗ ≥ 0, ∀𝑖 (A.2)</w:t>
+        <w:t>Calibrated weights w^*</w:t>
       </w:r>
     </w:p>
     <w:p>
       <w:r>
-        <w:rPr>
-          <w:rFonts w:ascii="Calibri" w:hAnsi="Calibri"/>
-        </w:rPr>
-        <w:t>𝑖</w:t>
+        <w:t>Define the simplex W=\w 0,_i w_i=1\.</w:t>
       </w:r>
     </w:p>
     <w:p>
       <w:r>
-        <w:rPr>
-          <w:rFonts w:ascii="Calibri" w:hAnsi="Calibri"/>
-        </w:rPr>
-        <w:t>𝜇∗(𝑤∗ − 𝜀) = 0, ∀𝑖 (A.3)</w:t>
+        <w:t>Minimize L(w)=\|w-c\|_2^2+\|w-n\|_2^2+^-_i b_i(w_i) over W.</w:t>
       </w:r>
     </w:p>
     <w:p>
       <w:r>
-        <w:rPr>
-          <w:rFonts w:ascii="Calibri" w:hAnsi="Calibri"/>
-        </w:rPr>
-        <w:t>𝑖 𝑖</w:t>
+        <w:t>Use the Ridge solution as a warm start when available.</w:t>
       </w:r>
     </w:p>
     <w:p>
       <w:r>
-        <w:rPr>
-          <w:rFonts w:ascii="Calibri" w:hAnsi="Calibri"/>
-        </w:rPr>
-        <w:t>𝑤∗ ≥ 𝜀, ∀𝑖 (A.4)</w:t>
+        <w:t>Return the SLSQP solution if convergence and simplex constraints pass tolerance; otherwise return the Ridge fallback.</w:t>
       </w:r>
     </w:p>
     <w:p>
       <w:r>
-        <w:rPr>
-          <w:rFonts w:ascii="Calibri" w:hAnsi="Calibri"/>
-        </w:rPr>
-        <w:t>𝑖</w:t>
-      </w:r>
-    </w:p>
-    <w:p>
-      <w:r>
-        <w:rPr>
-          <w:rFonts w:ascii="Calibri" w:hAnsi="Calibri"/>
-        </w:rPr>
-        <w:t>𝑘</w:t>
-      </w:r>
-    </w:p>
-    <w:p>
-      <w:r>
-        <w:rPr>
-          <w:rFonts w:ascii="Calibri" w:hAnsi="Calibri"/>
-        </w:rPr>
-        <w:t>∑</w:t>
-      </w:r>
-    </w:p>
-    <w:p>
-      <w:r>
-        <w:rPr>
-          <w:rFonts w:ascii="Calibri" w:hAnsi="Calibri"/>
-        </w:rPr>
-        <w:t>𝑤∗ = 1. (A.5)</w:t>
-      </w:r>
-    </w:p>
-    <w:p>
-      <w:r>
-        <w:rPr>
-          <w:rFonts w:ascii="Calibri" w:hAnsi="Calibri"/>
-        </w:rPr>
-        <w:t>𝑖</w:t>
-      </w:r>
-    </w:p>
-    <w:p>
-      <w:r>
-        <w:rPr>
-          <w:rFonts w:ascii="Calibri" w:hAnsi="Calibri"/>
-        </w:rPr>
-        <w:t>𝑖=1</w:t>
-      </w:r>
-    </w:p>
-    <w:p>
-      <w:r>
-        <w:rPr>
-          <w:rFonts w:ascii="Calibri" w:hAnsi="Calibri"/>
-        </w:rPr>
-        <w:t>The partial derivative is 𝜕𝐿∕𝜕𝑤 = 2𝛼(𝑤 − 𝑐̃ ) + 2𝛽(𝑤 − 𝑛̃ ) + 2𝛾(𝐑𝐰) − 𝛿𝑏 ∕𝑤 . The multiplier 𝜆∗ ∈ ℝ</w:t>
-      </w:r>
-    </w:p>
-    <w:p>
-      <w:r>
-        <w:rPr>
-          <w:rFonts w:ascii="Calibri" w:hAnsi="Calibri"/>
-        </w:rPr>
-        <w:t>𝑖 𝑖 𝑖 𝑖 𝑖 𝑖 𝑖 𝑖</w:t>
-      </w:r>
-    </w:p>
-    <w:p>
-      <w:r>
-        <w:rPr>
-          <w:rFonts w:ascii="Calibri" w:hAnsi="Calibri"/>
-        </w:rPr>
-        <w:t>(unrestricted) captures the equality constraint; 𝜇∗ ≥ 0 enforce the floor constraints. By complementary slackness,</w:t>
-      </w:r>
-    </w:p>
-    <w:p>
-      <w:r>
-        <w:rPr>
-          <w:rFonts w:ascii="Calibri" w:hAnsi="Calibri"/>
-        </w:rPr>
-        <w:t>𝑖</w:t>
-      </w:r>
-    </w:p>
-    <w:p>
-      <w:r>
-        <w:rPr>
-          <w:rFonts w:ascii="Calibri" w:hAnsi="Calibri"/>
-        </w:rPr>
-        <w:t>𝜇∗ &gt; 0 only when 𝑤∗ = 𝜀. The complete derivation and case-by-case analysis of boundary solutions are provided in</w:t>
-      </w:r>
-    </w:p>
-    <w:p>
-      <w:r>
-        <w:rPr>
-          <w:rFonts w:ascii="Calibri" w:hAnsi="Calibri"/>
-        </w:rPr>
-        <w:t>𝑖 𝑖</w:t>
-      </w:r>
-    </w:p>
-    <w:p>
-      <w:r>
-        <w:rPr>
-          <w:rFonts w:ascii="Calibri" w:hAnsi="Calibri"/>
-        </w:rPr>
-        <w:t>Supplementary Note S2.</w:t>
+        <w:t>algorithm</w:t>
       </w:r>
     </w:p>
     <w:p>
@@ -317,63 +532,134 @@
         <w:pStyle w:val="Heading2"/>
       </w:pPr>
       <w:r>
-        <w:rPr>
-          <w:rFonts w:ascii="Calibri" w:hAnsi="Calibri"/>
-        </w:rPr>
-        <w:t>A.2. Derivation of the Variance Reduction Bound</w:t>
+        <w:t>Hyperparameters and Ablations</w:t>
+      </w:r>
+    </w:p>
+    <w:p>
+      <w:r>
+        <w:t>table[ht]</w:t>
       </w:r>
     </w:p>
     <w:p>
       <w:r>
         <w:rPr>
-          <w:rFonts w:ascii="Calibri" w:hAnsi="Calibri"/>
+          <w:b/>
         </w:rPr>
-        <w:t>The full algebraic derivation is provided in Supplementary Note S2. The key steps are: (i) the two-term objective 𝐿 2 (𝐰) = 𝛼 ‖ 𝐰 − 𝐜̃ ‖ 2 2 + 𝛽 ‖ 𝐰 − 𝐧̃ ‖ 2 2 has unconstrained minimizer 𝐰̂ = (𝛼𝐜̃ + 𝛽𝐧̃ )∕(𝛼 + 𝛽); (ii) variance decomposes as Var(𝐰̂ ) = (𝛼∕(𝛼 + 𝛽))2 Var(𝐜̃) + (𝛽∕(𝛼 + 𝛽))2 Var(𝐧̃ ) + 2𝛼𝛽∕(𝛼 + 𝛽)2 Cov(𝐜̃, 𝐧̃ ); (iii) since Cov(𝐜̃, 𝐧̃ ) ≈ 0.05–0.09 and Var(𝐧̃ ) ≪ Var(𝐜̃), the dominant shrinkage factor is 𝛼∕(𝛼 + 𝛽); (iv) projection onto the simplex  is non-expansive in</w:t>
+        <w:t xml:space="preserve">Caption: </w:t>
+      </w:r>
+      <w:r>
+        <w:t>Hyperparameter search grid and selected values used for the controlled synthetic benchmark.</w:t>
+      </w:r>
+    </w:p>
+    <w:p>
+      <w:r>
+        <w:t>Parameter  |  Search range  |  Selected value  |  Role</w:t>
+      </w:r>
+    </w:p>
+    <w:p>
+      <w:r>
+        <w:t xml:space="preserve"> |  \0.1,0.5,1.0,2.0\  |  1.0  |  Fidelity to supplied utility anchor.</w:t>
+      </w:r>
+    </w:p>
+    <w:p>
+      <w:r>
+        <w:t xml:space="preserve"> |  \0.0,0.25,0.5,1.0\  |  0.5  |  Structural necessity alignment.</w:t>
+      </w:r>
+    </w:p>
+    <w:p>
+      <w:r>
+        <w:t xml:space="preserve"> |  \0.0,0.1,0.2,0.5\  |  0.2  |  Redundancy penalty.</w:t>
+      </w:r>
+    </w:p>
+    <w:p>
+      <w:r>
+        <w:t xml:space="preserve"> |  \0.0,0.05,0.1,0.2\  |  0.1  |  Bottleneck log-barrier.</w:t>
+      </w:r>
+    </w:p>
+    <w:p>
+      <w:r>
+        <w:t xml:space="preserve"> |  \10^-6,10^-5,10^-4,10^-3\  |  10^-4  |  Numerical floor for weights.</w:t>
+      </w:r>
+    </w:p>
+    <w:p>
+      <w:r>
+        <w:t>table</w:t>
+      </w:r>
+    </w:p>
+    <w:p>
+      <w:r>
+        <w:t>table[ht]</w:t>
       </w:r>
     </w:p>
     <w:p>
       <w:r>
         <w:rPr>
-          <w:rFonts w:ascii="Calibri" w:hAnsi="Calibri"/>
+          <w:b/>
         </w:rPr>
-        <w:t>variance [1], yielding the stated bound.</w:t>
+        <w:t xml:space="preserve">Caption: </w:t>
+      </w:r>
+      <w:r>
+        <w:t>Extended ablation results moved from the main manuscript. is relative to full SC-FMA QP.</w:t>
       </w:r>
     </w:p>
     <w:p>
       <w:r>
-        <w:rPr>
-          <w:rFonts w:ascii="Calibri" w:hAnsi="Calibri"/>
-        </w:rPr>
-        <w:t>∗Corresponding author.</w:t>
+        <w:t xml:space="preserve">Variant  |  Spearman  | </w:t>
       </w:r>
     </w:p>
     <w:p>
       <w:r>
-        <w:rPr>
-          <w:rFonts w:ascii="Calibri" w:hAnsi="Calibri"/>
-        </w:rPr>
-        <w:t>mahaoran0000@foamail.com (H. Ma); wangningning@bistu.edu.cn (N. Wang)</w:t>
+        <w:t>SC-FMA QP (full)  |  0.608  |  --</w:t>
       </w:r>
     </w:p>
     <w:p>
       <w:r>
-        <w:rPr>
-          <w:rFonts w:ascii="Calibri" w:hAnsi="Calibri"/>
-        </w:rPr>
-        <w:t>ORCID(s):</w:t>
+        <w:t>- Structure  |  0.551  |  -0.057</w:t>
       </w:r>
     </w:p>
     <w:p>
       <w:r>
-        <w:rPr>
-          <w:rFonts w:ascii="Calibri" w:hAnsi="Calibri"/>
-        </w:rPr>
-        <w:t>Ma and Wang: Preprint submitted to Elsevier Page 1</w:t>
+        <w:t>- Fidelity  |  0.536  |  -0.072</w:t>
       </w:r>
     </w:p>
     <w:p>
       <w:r>
-        <w:br w:type="page"/>
+        <w:t>- Redundancy  |  0.586  |  -0.022</w:t>
+      </w:r>
+    </w:p>
+    <w:p>
+      <w:r>
+        <w:t>- Bottleneck  |  0.595  |  -0.013</w:t>
+      </w:r>
+    </w:p>
+    <w:p>
+      <w:r>
+        <w:t>Structure only  |  0.438  |  -0.170</w:t>
+      </w:r>
+    </w:p>
+    <w:p>
+      <w:r>
+        <w:t>Fidelity only (Raw CIU)  |  0.483  |  -0.125</w:t>
+      </w:r>
+    </w:p>
+    <w:p>
+      <w:r>
+        <w:t>Fidelity + Structure  |  0.573  |  -0.035</w:t>
+      </w:r>
+    </w:p>
+    <w:p>
+      <w:r>
+        <w:t>Fidelity + Redundancy  |  0.518  |  -0.090</w:t>
+      </w:r>
+    </w:p>
+    <w:p>
+      <w:r>
+        <w:t>Fidelity + Bottleneck  |  0.504  |  -0.104</w:t>
+      </w:r>
+    </w:p>
+    <w:p>
+      <w:r>
+        <w:t>table</w:t>
       </w:r>
     </w:p>
     <w:p>
@@ -381,122 +667,78 @@
         <w:pStyle w:val="Heading2"/>
       </w:pPr>
       <w:r>
-        <w:rPr>
-          <w:rFonts w:ascii="Calibri" w:hAnsi="Calibri"/>
-        </w:rPr>
-        <w:t>A.3. Tightness Construction for Bottleneck Lower Bound</w:t>
+        <w:t>Efficiency and Scaling</w:t>
+      </w:r>
+    </w:p>
+    <w:p>
+      <w:r>
+        <w:t>table[ht]</w:t>
       </w:r>
     </w:p>
     <w:p>
       <w:r>
         <w:rPr>
-          <w:rFonts w:ascii="Calibri" w:hAnsi="Calibri"/>
+          <w:b/>
         </w:rPr>
-        <w:t>The explicit tightness construction for the bottleneck lower-bound theorem is provided in Supplementary Note S3.</w:t>
+        <w:t xml:space="preserve">Caption: </w:t>
+      </w:r>
+      <w:r>
+        <w:t>Computational efficiency moved from the main manuscript. Times are per-trace mean over the synthetic test set.</w:t>
       </w:r>
     </w:p>
     <w:p>
       <w:r>
-        <w:rPr>
-          <w:rFonts w:ascii="Calibri" w:hAnsi="Calibri"/>
-        </w:rPr>
-        <w:t>Substituting 𝑤 = 1 − 𝑤 :</w:t>
+        <w:t>Method  |  Wall-clock (ms)  |  Scaling exponent p</w:t>
       </w:r>
     </w:p>
     <w:p>
       <w:r>
-        <w:rPr>
-          <w:rFonts w:ascii="Calibri" w:hAnsi="Calibri"/>
-        </w:rPr>
-        <w:t>2 1</w:t>
+        <w:t>SC-FMA QP  |  6.8 2.9  |  2.81</w:t>
       </w:r>
     </w:p>
     <w:p>
       <w:r>
-        <w:rPr>
-          <w:rFonts w:ascii="Calibri" w:hAnsi="Calibri"/>
-        </w:rPr>
-        <w:t>𝐿(𝑤 ) = (𝛼 + 𝛽)(𝑤2 + 𝑤2) − 𝛿 log(𝑤 ) = 2(𝛼 + 𝛽)𝑤2 − 𝛿 log(𝑤 ). (A.6)</w:t>
+        <w:t>SC-FMA Ridge  |  0.4 0.1  |  0.97</w:t>
       </w:r>
     </w:p>
     <w:p>
       <w:r>
-        <w:rPr>
-          <w:rFonts w:ascii="Calibri" w:hAnsi="Calibri"/>
-        </w:rPr>
-        <w:t>1 1 1 1 1 1</w:t>
+        <w:t>SC-FMA Projection  |  0.2 0.05  |  0.98</w:t>
       </w:r>
     </w:p>
     <w:p>
       <w:r>
-        <w:rPr>
-          <w:rFonts w:ascii="Calibri" w:hAnsi="Calibri"/>
-        </w:rPr>
-        <w:t>The first-order condition:</w:t>
+        <w:t>Raw CIU  |  0.8 0.2  |  0.95</w:t>
       </w:r>
     </w:p>
     <w:p>
       <w:r>
-        <w:rPr>
-          <w:rFonts w:ascii="Calibri" w:hAnsi="Calibri"/>
-        </w:rPr>
-        <w:t>√</w:t>
+        <w:t>MC Shapley (500 permutations)  |  3,420 890  |  1.03</w:t>
       </w:r>
     </w:p>
     <w:p>
       <w:r>
-        <w:rPr>
-          <w:rFonts w:ascii="Calibri" w:hAnsi="Calibri"/>
-        </w:rPr>
-        <w:t>𝑑𝐿 𝛿 𝛿</w:t>
+        <w:t>GradientInput  |  12.4 3.1  |  1.12</w:t>
       </w:r>
     </w:p>
     <w:p>
       <w:r>
-        <w:rPr>
-          <w:rFonts w:ascii="Calibri" w:hAnsi="Calibri"/>
-        </w:rPr>
-        <w:t>= 4(𝛼 + 𝛽)𝑤 − = 0 ⟹ 𝑤∗ = . (A.7)</w:t>
+        <w:t>Attention Rollout  |  8.1 1.7  |  1.15</w:t>
       </w:r>
     </w:p>
     <w:p>
       <w:r>
-        <w:rPr>
-          <w:rFonts w:ascii="Calibri" w:hAnsi="Calibri"/>
-        </w:rPr>
-        <w:t>𝑑𝑤 1 𝑤 1 4(𝛼 + 𝛽)</w:t>
+        <w:t>Token Surprisal  |  45.2 8.3  |  1.08</w:t>
       </w:r>
     </w:p>
     <w:p>
       <w:r>
-        <w:rPr>
-          <w:rFonts w:ascii="Calibri" w:hAnsi="Calibri"/>
-        </w:rPr>
-        <w:t>1 1</w:t>
+        <w:t>table</w:t>
       </w:r>
     </w:p>
     <w:p>
       <w:r>
-        <w:rPr>
-          <w:rFonts w:ascii="Calibri" w:hAnsi="Calibri"/>
-        </w:rPr>
-        <w:t>√</w:t>
-      </w:r>
-    </w:p>
-    <w:p>
-      <w:r>
-        <w:rPr>
-          <w:rFonts w:ascii="Calibri" w:hAnsi="Calibri"/>
-        </w:rPr>
-        <w:t>Setting 𝜀 = 𝛿∕(4(𝛼 + 𝛽)) makes the floor constraint binding and the lower bound in the bottleneck lower-bound</w:t>
-      </w:r>
-    </w:p>
-    <w:p>
-      <w:r>
-        <w:rPr>
-          <w:rFonts w:ascii="Calibri" w:hAnsi="Calibri"/>
-        </w:rPr>
-        <w:t>theorem exact.</w:t>
+        <w:t>The full scaling figure remains available as Figure~[fig:resilience-app] and in the source figure bundle. The main manuscript reports only the page-budget-critical conclusion: Ridge is the lightweight real-data approximation, while QP is used for the controlled synthetic benchmark.</w:t>
       </w:r>
     </w:p>
     <w:p>
@@ -504,66 +746,139 @@
         <w:pStyle w:val="Heading2"/>
       </w:pPr>
       <w:r>
-        <w:rPr>
-          <w:rFonts w:ascii="Calibri" w:hAnsi="Calibri"/>
-        </w:rPr>
-        <w:t>A.4. Monotonicity Violation under Redundancy</w:t>
+        <w:t>PRM800K Variant Details and Audit Readout</w:t>
+      </w:r>
+    </w:p>
+    <w:p>
+      <w:r>
+        <w:t>table[ht]</w:t>
       </w:r>
     </w:p>
     <w:p>
       <w:r>
         <w:rPr>
-          <w:rFonts w:ascii="Calibri" w:hAnsi="Calibri"/>
+          <w:b/>
         </w:rPr>
-        <w:t>The monotonicity theorem requires non-redundant steps (𝑅 = 𝑅 for all 𝑘). When redundancy profiles differ,</w:t>
+        <w:t xml:space="preserve">Caption: </w:t>
+      </w:r>
+      <w:r>
+        <w:t>SC-FMA calibration variant comparison on the PRM800K locked split. All variants use w_struct predictions as the fidelity input.</w:t>
+      </w:r>
+    </w:p>
+    <w:p>
+      <w:r>
+        <w:t>Method  |  Mean  |  95% CI  |  vs. w_struct</w:t>
+      </w:r>
+    </w:p>
+    <w:p>
+      <w:r>
+        <w:t>w_struct  |  0.611  |  [0.605,0.618]  |  --</w:t>
+      </w:r>
+    </w:p>
+    <w:p>
+      <w:r>
+        <w:t>SC-FMA Ridge  |  0.604  |  [0.597,0.611]  |  -0.007</w:t>
+      </w:r>
+    </w:p>
+    <w:p>
+      <w:r>
+        <w:t>SC-FMA QP  |  0.442  |  [0.432,0.452]  |  -0.169</w:t>
+      </w:r>
+    </w:p>
+    <w:p>
+      <w:r>
+        <w:t>SC-FMA Projection  |  -0.135  |  [-0.147,-0.122]  |  -0.746</w:t>
+      </w:r>
+    </w:p>
+    <w:p>
+      <w:r>
+        <w:t>Raw local utility  |  -0.078  |  [-0.092,-0.064]  |  -0.689</w:t>
+      </w:r>
+    </w:p>
+    <w:p>
+      <w:r>
+        <w:t>Frozen PRM prefix score  |  0.252  |  --  |  -0.359</w:t>
+      </w:r>
+    </w:p>
+    <w:p>
+      <w:r>
+        <w:t>Random  |  0.006  |  [-0.008,0.020]  |  -0.606</w:t>
+      </w:r>
+    </w:p>
+    <w:p>
+      <w:r>
+        <w:t>table</w:t>
+      </w:r>
+    </w:p>
+    <w:p>
+      <w:r>
+        <w:t>table[ht]</w:t>
       </w:r>
     </w:p>
     <w:p>
       <w:r>
         <w:rPr>
-          <w:rFonts w:ascii="Calibri" w:hAnsi="Calibri"/>
+          <w:b/>
         </w:rPr>
-        <w:t>𝑖𝑘 𝑗𝑘</w:t>
+        <w:t xml:space="preserve">Caption: </w:t>
+      </w:r>
+      <w:r>
+        <w:t>Offline PRM800K audit-prioritization readout under a fixed review budget.</w:t>
       </w:r>
     </w:p>
     <w:p>
       <w:r>
-        <w:rPr>
-          <w:rFonts w:ascii="Calibri" w:hAnsi="Calibri"/>
-        </w:rPr>
-        <w:t>the 𝛾 term deliberately violates monotonicity. We illustrate with a minimal example.</w:t>
+        <w:t>Method  |  Top-1 hit  |  Mass@25%  |  NDCG@25%</w:t>
       </w:r>
     </w:p>
     <w:p>
       <w:r>
-        <w:rPr>
-          <w:rFonts w:ascii="Calibri" w:hAnsi="Calibri"/>
-        </w:rPr>
-        <w:t>Consider 𝑘 = 2 with 𝐜̃ = (0.6, 0.4)⊤, 𝐧̃ = (0.5, 0.5)⊤, 𝑏 = 𝑏 = 0, and:</w:t>
+        <w:t>w_struct  |  0.9169  |  0.3809  |  0.9506</w:t>
       </w:r>
     </w:p>
     <w:p>
       <w:r>
-        <w:rPr>
-          <w:rFonts w:ascii="Calibri" w:hAnsi="Calibri"/>
-        </w:rPr>
-        <w:t>1 2</w:t>
+        <w:t>SC-FMA Ridge  |  0.9054  |  0.3796  |  0.9460</w:t>
       </w:r>
     </w:p>
     <w:p>
       <w:r>
-        <w:rPr>
-          <w:rFonts w:ascii="Calibri" w:hAnsi="Calibri"/>
-        </w:rPr>
-        <w:t>[ ]</w:t>
+        <w:t>SC-FMA QP  |  0.9033  |  0.3790  |  0.9439</w:t>
       </w:r>
     </w:p>
     <w:p>
       <w:r>
-        <w:rPr>
-          <w:rFonts w:ascii="Calibri" w:hAnsi="Calibri"/>
-        </w:rPr>
-        <w:t>1.0 0.9</w:t>
+        <w:t>Frozen PRM prefix score  |  --  |  --  |  0.8465</w:t>
+      </w:r>
+    </w:p>
+    <w:p>
+      <w:r>
+        <w:t>Random  |  --  |  --  |  0.7757</w:t>
+      </w:r>
+    </w:p>
+    <w:p>
+      <w:r>
+        <w:t>Span length  |  --  |  --  |  0.7526</w:t>
+      </w:r>
+    </w:p>
+    <w:p>
+      <w:r>
+        <w:t>Raw local utility  |  --  |  --  |  0.7221</w:t>
+      </w:r>
+    </w:p>
+    <w:p>
+      <w:r>
+        <w:t>Relative position  |  --  |  --  |  0.3204</w:t>
+      </w:r>
+    </w:p>
+    <w:p>
+      <w:r>
+        <w:t>table</w:t>
+      </w:r>
+    </w:p>
+    <w:p>
+      <w:r>
+        <w:t>These tables retain the route-specific downgrade: the strongest real-data result is w_struct; Ridge is a close approximation; QP and Projection are not reported as real-data winners.</w:t>
       </w:r>
     </w:p>
     <w:p>
@@ -571,122 +886,134 @@
         <w:pStyle w:val="Heading2"/>
       </w:pPr>
       <w:r>
-        <w:rPr>
-          <w:rFonts w:ascii="Calibri" w:hAnsi="Calibri"/>
-        </w:rPr>
-        <w:t>𝐑 = . (A.8)</w:t>
+        <w:t>KBS Integration Notes and KG Fixture Pilot</w:t>
+      </w:r>
+    </w:p>
+    <w:p>
+      <w:r>
+        <w:t>The main manuscript compresses KBS implications to the methodological level. The detailed mapping is: high-necessity steps suggest review-priority knowledge assertions or verification rules; high-redundancy steps suggest candidate consolidation; bottleneck steps suggest single points of failure that deserve fallback or curation. These mappings remain analogies until tested in a rule engine, ontology reasoner, KG query engine, or production KBS workflow.</w:t>
+      </w:r>
+    </w:p>
+    <w:p>
+      <w:r>
+        <w:t>The fixture-level KG pilot uses the Countries knowledge graph with country and region entities and locatedIn/neighborOf triples. It compares TF-IDF topical edges with KG-augmented edges for synthetic query traces. The pilot demonstrates implementation feasibility for ontology-aware edge construction, but it is not production KBS validation and is not used to strengthen the main empirical claim.</w:t>
+      </w:r>
+    </w:p>
+    <w:p>
+      <w:pPr>
+        <w:pStyle w:val="Heading2"/>
+      </w:pPr>
+      <w:r>
+        <w:t>Supplementary Diagnostic Figures</w:t>
+      </w:r>
+    </w:p>
+    <w:p>
+      <w:r>
+        <w:t>Figures~[fig:mode-comparison]-[fig:resilience-app] provide the supplementary structural diagnostic figures referenced in the main text.</w:t>
+      </w:r>
+    </w:p>
+    <w:p>
+      <w:r>
+        <w:t>figure[ht]</w:t>
+      </w:r>
+    </w:p>
+    <w:p>
+      <w:r>
+        <w:t>[Supplementary figure retained in LaTeX/PDF source package]</w:t>
       </w:r>
     </w:p>
     <w:p>
       <w:r>
         <w:rPr>
-          <w:rFonts w:ascii="Calibri" w:hAnsi="Calibri"/>
+          <w:b/>
         </w:rPr>
-        <w:t>0.9 1.0</w:t>
+        <w:t xml:space="preserve">Caption: </w:t>
+      </w:r>
+      <w:r>
+        <w:t>Structural diagnostic summary by perturbation mode. The three perturbation modes (PRUNE, CASCADE, BYPASS) are compared on Pearson correlation, Spearman rank correlation, and zero-necessity fraction. Error bars indicate 95% bootstrap confidence intervals. The consistency across modes confirms that weak CIU-necessity alignment is not an artifact of a single perturbation strategy.</w:t>
+      </w:r>
+    </w:p>
+    <w:p>
+      <w:r>
+        <w:t>figure</w:t>
+      </w:r>
+    </w:p>
+    <w:p>
+      <w:r>
+        <w:t>figure[ht]</w:t>
+      </w:r>
+    </w:p>
+    <w:p>
+      <w:r>
+        <w:t>[Supplementary figure retained in LaTeX/PDF source package]</w:t>
       </w:r>
     </w:p>
     <w:p>
       <w:r>
         <w:rPr>
-          <w:rFonts w:ascii="Calibri" w:hAnsi="Calibri"/>
+          <w:b/>
         </w:rPr>
-        <w:t>Here 𝑐̃ &gt; 𝑐̃ and 𝑛̃ = 𝑛̃ , so by CIU alone 𝑤∗ should exceed 𝑤∗.</w:t>
+        <w:t xml:space="preserve">Caption: </w:t>
+      </w:r>
+      <w:r>
+        <w:t>Redundancy density and compensation analysis. Panel (a): per-trace redundancy density distribution (mean 0.3842). Panel (b): per-node compensation ratio distribution under PRUNE mode (median 0.000, mean 0.0084). The concentration of compensation at zero confirms that reflective reasoning traces exhibit limited structural redistribution: removing a node rarely increases the necessity of its downstream neighbors.</w:t>
+      </w:r>
+    </w:p>
+    <w:p>
+      <w:r>
+        <w:t>figure</w:t>
+      </w:r>
+    </w:p>
+    <w:p>
+      <w:r>
+        <w:t>figure[ht]</w:t>
+      </w:r>
+    </w:p>
+    <w:p>
+      <w:r>
+        <w:t>[Supplementary figure retained in LaTeX/PDF source package]</w:t>
       </w:r>
     </w:p>
     <w:p>
       <w:r>
         <w:rPr>
-          <w:rFonts w:ascii="Calibri" w:hAnsi="Calibri"/>
+          <w:b/>
         </w:rPr>
-        <w:t>1 2 1 2 1 2</w:t>
+        <w:t xml:space="preserve">Caption: </w:t>
+      </w:r>
+      <w:r>
+        <w:t>Resilience curves under ordered node removal. Four removal orders are compared: necessity-first, attribution-first, sequential (original trace order), and deterministic random (hash-based). The y-axis shows remaining structural necessity fraction; the x-axis is the fraction of nodes removed. AUC values are annotated. The necessity-first curve degrades sharply (AUC 0.1488), while attribution-first (AUC 0.4761) is close to random (AUC 0.5098), demonstrating that local CIU is not a sufficient proxy for structural criticality.</w:t>
       </w:r>
     </w:p>
     <w:p>
       <w:r>
-        <w:rPr>
-          <w:rFonts w:ascii="Calibri" w:hAnsi="Calibri"/>
-        </w:rPr>
-        <w:t>With 𝛼 = 1.0, 𝛽 = 0.5, 𝛾 = 0.2, 𝛿 = 0:</w:t>
+        <w:t>figure</w:t>
+      </w:r>
+    </w:p>
+    <w:p>
+      <w:pPr>
+        <w:pStyle w:val="Heading2"/>
+      </w:pPr>
+      <w:r>
+        <w:t>Stratum-Dependent Held-Out Analysis</w:t>
       </w:r>
     </w:p>
     <w:p>
       <w:r>
-        <w:rPr>
-          <w:rFonts w:ascii="Calibri" w:hAnsi="Calibri"/>
-        </w:rPr>
-        <w:t>𝐿(𝑤 , 𝑤 ) = 1.0[(𝑤 − 0.6)2 + (𝑤 − 0.4)2] + 0.5[(𝑤 − 0.5)2 + (𝑤 − 0.5)2] + 0.2(𝑤2 + 2 ⋅ 0.9 ⋅ 𝑤 𝑤 + 𝑤2). (A.9)</w:t>
+        <w:t>The Stage 2 held-out validation results stratified by trace difficulty tier show substantial heterogeneity: S_high yields Spearman = 0.287 (CI [0.108, 0.451]), while S_mid and S_rand include zero in their confidence intervals. The aggregate signal ( = 0.163, CI [0.092, 0.235]) is driven primarily by the high-divergence stratum, consistent with SC-FMA's operating mechanism. Full stratum results are provided in Supplementary Note~S6.</w:t>
+      </w:r>
+    </w:p>
+    <w:p>
+      <w:pPr>
+        <w:pStyle w:val="Heading2"/>
+      </w:pPr>
+      <w:r>
+        <w:t>Taxonomy-Stratified Ablation</w:t>
       </w:r>
     </w:p>
     <w:p>
       <w:r>
-        <w:rPr>
-          <w:rFonts w:ascii="Calibri" w:hAnsi="Calibri"/>
-        </w:rPr>
-        <w:t>1 2 1 2 1 2 1 1 2 2</w:t>
-      </w:r>
-    </w:p>
-    <w:p>
-      <w:r>
-        <w:rPr>
-          <w:rFonts w:ascii="Calibri" w:hAnsi="Calibri"/>
-        </w:rPr>
-        <w:t>Solving numerically yields 𝑤∗ ≈ 0.47, 𝑤∗ ≈ 0.53, i.e., 𝑤∗ &gt; 𝑤∗ despite 𝑐̃ &gt; 𝑐̃ . The redundancy penalty</w:t>
-      </w:r>
-    </w:p>
-    <w:p>
-      <w:r>
-        <w:rPr>
-          <w:rFonts w:ascii="Calibri" w:hAnsi="Calibri"/>
-        </w:rPr>
-        <w:t>1 2 2 1 1 2</w:t>
-      </w:r>
-    </w:p>
-    <w:p>
-      <w:r>
-        <w:rPr>
-          <w:rFonts w:ascii="Calibri" w:hAnsi="Calibri"/>
-        </w:rPr>
-        <w:t>equalizes the weights because steps 1 and 2 are highly similar (𝑅 = 0.9), and this equalization outweighs the fidelity</w:t>
-      </w:r>
-    </w:p>
-    <w:p>
-      <w:r>
-        <w:rPr>
-          <w:rFonts w:ascii="Calibri" w:hAnsi="Calibri"/>
-        </w:rPr>
-        <w:t>12</w:t>
-      </w:r>
-    </w:p>
-    <w:p>
-      <w:r>
-        <w:rPr>
-          <w:rFonts w:ascii="Calibri" w:hAnsi="Calibri"/>
-        </w:rPr>
-        <w:t>term. This is the designed behavior: structural calibration deliberately overrides local utility ordering when steps are substitutable, preventing the dilution of supervision across redundant operations.</w:t>
-      </w:r>
-    </w:p>
-    <w:p>
-      <w:r>
-        <w:rPr>
-          <w:rFonts w:ascii="Calibri" w:hAnsi="Calibri"/>
-        </w:rPr>
-        <w:t>Quantitative analysis across the full benchmark: among step pairs with 𝑅 &gt; 0.7, monotonicity violations occur</w:t>
-      </w:r>
-    </w:p>
-    <w:p>
-      <w:r>
-        <w:rPr>
-          <w:rFonts w:ascii="Calibri" w:hAnsi="Calibri"/>
-        </w:rPr>
-        <w:t>𝑖𝑗</w:t>
-      </w:r>
-    </w:p>
-    <w:p>
-      <w:r>
-        <w:rPr>
-          <w:rFonts w:ascii="Calibri" w:hAnsi="Calibri"/>
-        </w:rPr>
-        <w:t>in 31.2% of pairs, consistent with the deliberate equalization mechanism.</w:t>
+        <w:t>The ablation analysis stratified by reflective operation category reveals that structure alignment () provides the largest gain for ERROR_CORRECTION and VERIFICATION categories, while redundancy penalty () contributes most for BACKTRACKING and PLANNING categories. Full taxonomy-stratified ablation results are provided in Supplementary Note~S7.</w:t>
       </w:r>
     </w:p>
     <w:p>
@@ -694,26 +1021,7 @@
         <w:pStyle w:val="Heading1"/>
       </w:pPr>
       <w:r>
-        <w:rPr>
-          <w:rFonts w:ascii="Calibri" w:hAnsi="Calibri"/>
-        </w:rPr>
-        <w:t>B. Additional Experimental Results and Figures</w:t>
-      </w:r>
-    </w:p>
-    <w:p>
-      <w:r>
-        <w:rPr>
-          <w:rFonts w:ascii="Calibri" w:hAnsi="Calibri"/>
-        </w:rPr>
-        <w:t>This appendix provides extended experimental results, supplementary figures, and detailed stratum analysis that</w:t>
-      </w:r>
-    </w:p>
-    <w:p>
-      <w:r>
-        <w:rPr>
-          <w:rFonts w:ascii="Calibri" w:hAnsi="Calibri"/>
-        </w:rPr>
-        <w:t>support the main-text findings.</w:t>
+        <w:t>Implementation Details and Reproducibility</w:t>
       </w:r>
     </w:p>
     <w:p>
@@ -721,58 +1029,62 @@
         <w:pStyle w:val="Heading2"/>
       </w:pPr>
       <w:r>
-        <w:rPr>
-          <w:rFonts w:ascii="Calibri" w:hAnsi="Calibri"/>
-        </w:rPr>
-        <w:t>B.1. Full Ranking Metrics per Trace Size</w:t>
+        <w:t>Reproducibility Checklist</w:t>
       </w:r>
     </w:p>
     <w:p>
       <w:r>
-        <w:rPr>
-          <w:rFonts w:ascii="Calibri" w:hAnsi="Calibri"/>
-        </w:rPr>
-        <w:t>Table B.1 breaks down the controlled synthetic ranking metrics by trace size (𝑘 = 3 to 8) for the three SC-FMA variants and raw CIU. Within this controlled proxy-label benchmark, SC-FMA QP is strongest at all 𝑘, with the largest gains at 𝑘 ≥ 6 where redundancy effects are most pronounced.</w:t>
+        <w:t>The following checklist documents the measures taken to ensure full reproducibility of all experimental results reported in this paper.</w:t>
       </w:r>
     </w:p>
     <w:p>
       <w:r>
-        <w:rPr>
-          <w:rFonts w:ascii="Calibri" w:hAnsi="Calibri"/>
-        </w:rPr>
-        <w:t>The improvement Δ(QP − CIU) increases monotonically with 𝑘 (from +0.111 at 𝑘 = 3 to +0.148 at 𝑘 ≥ 7),</w:t>
+        <w:t>enumerate</w:t>
       </w:r>
     </w:p>
     <w:p>
       <w:r>
-        <w:rPr>
-          <w:rFonts w:ascii="Calibri" w:hAnsi="Calibri"/>
-        </w:rPr>
-        <w:t>(𝑘)</w:t>
+        <w:t>Environment. Python 3.11, dependencies specified in requirements.txt with pinned versions. All experiments run on an Intel Core i7-13700H CPU with 32\,GB RAM, single-threaded.</w:t>
       </w:r>
     </w:p>
     <w:p>
       <w:r>
-        <w:rPr>
-          <w:rFonts w:ascii="Calibri" w:hAnsi="Calibri"/>
-        </w:rPr>
-        <w:t>consistent with the structural calibration mechanism: larger traces contain more redundancy relationships ( grows</w:t>
+        <w:t>Random seeds. All experiments use deterministic seeds: seed = 42 for synthetic data generation and baseline random methods; seed = 123 for Shapley permutation sampling; seed = 456 for held-out split assignment. NumPy, PyTorch, and Python random states are all seeded.</w:t>
       </w:r>
     </w:p>
     <w:p>
       <w:r>
-        <w:rPr>
-          <w:rFonts w:ascii="Calibri" w:hAnsi="Calibri"/>
-        </w:rPr>
-        <w:t>2</w:t>
+        <w:t>Synthetic data. Traces are generated via the controlled probabilistic model described in the Synthetic Data Generation section of the main manuscript. The generation script (scripts/generate_synthetic_traces.py) is deterministic given the seed. Generated traces are archived as JSON artifacts.</w:t>
       </w:r>
     </w:p>
     <w:p>
       <w:r>
-        <w:rPr>
-          <w:rFonts w:ascii="Calibri" w:hAnsi="Calibri"/>
-        </w:rPr>
-        <w:t>quadratically), and the redundancy penalty term becomes increasingly informative.</w:t>
+        <w:t>Hyperparameter tuning. Grid search on the validation set (40 traces) with the ranges reported in the hyperparameter tuning table of the main manuscript. No test-set information is used during tuning. The optimal configuration is frozen before test-set evaluation.</w:t>
+      </w:r>
+    </w:p>
+    <w:p>
+      <w:r>
+        <w:t>Baseline methods. All baselines use publicly available implementations: Captum for GradientInput and Integrated Gradients; transformers library for attention extraction; custom NumPy implementation for MC Shapley with M = 500 permutations and convergence tolerance 10^-3.</w:t>
+      </w:r>
+    </w:p>
+    <w:p>
+      <w:r>
+        <w:t>SLSQP solver. SciPy's scipy.optimize.minimize with method SLSQP, tolerance ftol = 1e-8, maximum iterations = 100. Warm-start from Ridge solution.</w:t>
+      </w:r>
+    </w:p>
+    <w:p>
+      <w:r>
+        <w:t>Statistical tests. Wilcoxon signed-rank tests are two-sided unless noted; Holm-Bonferroni correction for multiple comparisons; bootstrap confidence intervals use 10,000 resamples with BCa correction. Effect sizes reported as r = Z/N.</w:t>
+      </w:r>
+    </w:p>
+    <w:p>
+      <w:r>
+        <w:t>Output artifacts. All raw results (CIU vectors, necessity scores, redundancy matrices, calibrated weights, ranking metrics) are saved as JSONL artifacts in the outputs/ directory. The complete set of artifacts accompanies the submission as supplementary material.</w:t>
+      </w:r>
+    </w:p>
+    <w:p>
+      <w:r>
+        <w:t>enumerate</w:t>
       </w:r>
     </w:p>
     <w:p>
@@ -780,18 +1092,12 @@
         <w:pStyle w:val="Heading2"/>
       </w:pPr>
       <w:r>
-        <w:rPr>
-          <w:rFonts w:ascii="Calibri" w:hAnsi="Calibri"/>
-        </w:rPr>
-        <w:t>B.2. Supplementary Diagnostic Figures</w:t>
+        <w:t>SLSQP Convergence Diagnostics</w:t>
       </w:r>
     </w:p>
     <w:p>
       <w:r>
-        <w:rPr>
-          <w:rFonts w:ascii="Calibri" w:hAnsi="Calibri"/>
-        </w:rPr>
-        <w:t>Figures B.1–B.3 provide the supplementary structural diagnostic figures referenced in the main text.</w:t>
+        <w:t>SLSQP convergence statistics across N = 1,027 steps (200 traces): mean iterations to convergence 5.3 2.1 (std), median 5, maximum 12. The worst-case trace (k=8, dense redundancy) required 12 iterations and 14.7\,ms. Warm-start from Ridge initialization reduces iterations by approximately 40% compared to uniform initialization. Under default hyperparameters (=1.0, =0.5, =0.2, =0.1, =10^-4), the Hessian condition number (H) 3.2, guaranteeing numerically stable optimization. Detailed convergence statistics by trace size and cold-start comparisons are provided in Supplementary Note~S4.</w:t>
       </w:r>
     </w:p>
     <w:p>
@@ -799,103 +1105,12 @@
         <w:pStyle w:val="Heading2"/>
       </w:pPr>
       <w:r>
-        <w:rPr>
-          <w:rFonts w:ascii="Calibri" w:hAnsi="Calibri"/>
-        </w:rPr>
-        <w:t>B.3. Stratum-Dependent Held-Out Analysis</w:t>
+        <w:t>Graph Construction Parameter Sensitivity</w:t>
       </w:r>
     </w:p>
     <w:p>
       <w:r>
-        <w:rPr>
-          <w:rFonts w:ascii="Calibri" w:hAnsi="Calibri"/>
-        </w:rPr>
-        <w:t>The Stage 2 held-out validation results stratified by trace difficulty tier show substantial heterogeneity: 𝑆 yields</w:t>
-      </w:r>
-    </w:p>
-    <w:p>
-      <w:r>
-        <w:rPr>
-          <w:rFonts w:ascii="Calibri" w:hAnsi="Calibri"/>
-        </w:rPr>
-        <w:t>high</w:t>
-      </w:r>
-    </w:p>
-    <w:p>
-      <w:r>
-        <w:rPr>
-          <w:rFonts w:ascii="Calibri" w:hAnsi="Calibri"/>
-        </w:rPr>
-        <w:t>Spearman 𝜌 = 0.287 (CI [0.108, 0.451]), while 𝑆 and 𝑆 include zero in their confidence intervals. The aggregate</w:t>
-      </w:r>
-    </w:p>
-    <w:p>
-      <w:r>
-        <w:rPr>
-          <w:rFonts w:ascii="Calibri" w:hAnsi="Calibri"/>
-        </w:rPr>
-        <w:t>mid rand</w:t>
-      </w:r>
-    </w:p>
-    <w:p>
-      <w:r>
-        <w:rPr>
-          <w:rFonts w:ascii="Calibri" w:hAnsi="Calibri"/>
-        </w:rPr>
-        <w:t>signal (𝜌 = 0.163, CI [0.092, 0.235]) is driven primarily by the high-divergence stratum, consistent with SC-FMA’s operating mechanism. Full stratum results are provided in Supplementary Note S6.</w:t>
-      </w:r>
-    </w:p>
-    <w:p>
-      <w:r>
-        <w:rPr>
-          <w:rFonts w:ascii="Calibri" w:hAnsi="Calibri"/>
-        </w:rPr>
-        <w:t>Ma and Wang: Preprint submitted to Elsevier Page 2</w:t>
-      </w:r>
-    </w:p>
-    <w:p>
-      <w:r>
-        <w:br w:type="page"/>
-      </w:r>
-    </w:p>
-    <w:p>
-      <w:r>
-        <w:rPr>
-          <w:rFonts w:ascii="Calibri" w:hAnsi="Calibri"/>
-        </w:rPr>
-        <w:t>Table B.1</w:t>
-      </w:r>
-    </w:p>
-    <w:p>
-      <w:r>
-        <w:rPr>
-          <w:rFonts w:ascii="Calibri" w:hAnsi="Calibri"/>
-        </w:rPr>
-        <w:t>Step importance ranking metrics stratified by trace size 𝑘. Mean Spearman 𝜌 over traces of each size. Standard errors in</w:t>
-      </w:r>
-    </w:p>
-    <w:p>
-      <w:r>
-        <w:rPr>
-          <w:rFonts w:ascii="Calibri" w:hAnsi="Calibri"/>
-        </w:rPr>
-        <w:t>parentheses (bootstrap, 10k resamples).</w:t>
-      </w:r>
-    </w:p>
-    <w:p>
-      <w:r>
-        <w:rPr>
-          <w:rFonts w:ascii="Calibri" w:hAnsi="Calibri"/>
-        </w:rPr>
-        <w:t>Method 𝑘 = 3 𝑘 = 4 𝑘 = 5 𝑘 = 6 𝑘 ≥ 7</w:t>
-      </w:r>
-    </w:p>
-    <w:p>
-      <w:r>
-        <w:rPr>
-          <w:rFonts w:ascii="Calibri" w:hAnsi="Calibri"/>
-        </w:rPr>
-        <w:t>SC-FMA QP 0.582 (0.041) 0.601 (0.038) 0.615 (0.035) 0.622 (0.033) 0.634 (0.029) SC-FMA Ridge 0.521 (0.044) 0.534 (0.040) 0.540 (0.037) 0.538 (0.035) 0.542 (0.032) SC-FMA Proj. 0.328 (0.048) 0.341 (0.044) 0.345 (0.041) 0.339 (0.039) 0.342 (0.036) Raw CIU 0.471 (0.045) 0.485 (0.041) 0.490 (0.038) 0.482 (0.036) 0.486 (0.033) Δ(QP − CIU) +0.111 +0.116 +0.125 +0.140 +0.148</w:t>
+        <w:t>The keyword-heuristic graph construction introduces two free parameters: _tfidf = 0.35 and w_topical = 0.75. Sensitivity analysis ( 20% perturbation) shows || &lt; 0.01 for all configurations, indicating that SC-FMA's calibration quality is robust to moderate misspecification of the graph parameters. Full sensitivity tables and per-trace-size breakdowns are provided in Supplementary Note~S5.</w:t>
       </w:r>
     </w:p>
     <w:p>
@@ -903,477 +1118,63 @@
         <w:pStyle w:val="Heading2"/>
       </w:pPr>
       <w:r>
-        <w:rPr>
-          <w:rFonts w:ascii="Calibri" w:hAnsi="Calibri"/>
-        </w:rPr>
-        <w:t>B.4. Taxonomy-Stratified Ablation</w:t>
+        <w:t>Controlled Proxy-Label Independence Analysis</w:t>
+      </w:r>
+    </w:p>
+    <w:p>
+      <w:r>
+        <w:t>We verify that the controlled proxy-label definition used in the synthetic benchmark does not share input features with the SCU objective. The correlation between each proxy-label component and each SCU input is:</w:t>
+      </w:r>
+    </w:p>
+    <w:p>
+      <w:r>
+        <w:t>table[ht]</w:t>
       </w:r>
     </w:p>
     <w:p>
       <w:r>
         <w:rPr>
-          <w:rFonts w:ascii="Calibri" w:hAnsi="Calibri"/>
+          <w:b/>
         </w:rPr>
-        <w:t>The ablation analysis stratified by reflective operation category reveals that structure alignment (𝛽) provides the largest gain for ERROR_CORRECTION and VERIFICATION categories, while redundancy penalty (𝛾) contributes most for BACKTRACKING and PLANNING categories. Full taxonomy-stratified ablation results are provided in</w:t>
+        <w:t xml:space="preserve">Caption: </w:t>
+      </w:r>
+      <w:r>
+        <w:t>Cross-correlation between controlled proxy-label components and SCU inputs across 1,027 steps. All correlations are below || &lt; 0.15, confirming low input overlap.</w:t>
       </w:r>
     </w:p>
     <w:p>
       <w:r>
-        <w:rPr>
-          <w:rFonts w:ascii="Calibri" w:hAnsi="Calibri"/>
-        </w:rPr>
-        <w:t>Supplementary Note S7.</w:t>
-      </w:r>
-    </w:p>
-    <w:p>
-      <w:pPr>
-        <w:pStyle w:val="Heading1"/>
-      </w:pPr>
-      <w:r>
-        <w:rPr>
-          <w:rFonts w:ascii="Calibri" w:hAnsi="Calibri"/>
-        </w:rPr>
-        <w:t>C. Implementation Details and Reproducibility</w:t>
-      </w:r>
-    </w:p>
-    <w:p>
-      <w:pPr>
-        <w:pStyle w:val="Heading2"/>
-      </w:pPr>
-      <w:r>
-        <w:rPr>
-          <w:rFonts w:ascii="Calibri" w:hAnsi="Calibri"/>
-        </w:rPr>
-        <w:t>C.1. Reproducibility Checklist</w:t>
+        <w:t xml:space="preserve"> |  c_i (CIU)  |  n_i (necessity)  |  r_i (redundancy)</w:t>
       </w:r>
     </w:p>
     <w:p>
       <w:r>
-        <w:rPr>
-          <w:rFonts w:ascii="Calibri" w:hAnsi="Calibri"/>
-        </w:rPr>
-        <w:t>The following checklist documents the measures taken to ensure full reproducibility of all experimental results</w:t>
+        <w:t>s_i (correctness)  |  0.08  |  -0.04  |  -0.07</w:t>
       </w:r>
     </w:p>
     <w:p>
       <w:r>
-        <w:rPr>
-          <w:rFonts w:ascii="Calibri" w:hAnsi="Calibri"/>
-        </w:rPr>
-        <w:t>reported in this paper.</w:t>
+        <w:t>d_i (lexical diversity)  |  -0.12  |  0.06  |  0.03</w:t>
       </w:r>
     </w:p>
     <w:p>
       <w:r>
-        <w:rPr>
-          <w:rFonts w:ascii="Calibri" w:hAnsi="Calibri"/>
-        </w:rPr>
-        <w:t>1. Environment. Python 3.11, dependencies specified in requirements.txt with pinned versions. All experi- ments run on an Intel Core i7-13700H CPU with 32 GB RAM, single-threaded.</w:t>
+        <w:t>p_i (position value)  |  0.11  |  -0.09  |  -0.02</w:t>
       </w:r>
     </w:p>
     <w:p>
       <w:r>
-        <w:rPr>
-          <w:rFonts w:ascii="Calibri" w:hAnsi="Calibri"/>
-        </w:rPr>
-        <w:t>2. Random seeds. All experiments use deterministic seeds: seed = 42 for synthetic data generation and baseline random methods; seed = 123 for Shapley permutation sampling; seed = 456 for held-out split assignment.</w:t>
+        <w:t>table</w:t>
       </w:r>
     </w:p>
     <w:p>
       <w:r>
-        <w:rPr>
-          <w:rFonts w:ascii="Calibri" w:hAnsi="Calibri"/>
-        </w:rPr>
-        <w:t>NumPy, PyTorch, and Python random states are all seeded.</w:t>
-      </w:r>
-    </w:p>
-    <w:p>
-      <w:r>
-        <w:rPr>
-          <w:rFonts w:ascii="Calibri" w:hAnsi="Calibri"/>
-        </w:rPr>
-        <w:t>3. Synthetic data. Traces are generated via the controlled probabilistic model described in the Synthetic Data Gen- eration section of the main manuscript. The generation script (scripts/generate_synthetic_traces.py) is deterministic given the seed. Generated traces are archived as JSON artifacts.</w:t>
-      </w:r>
-    </w:p>
-    <w:p>
-      <w:r>
-        <w:rPr>
-          <w:rFonts w:ascii="Calibri" w:hAnsi="Calibri"/>
-        </w:rPr>
-        <w:t>4. Hyperparameter tuning. Grid search on the validation set (40 traces) with the ranges reported in the hyperparameter tuning table of the main manuscript. No test-set information is used during tuning. The optimal configuration is frozen before test-set evaluation.</w:t>
-      </w:r>
-    </w:p>
-    <w:p>
-      <w:r>
-        <w:rPr>
-          <w:rFonts w:ascii="Calibri" w:hAnsi="Calibri"/>
-        </w:rPr>
-        <w:t>5. Baseline methods. All baselines use publicly available implementations: Captum for Gradient×Input and Integrated Gradients; transformers library for attention extraction; custom NumPy implementation for MC Shapley with 𝑀 = 500 permutations and convergence tolerance 10−3.</w:t>
-      </w:r>
-    </w:p>
-    <w:p>
-      <w:r>
-        <w:rPr>
-          <w:rFonts w:ascii="Calibri" w:hAnsi="Calibri"/>
-        </w:rPr>
-        <w:t>6. SLSQP solver. SciPy’s scipy.optimize.minimize with method SLSQP, tolerance ftol = 1e-8, maximum iterations = 100. Warm-start from Ridge solution.</w:t>
-      </w:r>
-    </w:p>
-    <w:p>
-      <w:r>
-        <w:rPr>
-          <w:rFonts w:ascii="Calibri" w:hAnsi="Calibri"/>
-        </w:rPr>
-        <w:t>7. Statistical tests. Wilcoxon signed-rank tests are two-sided unless noted; Holm–Bonferroni correction for multiple comparisons; bootstrap confidence intervals use 10,000 resamples with BCa correction. Effect sizes</w:t>
-      </w:r>
-    </w:p>
-    <w:p>
-      <w:r>
-        <w:rPr>
-          <w:rFonts w:ascii="Calibri" w:hAnsi="Calibri"/>
-        </w:rPr>
-        <w:t>√</w:t>
-      </w:r>
-    </w:p>
-    <w:p>
-      <w:r>
-        <w:rPr>
-          <w:rFonts w:ascii="Calibri" w:hAnsi="Calibri"/>
-        </w:rPr>
-        <w:t>reported as 𝑟 = 𝑍∕ 𝑁.</w:t>
-      </w:r>
-    </w:p>
-    <w:p>
-      <w:r>
-        <w:rPr>
-          <w:rFonts w:ascii="Calibri" w:hAnsi="Calibri"/>
-        </w:rPr>
-        <w:t>8. Output artifacts. All raw results (CIU vectors, necessity scores, redundancy matrices, calibrated weights, ranking metrics) are saved as JSONL artifacts in the outputs/ directory. The complete set of artifacts accompanies the submission as supplementary material.</w:t>
-      </w:r>
-    </w:p>
-    <w:p>
-      <w:pPr>
-        <w:pStyle w:val="Heading2"/>
-      </w:pPr>
-      <w:r>
-        <w:rPr>
-          <w:rFonts w:ascii="Calibri" w:hAnsi="Calibri"/>
-        </w:rPr>
-        <w:t>C.2. SLSQP Convergence Diagnostics</w:t>
-      </w:r>
-    </w:p>
-    <w:p>
-      <w:r>
-        <w:rPr>
-          <w:rFonts w:ascii="Calibri" w:hAnsi="Calibri"/>
-        </w:rPr>
-        <w:t>SLSQP convergence statistics across 𝑁 = 1,027 steps (200 traces): mean iterations to convergence 5.3 ± 2.1 (std), median 5, maximum 12. The worst-case trace (𝑘 = 8, dense redundancy) required 12 iterations and 14.7 ms. Warm-start from Ridge initialization reduces iterations by approximately 40% compared to uniform initialization. Under default hyperparameters (𝛼 = 1.0, 𝛽 = 0.5, 𝛾 = 0.2, 𝛿 = 0.1, 𝜀 = 10−4), the Hessian condition number 𝜅(𝐇) ≤ 3.2, guaranteeing numerically stable optimization. Detailed convergence statistics by trace size and cold-start comparisons</w:t>
-      </w:r>
-    </w:p>
-    <w:p>
-      <w:r>
-        <w:rPr>
-          <w:rFonts w:ascii="Calibri" w:hAnsi="Calibri"/>
-        </w:rPr>
-        <w:t>are provided in Supplementary Note S4.</w:t>
-      </w:r>
-    </w:p>
-    <w:p>
-      <w:r>
-        <w:rPr>
-          <w:rFonts w:ascii="Calibri" w:hAnsi="Calibri"/>
-        </w:rPr>
-        <w:t>Ma and Wang: Preprint submitted to Elsevier Page 3</w:t>
-      </w:r>
-    </w:p>
-    <w:p>
-      <w:r>
-        <w:br w:type="page"/>
-      </w:r>
-    </w:p>
-    <w:p>
-      <w:r>
-        <w:rPr>
-          <w:rFonts w:ascii="Calibri" w:hAnsi="Calibri"/>
-        </w:rPr>
-        <w:t>Table C.2</w:t>
-      </w:r>
-    </w:p>
-    <w:p>
-      <w:r>
-        <w:rPr>
-          <w:rFonts w:ascii="Calibri" w:hAnsi="Calibri"/>
-        </w:rPr>
-        <w:t>Cross-correlation between controlled proxy-label components and SCU inputs across 1,027 steps. All correlations are below</w:t>
-      </w:r>
-    </w:p>
-    <w:p>
-      <w:r>
-        <w:rPr>
-          <w:rFonts w:ascii="Calibri" w:hAnsi="Calibri"/>
-        </w:rPr>
-        <w:t>|𝜌| &lt; 0.15, confirming low input overlap.</w:t>
-      </w:r>
-    </w:p>
-    <w:p>
-      <w:r>
-        <w:rPr>
-          <w:rFonts w:ascii="Calibri" w:hAnsi="Calibri"/>
-        </w:rPr>
-        <w:t>𝑐̃ (CIU) 𝑛̃ (necessity) 𝑟̄ (redundancy)</w:t>
-      </w:r>
-    </w:p>
-    <w:p>
-      <w:r>
-        <w:rPr>
-          <w:rFonts w:ascii="Calibri" w:hAnsi="Calibri"/>
-        </w:rPr>
-        <w:t>𝑖 𝑖 𝑖</w:t>
-      </w:r>
-    </w:p>
-    <w:p>
-      <w:r>
-        <w:rPr>
-          <w:rFonts w:ascii="Calibri" w:hAnsi="Calibri"/>
-        </w:rPr>
-        <w:t>𝑠 (correctness) 0.08 −0.04 −0.07</w:t>
-      </w:r>
-    </w:p>
-    <w:p>
-      <w:r>
-        <w:rPr>
-          <w:rFonts w:ascii="Calibri" w:hAnsi="Calibri"/>
-        </w:rPr>
-        <w:t>𝑖</w:t>
-      </w:r>
-    </w:p>
-    <w:p>
-      <w:r>
-        <w:rPr>
-          <w:rFonts w:ascii="Calibri" w:hAnsi="Calibri"/>
-        </w:rPr>
-        <w:t>𝑑 (lexical diversity) −0.12 0.06 0.03</w:t>
-      </w:r>
-    </w:p>
-    <w:p>
-      <w:r>
-        <w:rPr>
-          <w:rFonts w:ascii="Calibri" w:hAnsi="Calibri"/>
-        </w:rPr>
-        <w:t>𝑖</w:t>
-      </w:r>
-    </w:p>
-    <w:p>
-      <w:r>
-        <w:rPr>
-          <w:rFonts w:ascii="Calibri" w:hAnsi="Calibri"/>
-        </w:rPr>
-        <w:t>𝑝 (position value) 0.11 −0.09 −0.02</w:t>
-      </w:r>
-    </w:p>
-    <w:p>
-      <w:r>
-        <w:rPr>
-          <w:rFonts w:ascii="Calibri" w:hAnsi="Calibri"/>
-        </w:rPr>
-        <w:t>𝑖</w:t>
-      </w:r>
-    </w:p>
-    <w:p>
-      <w:pPr>
-        <w:pStyle w:val="Heading2"/>
-      </w:pPr>
-      <w:r>
-        <w:rPr>
-          <w:rFonts w:ascii="Calibri" w:hAnsi="Calibri"/>
-        </w:rPr>
-        <w:t>C.3. Graph Construction Parameter Sensitivity</w:t>
-      </w:r>
-    </w:p>
-    <w:p>
-      <w:r>
-        <w:rPr>
-          <w:rFonts w:ascii="Calibri" w:hAnsi="Calibri"/>
-        </w:rPr>
-        <w:t>The keyword-heuristic graph construction introduces two free parameters: 𝜏 = 0.35 and 𝑤 = 0.75.</w:t>
-      </w:r>
-    </w:p>
-    <w:p>
-      <w:r>
-        <w:rPr>
-          <w:rFonts w:ascii="Calibri" w:hAnsi="Calibri"/>
-        </w:rPr>
-        <w:t>tfidf topical</w:t>
-      </w:r>
-    </w:p>
-    <w:p>
-      <w:r>
-        <w:rPr>
-          <w:rFonts w:ascii="Calibri" w:hAnsi="Calibri"/>
-        </w:rPr>
-        <w:t>Sensitivity analysis (±20% perturbation) shows |Δ𝜌 | &lt; 0.01 for all configurations, indicating that SC-FMA’s calibration quality is robust to moderate misspecification of the graph parameters. Full sensitivity tables and per-trace- size breakdowns are provided in Supplementary Note S5.</w:t>
-      </w:r>
-    </w:p>
-    <w:p>
-      <w:pPr>
-        <w:pStyle w:val="Heading2"/>
-      </w:pPr>
-      <w:r>
-        <w:rPr>
-          <w:rFonts w:ascii="Calibri" w:hAnsi="Calibri"/>
-        </w:rPr>
-        <w:t>C.4. Controlled Proxy-Label Independence Analysis</w:t>
-      </w:r>
-    </w:p>
-    <w:p>
-      <w:r>
-        <w:rPr>
-          <w:rFonts w:ascii="Calibri" w:hAnsi="Calibri"/>
-        </w:rPr>
-        <w:t>We verify that the controlled proxy-label definition used in the synthetic benchmark does not share input features with the SCU objective. The correlation between each proxy-label component and each SCU input is:</w:t>
-      </w:r>
-    </w:p>
-    <w:p>
-      <w:r>
-        <w:rPr>
-          <w:rFonts w:ascii="Calibri" w:hAnsi="Calibri"/>
-        </w:rPr>
-        <w:t>All cross-correlations are below | 𝜌 | &lt; 0.15, confirming low overlap between the controlled proxy-label components and the SCU inputs. The previous isomorphic definition (𝑦 = 0.4𝑐̃ + 0.4𝑛̃ + 0.2(1 − 𝑟̄ )) achieved Pearson correlations</w:t>
-      </w:r>
-    </w:p>
-    <w:p>
-      <w:r>
-        <w:rPr>
-          <w:rFonts w:ascii="Calibri" w:hAnsi="Calibri"/>
-        </w:rPr>
-        <w:t>𝑖 𝑖 𝑖 𝑖</w:t>
-      </w:r>
-    </w:p>
-    <w:p>
-      <w:r>
-        <w:rPr>
-          <w:rFonts w:ascii="Calibri" w:hAnsi="Calibri"/>
-        </w:rPr>
-        <w:t>of 0.63 with 𝑐̃ and 0.53 with 𝑛̃ —indicating substantial overlap that the revised proxy-label definition eliminates.</w:t>
-      </w:r>
-    </w:p>
-    <w:p>
-      <w:r>
-        <w:rPr>
-          <w:rFonts w:ascii="Calibri" w:hAnsi="Calibri"/>
-        </w:rPr>
-        <w:t>𝑖 𝑖</w:t>
-      </w:r>
-    </w:p>
-    <w:p>
-      <w:r>
-        <w:rPr>
-          <w:rFonts w:ascii="Calibri" w:hAnsi="Calibri"/>
-        </w:rPr>
-        <w:t>References</w:t>
-      </w:r>
-    </w:p>
-    <w:p>
-      <w:r>
-        <w:rPr>
-          <w:rFonts w:ascii="Calibri" w:hAnsi="Calibri"/>
-        </w:rPr>
-        <w:t>[1] Wang, W., Carreira-Perpiñán, M.Á., 2013. Projection onto the probability simplex: An 𝓁 -ball approach. arXiv preprint arXiv:1309.1541 URL:</w:t>
-      </w:r>
-    </w:p>
-    <w:p>
-      <w:r>
-        <w:rPr>
-          <w:rFonts w:ascii="Calibri" w:hAnsi="Calibri"/>
-        </w:rPr>
-        <w:t>1</w:t>
-      </w:r>
-    </w:p>
-    <w:p>
-      <w:r>
-        <w:rPr>
-          <w:rFonts w:ascii="Calibri" w:hAnsi="Calibri"/>
-        </w:rPr>
-        <w:t>https://arxiv.org/abs/1309.1541.</w:t>
-      </w:r>
-    </w:p>
-    <w:p>
-      <w:r>
-        <w:rPr>
-          <w:rFonts w:ascii="Calibri" w:hAnsi="Calibri"/>
-        </w:rPr>
-        <w:t>Ma and Wang: Preprint submitted to Elsevier Page 4</w:t>
-      </w:r>
-    </w:p>
-    <w:p>
-      <w:r>
-        <w:br w:type="page"/>
-      </w:r>
-    </w:p>
-    <w:p>
-      <w:r>
-        <w:rPr>
-          <w:rFonts w:ascii="Calibri" w:hAnsi="Calibri"/>
-        </w:rPr>
-        <w:t>Figure B.1: Structural diagnostic summary by perturbation mode. The three perturbation modes (PRUNE, CASCADE, BYPASS) are compared on Pearson correlation, Spearman rank correlation, and zero-necessity fraction. Error bars indicate 95% bootstrap confidence intervals. The consistency across modes confirms that weak CIU-necessity alignment is not an</w:t>
-      </w:r>
-    </w:p>
-    <w:p>
-      <w:r>
-        <w:rPr>
-          <w:rFonts w:ascii="Calibri" w:hAnsi="Calibri"/>
-        </w:rPr>
-        <w:t>artifact of a single perturbation strategy.</w:t>
-      </w:r>
-    </w:p>
-    <w:p>
-      <w:r>
-        <w:rPr>
-          <w:rFonts w:ascii="Calibri" w:hAnsi="Calibri"/>
-        </w:rPr>
-        <w:t>Figure B.2: Redundancy density and compensation analysis. Panel (a): per-trace redundancy density distribution (mean 0.3842). Panel (b): per-node compensation ratio distribution under PRUNE mode (median 0.000, mean 0.0084). The concentration of compensation at zero confirms that reflective reasoning traces exhibit limited structural redistribution:</w:t>
-      </w:r>
-    </w:p>
-    <w:p>
-      <w:r>
-        <w:rPr>
-          <w:rFonts w:ascii="Calibri" w:hAnsi="Calibri"/>
-        </w:rPr>
-        <w:t>removing a node rarely increases the necessity of its downstream neighbors.</w:t>
-      </w:r>
-    </w:p>
-    <w:p>
-      <w:r>
-        <w:rPr>
-          <w:rFonts w:ascii="Calibri" w:hAnsi="Calibri"/>
-        </w:rPr>
-        <w:t>Ma and Wang: Preprint submitted to Elsevier Page 5</w:t>
-      </w:r>
-    </w:p>
-    <w:p>
-      <w:r>
-        <w:br w:type="page"/>
-      </w:r>
-    </w:p>
-    <w:p>
-      <w:r>
-        <w:rPr>
-          <w:rFonts w:ascii="Calibri" w:hAnsi="Calibri"/>
-        </w:rPr>
-        <w:t>Figure B.3: Resilience curves under ordered node removal. Four removal orders are compared: necessity-first, attribution- first, sequential (original trace order), and deterministic random (hash-based). The 𝑦-axis shows remaining structural necessity fraction; the 𝑥-axis is the fraction of nodes removed. AUC values are annotated. The necessity-first curve degrades sharply (AUC 0.1488), while attribution-first (AUC 0.4761) is close to random (AUC 0.5098), demonstrating that local CIU is not a sufficient proxy for structural criticality.</w:t>
-      </w:r>
-    </w:p>
-    <w:p>
-      <w:r>
-        <w:rPr>
-          <w:rFonts w:ascii="Calibri" w:hAnsi="Calibri"/>
-        </w:rPr>
-        <w:t>Ma and Wang: Preprint submitted to Elsevier Page 6</w:t>
+        <w:t>All cross-correlations are below || &lt; 0.15, confirming low overlap between the controlled proxy-label components and the SCU inputs. The previous isomorphic definition (y_i = 0.4c_i + 0.4n_i + 0.2(1-r_i)) achieved Pearson correlations of 0.63 with c_i and 0.53 with n_i--indicating substantial overlap that the revised proxy-label definition eliminates.</w:t>
       </w:r>
     </w:p>
     <w:sectPr>
       <w:pgSz w:w="12240" w:h="15840"/>
-      <w:pgMar w:top="1440" w:right="1440" w:bottom="1440" w:left="1440" w:header="708" w:footer="708" w:gutter="0"/>
+      <w:pgMar w:top="1152" w:right="1152" w:bottom="1152" w:left="1152" w:header="720" w:footer="720" w:gutter="0"/>
       <w:cols w:space="720"/>
       <w:docGrid w:linePitch="360"/>
     </w:sectPr>
@@ -1744,12 +1545,9 @@
     <w:name w:val="Normal"/>
     <w:qFormat/>
     <w:rsid w:val="00FC693F"/>
-    <w:pPr>
-      <w:spacing w:before="0" w:after="120" w:line="264" w:lineRule="auto"/>
-    </w:pPr>
     <w:rPr>
-      <w:rFonts w:ascii="Calibri" w:hAnsi="Calibri"/>
-      <w:sz w:val="22"/>
+      <w:rFonts w:ascii="Arial" w:hAnsi="Arial"/>
+      <w:sz w:val="20"/>
     </w:rPr>
   </w:style>
   <w:style w:type="paragraph" w:styleId="Header">
@@ -1807,15 +1605,15 @@
     <w:pPr>
       <w:keepNext/>
       <w:keepLines/>
-      <w:spacing w:before="320" w:after="160"/>
+      <w:spacing w:before="480" w:after="0"/>
       <w:outlineLvl w:val="0"/>
     </w:pPr>
     <w:rPr>
-      <w:rFonts w:asciiTheme="majorHAnsi" w:eastAsiaTheme="majorEastAsia" w:hAnsiTheme="majorHAnsi" w:cstheme="majorBidi" w:ascii="Calibri" w:hAnsi="Calibri"/>
+      <w:rFonts w:asciiTheme="majorHAnsi" w:eastAsiaTheme="majorEastAsia" w:hAnsiTheme="majorHAnsi" w:cstheme="majorBidi" w:ascii="Arial" w:hAnsi="Arial"/>
       <w:b/>
       <w:bCs/>
-      <w:color w:val="2E74B5"/>
-      <w:sz w:val="32"/>
+      <w:color w:val="365F91" w:themeColor="accent1" w:themeShade="BF"/>
+      <w:sz w:val="28"/>
       <w:szCs w:val="28"/>
     </w:rPr>
   </w:style>
@@ -1831,14 +1629,14 @@
     <w:pPr>
       <w:keepNext/>
       <w:keepLines/>
-      <w:spacing w:before="240" w:after="120"/>
+      <w:spacing w:before="200" w:after="0"/>
       <w:outlineLvl w:val="1"/>
     </w:pPr>
     <w:rPr>
-      <w:rFonts w:asciiTheme="majorHAnsi" w:eastAsiaTheme="majorEastAsia" w:hAnsiTheme="majorHAnsi" w:cstheme="majorBidi" w:ascii="Calibri" w:hAnsi="Calibri"/>
+      <w:rFonts w:asciiTheme="majorHAnsi" w:eastAsiaTheme="majorEastAsia" w:hAnsiTheme="majorHAnsi" w:cstheme="majorBidi" w:ascii="Arial" w:hAnsi="Arial"/>
       <w:b/>
       <w:bCs/>
-      <w:color w:val="2E74B5"/>
+      <w:color w:val="4F81BD" w:themeColor="accent1"/>
       <w:sz w:val="26"/>
       <w:szCs w:val="26"/>
     </w:rPr>
@@ -1855,15 +1653,14 @@
     <w:pPr>
       <w:keepNext/>
       <w:keepLines/>
-      <w:spacing w:before="160" w:after="80"/>
+      <w:spacing w:before="200" w:after="0"/>
       <w:outlineLvl w:val="2"/>
     </w:pPr>
     <w:rPr>
-      <w:rFonts w:asciiTheme="majorHAnsi" w:eastAsiaTheme="majorEastAsia" w:hAnsiTheme="majorHAnsi" w:cstheme="majorBidi" w:ascii="Calibri" w:hAnsi="Calibri"/>
+      <w:rFonts w:asciiTheme="majorHAnsi" w:eastAsiaTheme="majorEastAsia" w:hAnsiTheme="majorHAnsi" w:cstheme="majorBidi" w:ascii="Arial" w:hAnsi="Arial"/>
       <w:b/>
       <w:bCs/>
-      <w:color w:val="1F4D78"/>
-      <w:sz w:val="24"/>
+      <w:color w:val="4F81BD" w:themeColor="accent1"/>
     </w:rPr>
   </w:style>
   <w:style w:type="paragraph" w:styleId="Heading4">

</xml_diff>

<commit_message>
Update manuscript with multi-seed results and audit notes
</commit_message>
<xml_diff>
--- a/paper/kbs_submission/final_package/supplementary.docx
+++ b/paper/kbs_submission/final_package/supplementary.docx
@@ -593,70 +593,44 @@
     </w:p>
     <w:p>
       <w:r>
-        <w:rPr>
-          <w:b/>
-        </w:rPr>
-        <w:t xml:space="preserve">Caption: </w:t>
-      </w:r>
-      <w:r>
-        <w:t>Extended ablation results moved from the main manuscript. is relative to full SC-FMA QP.</w:t>
+        <w:t>Caption: Extended ablation results from outputs/m3_ablation_study.json. All variants reuse the canonical downstream synthetic generator (seed 42, 200 traces, 1,027 steps). Delta rho is relative to full SC-FMA QP.</w:t>
       </w:r>
     </w:p>
     <w:p>
       <w:r>
-        <w:t xml:space="preserve">Variant  |  Spearman  | </w:t>
+        <w:t>Variant  |  Spearman rho  |  Kendall tau  |  Delta rho</w:t>
       </w:r>
     </w:p>
     <w:p>
       <w:r>
-        <w:t>SC-FMA QP (full)  |  0.608  |  --</w:t>
+        <w:t>SC-FMA QP (full)  |  0.522  |  0.437  |  --</w:t>
       </w:r>
     </w:p>
     <w:p>
       <w:r>
-        <w:t>- Structure  |  0.551  |  -0.057</w:t>
+        <w:t>- Fidelity  |  0.337  |  0.274  |  -0.186</w:t>
       </w:r>
     </w:p>
     <w:p>
       <w:r>
-        <w:t>- Fidelity  |  0.536  |  -0.072</w:t>
+        <w:t>- Structure  |  0.489  |  0.423  |  -0.034</w:t>
       </w:r>
     </w:p>
     <w:p>
       <w:r>
-        <w:t>- Redundancy  |  0.586  |  -0.022</w:t>
+        <w:t>- Bottleneck  |  0.521  |  0.436  |  -0.001</w:t>
       </w:r>
     </w:p>
     <w:p>
       <w:r>
-        <w:t>- Bottleneck  |  0.595  |  -0.013</w:t>
+        <w:t>- Redundancy  |  0.523  |  0.436  |  +0.001</w:t>
       </w:r>
     </w:p>
-    <w:p>
+    <CT_P>
       <w:r>
-        <w:t>Structure only  |  0.438  |  -0.170</w:t>
+        <w:t>The canonical-seed ablation shows that fidelity is the dominant term, structure alignment is second, and the bottleneck and redundancy terms have small route-specific effects. The slight improvement after removing redundancy is not used as positive evidence against the redundancy term; it indicates that the redundancy penalty should be interpreted as a regularizer.</w:t>
       </w:r>
-    </w:p>
-    <w:p>
-      <w:r>
-        <w:t>Fidelity only (Raw CIU)  |  0.483  |  -0.125</w:t>
-      </w:r>
-    </w:p>
-    <w:p>
-      <w:r>
-        <w:t>Fidelity + Structure  |  0.573  |  -0.035</w:t>
-      </w:r>
-    </w:p>
-    <w:p>
-      <w:r>
-        <w:t>Fidelity + Redundancy  |  0.518  |  -0.090</w:t>
-      </w:r>
-    </w:p>
-    <w:p>
-      <w:r>
-        <w:t>Fidelity + Bottleneck  |  0.504  |  -0.104</w:t>
-      </w:r>
-    </w:p>
+    </CT_P>
     <w:p>
       <w:r>
         <w:t>table</w:t>
@@ -677,58 +651,47 @@
     </w:p>
     <w:p>
       <w:r>
-        <w:rPr>
-          <w:b/>
-        </w:rPr>
-        <w:t xml:space="preserve">Caption: </w:t>
-      </w:r>
-      <w:r>
-        <w:t>Computational efficiency moved from the main manuscript. Times are per-trace mean over the synthetic test set.</w:t>
+        <w:t>Caption: Computational efficiency from outputs/s1_efficiency_benchmark.json. Times are measured on the canonical synthetic test set (seed 42, 200 traces, 1,027 steps, three repeats). Only methods measured by the current S1 runner are reported.</w:t>
       </w:r>
     </w:p>
     <w:p>
       <w:r>
-        <w:t>Method  |  Wall-clock (ms)  |  Scaling exponent p</w:t>
+        <w:t>Method  |  Total time (s)  |  ms/trace  |  ms/step</w:t>
       </w:r>
     </w:p>
     <w:p>
       <w:r>
-        <w:t>SC-FMA QP  |  6.8 2.9  |  2.81</w:t>
+        <w:t>SC-FMA QP  |  1.139  |  5.697  |  1.109</w:t>
       </w:r>
     </w:p>
     <w:p>
       <w:r>
-        <w:t>SC-FMA Ridge  |  0.4 0.1  |  0.97</w:t>
+        <w:t>SC-FMA Ridge  |  0.022  |  0.108  |  0.021</w:t>
       </w:r>
     </w:p>
     <w:p>
       <w:r>
-        <w:t>SC-FMA Projection  |  0.2 0.05  |  0.98</w:t>
+        <w:t>SC-FMA Projection  |  0.013  |  0.065  |  0.013</w:t>
       </w:r>
     </w:p>
     <w:p>
       <w:r>
-        <w:t>Raw CIU  |  0.8 0.2  |  0.95</w:t>
+        <w:t>Raw CIU  |  0.006  |  0.030  |  0.006</w:t>
       </w:r>
     </w:p>
     <w:p>
       <w:r>
-        <w:t>MC Shapley (500 permutations)  |  3,420 890  |  1.03</w:t>
+        <w:t>Random  |  0.014  |  0.068  |  0.013</w:t>
       </w:r>
     </w:p>
     <w:p>
       <w:r>
-        <w:t>GradientInput  |  12.4 3.1  |  1.12</w:t>
+        <w:t>Span length  |  0.005  |  0.023  |  0.004</w:t>
       </w:r>
     </w:p>
     <w:p>
       <w:r>
-        <w:t>Attention Rollout  |  8.1 1.7  |  1.15</w:t>
-      </w:r>
-    </w:p>
-    <w:p>
-      <w:r>
-        <w:t>Token Surprisal  |  45.2 8.3  |  1.08</w:t>
+        <w:t>Relative position  |  0.003  |  0.016  |  0.003</w:t>
       </w:r>
     </w:p>
     <w:p>
@@ -1049,14 +1012,24 @@
     </w:p>
     <w:p>
       <w:r>
-        <w:t>Random seeds. All experiments use deterministic seeds: seed = 42 for synthetic data generation and baseline random methods; seed = 123 for Shapley permutation sampling; seed = 456 for held-out split assignment. NumPy, PyTorch, and Python random states are all seeded.</w:t>
+        <w:t>Random seeds. The synthetic ranking route uses five fixed seeds (42, 123, 456, 789, and 1024) for multi-seed reporting. Seed 42 is retained for representative-seed ablations, efficiency timing, and baseline random methods; seed 123 is used for Shapley permutation sampling; seed 456 is used for held-out split assignment.</w:t>
       </w:r>
     </w:p>
     <w:p>
       <w:r>
-        <w:t>Synthetic data. Traces are generated via the controlled probabilistic model described in the Synthetic Data Generation section of the main manuscript. The generation script (scripts/generate_synthetic_traces.py) is deterministic given the seed. Generated traces are archived as JSON artifacts.</w:t>
+        <w:t>Synthetic data. Traces are generated via the canonical downstream ranking generator reused by the M1, M3, and S1 scripts. Generated traces and summaries are archived as JSON artifacts, including the seed-42 parity count of 200 traces and 1,027 steps.</w:t>
       </w:r>
     </w:p>
+    <w:p>
+      <w:r>
+        <w:t>KBS-style audit data. The offline HotpotQA supporting-fact audit route constructs deterministic retrieval, entity-binding, evidence-check, answer-synthesis, and distractor-rejection steps with a 30/70 hash split. It is archived as a failure-audit artifact because the locked split does not meet the predefined support threshold; it is not a validated KBS deployment workflow.</w:t>
+      </w:r>
+    </w:p>
+    <CT_P>
+      <w:r>
+        <w:t>KBS-style audit data. The offline HotpotQA supporting-fact audit route constructs deterministic retrieval, entity-binding, evidence-check, answer-synthesis, and distractor-rejection steps with a 30/70 hash split. It is archived as a failure-audit artifact because the locked split does not meet the predefined support threshold; it is not a validated KBS deployment workflow.</w:t>
+      </w:r>
+    </CT_P>
     <w:p>
       <w:r>
         <w:t>Hyperparameter tuning. Grid search on the validation set (40 traces) with the ranges reported in the hyperparameter tuning table of the main manuscript. No test-set information is used during tuning. The optimal configuration is frozen before test-set evaluation.</w:t>

</xml_diff>

<commit_message>
Add MuSiQue audit-prioritization evidence to SC-FMA paper
</commit_message>
<xml_diff>
--- a/paper/kbs_submission/final_package/supplementary.docx
+++ b/paper/kbs_submission/final_package/supplementary.docx
@@ -4,43 +4,210 @@
   <w:body>
     <w:p>
       <w:pPr>
-        <w:jc w:val="center"/>
+        <w:pStyle w:val="Title"/>
       </w:pPr>
       <w:r>
-        <w:rPr>
-          <w:b/>
-          <w:sz w:val="36"/>
-        </w:rPr>
         <w:t>Supplementary Material</w:t>
       </w:r>
     </w:p>
     <w:p>
-      <w:pPr>
-        <w:jc w:val="center"/>
-      </w:pPr>
       <w:r>
         <w:t>Structurally-Calibrated Functional Attribution for Audit Prioritization in Knowledge-Intensive Reasoning</w:t>
       </w:r>
     </w:p>
     <w:p>
-      <w:pPr>
-        <w:jc w:val="center"/>
-      </w:pPr>
+      <w:r>
+        <w:t>Haoran Ma; Ningning Wang</w:t>
+      </w:r>
+    </w:p>
+    <w:p>
+      <w:r>
+        <w:t>cas-sc</w:t>
+      </w:r>
+    </w:p>
+    <w:p>
+      <w:r>
+        <w:t>natbib</w:t>
+      </w:r>
+    </w:p>
+    <w:p>
+      <w:r>
+        <w:t>amsmath</w:t>
+      </w:r>
+    </w:p>
+    <w:p>
+      <w:r>
+        <w:t>booktabs</w:t>
+      </w:r>
+    </w:p>
+    <w:p>
+      <w:r>
+        <w:t>array</w:t>
+      </w:r>
+    </w:p>
+    <w:p>
+      <w:r>
+        <w:t>graphicx</w:t>
+      </w:r>
+    </w:p>
+    <w:p>
+      <w:r>
+        <w:t>xurl</w:t>
+      </w:r>
+    </w:p>
+    <w:p>
+      <w:r>
+        <w:t>amsthm</w:t>
+      </w:r>
+    </w:p>
+    <w:p>
+      <w:r>
+        <w:t>theoremTheorem[section]</w:t>
+      </w:r>
+    </w:p>
+    <w:p>
+      <w:r>
+        <w:t>lemma[theorem]Lemma</w:t>
+      </w:r>
+    </w:p>
+    <w:p>
+      <w:r>
+        <w:t>corollary[theorem]Corollary</w:t>
+      </w:r>
+    </w:p>
+    <w:p>
+      <w:r>
+        <w:t>algorithm</w:t>
+      </w:r>
+    </w:p>
+    <w:p>
+      <w:r>
+        <w:t>algpseudocode</w:t>
+      </w:r>
+    </w:p>
+    <w:p>
+      <w:r>
+        <w:t>multirow</w:t>
+      </w:r>
+    </w:p>
+    <w:p>
+      <w:r>
+        <w:t>makecell</w:t>
+      </w:r>
+    </w:p>
+    <w:p>
+      <w:r>
+        <w:t>hyperref</w:t>
+      </w:r>
+    </w:p>
+    <w:p>
+      <w:r>
+        <w:t>colorlinks=true,linkcolor=blue,citecolor=blue,urlcolor=blue</w:t>
+      </w:r>
+    </w:p>
+    <w:p>
+      <w:r>
+        <w:t>1</w:t>
+      </w:r>
+    </w:p>
+    <w:p>
+      <w:r>
+        <w:t>.001</w:t>
+      </w:r>
+    </w:p>
+    <w:p>
+      <w:r>
+        <w:t>arabic</w:t>
+      </w:r>
+    </w:p>
+    <w:p>
+      <w:r>
+        <w:t>Supplementary Material</w:t>
+      </w:r>
+    </w:p>
+    <w:p>
+      <w:r>
+        <w:t>Ma and Wang</w:t>
+      </w:r>
+    </w:p>
+    <w:p>
+      <w:r>
+        <w:t>Supplementary Material for Structurally-Calibrated Functional Attribution for Audit Prioritization in Knowledge-Intensive Reasoning</w:t>
+      </w:r>
+    </w:p>
+    <w:p>
       <w:r>
         <w:t>Haoran Ma</w:t>
       </w:r>
     </w:p>
     <w:p>
-      <w:pPr>
-        <w:jc w:val="center"/>
-      </w:pPr>
       <w:r>
-        <w:t>Ningning Wang</w:t>
+        <w:t>mahaoran0000@foamail.com</w:t>
       </w:r>
     </w:p>
     <w:p>
       <w:r>
-        <w:t>Generated from final_source/supplementary.tex after moving detailed proofs, algorithms, extended tables, PRM800K variant details, audit-prioritization details, and KBS integration notes out of the compressed manuscript.</w:t>
+        <w:t>Ningning Wangcor1</w:t>
+      </w:r>
+    </w:p>
+    <w:p>
+      <w:r>
+        <w:t>wangningning@bistu.edu.cn</w:t>
+      </w:r>
+    </w:p>
+    <w:p>
+      <w:r>
+        <w:t>Corresponding author.</w:t>
+      </w:r>
+    </w:p>
+    <w:p>
+      <w:r>
+        <w:t>organization=College of Management Science and Engineering, Beijing Information Science and Technology University,</w:t>
+      </w:r>
+    </w:p>
+    <w:p>
+      <w:r>
+        <w:t>city=Beijing,</w:t>
+      </w:r>
+    </w:p>
+    <w:p>
+      <w:r>
+        <w:t>postcode=102200,</w:t>
+      </w:r>
+    </w:p>
+    <w:p>
+      <w:r>
+        <w:t>country=China</w:t>
+      </w:r>
+    </w:p>
+    <w:p>
+      <w:r>
+        <w:t>organization=Institute of Information Systems, ESG Intelligent Application Innovation Research Center,</w:t>
+      </w:r>
+    </w:p>
+    <w:p>
+      <w:r>
+        <w:t>city=Beijing,</w:t>
+      </w:r>
+    </w:p>
+    <w:p>
+      <w:r>
+        <w:t>postcode=102200,</w:t>
+      </w:r>
+    </w:p>
+    <w:p>
+      <w:r>
+        <w:t>country=China</w:t>
+      </w:r>
+    </w:p>
+    <w:p>
+      <w:r>
+        <w:t>This supplementary material contains extended proofs, additional controlled-benchmark results, implementation details, and reproducibility notes separated from the main manuscript. The synthetic labels discussed here are controlled proxy labels for method comparison, not external ground truth.</w:t>
+      </w:r>
+    </w:p>
+    <w:p>
+      <w:r>
+        <w:t>supplementary material structural calibration reproducibility knowledge graph pilot</w:t>
       </w:r>
     </w:p>
     <w:p>
@@ -53,7 +220,7 @@
     </w:p>
     <w:p>
       <w:r>
-        <w:t>This appendix provides supplementary derivations, edge-case analyses, and tightness constructions referenced in the main text. Full proofs of the variance-reduction and bottleneck-protection theorems, the bottleneck tightness construction, and SLSQP convergence diagnostics are provided in the supplementary materials (Supplementary Notes S2-S4).</w:t>
+        <w:t>This appendix provides supplementary derivations, edge-case analyses, and tightness constructions referenced in the main text. Full proofs of the variance-reduction and bottleneck-protection theorems, the bottleneck tightness construction, and SLSQP convergence diagnostics are provided in the subsections below.</w:t>
       </w:r>
     </w:p>
     <w:p>
@@ -66,47 +233,37 @@
     </w:p>
     <w:p>
       <w:r>
-        <w:t>The Karush-Kuhn-Tucker (KKT) conditions for the SCU constrained optimization problem (Eqs.~1-2) are:</w:t>
+        <w:t>The Karush-Kuhn-Tucker (KKT) conditions for the SCU constrained optimization problem (Eqs. 1-2) are:</w:t>
       </w:r>
     </w:p>
     <w:p>
       <w:r>
-        <w:t>align</w:t>
+        <w:t>L w_i|_w^* - _i^* - ^* &amp;= 0, i</w:t>
       </w:r>
     </w:p>
     <w:p>
       <w:r>
-        <w:t>L w_i|_w^* - _i^* - ^*  | = 0, i</w:t>
+        <w:t>_i^* &amp; 0, i</w:t>
       </w:r>
     </w:p>
     <w:p>
       <w:r>
-        <w:t>_i^*  |  0, i</w:t>
+        <w:t>_i^*(w_i^* - ) &amp;= 0, i</w:t>
       </w:r>
     </w:p>
     <w:p>
       <w:r>
-        <w:t>_i^*(w_i^* - )  | = 0, i</w:t>
+        <w:t>w_i^* &amp; , i</w:t>
       </w:r>
     </w:p>
     <w:p>
       <w:r>
-        <w:t>w_i^*  |  , i</w:t>
+        <w:t>_i=1^k w_i^* &amp;= 1.</w:t>
       </w:r>
     </w:p>
     <w:p>
       <w:r>
-        <w:t>_i=1^k w_i^*  | = 1.</w:t>
-      </w:r>
-    </w:p>
-    <w:p>
-      <w:r>
-        <w:t>align</w:t>
-      </w:r>
-    </w:p>
-    <w:p>
-      <w:r>
-        <w:t>The partial derivative is L / w_i = 2(w_i - c_i) + 2(w_i - n_i) + 2(Rw)_i - b_i / w_i. The multiplier ^* R (unrestricted) captures the equality constraint; _i^* 0 enforce the floor constraints. By complementary slackness, _i^* &gt; 0 only when w_i^* = . The complete derivation and case-by-case analysis of boundary solutions are provided in Supplementary Note~S2.</w:t>
+        <w:t>The partial derivative is L / w_i = 2(w_i - c_i) + 2(w_i - n_i) + 2(Rw)_i - b_i / w_i. The multiplier ^* R (unrestricted) captures the equality constraint; _i^* 0 enforce the floor constraints. By complementary slackness, _i^* &gt; 0 only when w_i^* = . The complete derivation and case-by-case analysis of boundary solutions are provided in Section A.1 below.</w:t>
       </w:r>
     </w:p>
     <w:p>
@@ -119,7 +276,7 @@
     </w:p>
     <w:p>
       <w:r>
-        <w:t>The full algebraic derivation is provided in Supplementary Note~S2. The key steps are: (i) the two-term objective L_2(w) = \|w - c\|_2^2 + \|w - n\|_2^2 has unconstrained minimizer w = (c + n)/(+); (ii) variance decomposes as Var(w) = (/(+))^2Var(c) + (/(+))^2Var(n) + 2/(+)^2Cov(c, n); (iii) since Cov(c, n) 0.05-0.09 and Var(n) Var(c), the dominant shrinkage factor is /(+); (iv) projection onto the simplex W is non-expansive in variance~[wang2013projection], yielding the stated bound.</w:t>
+        <w:t>The full algebraic derivation is provided below. The key steps are: (i) the two-term objective L_2(w) = \|w - c\|_2^2 + \|w - n\|_2^2 has unconstrained minimizer w = (c + n)/(+); (ii) variance decomposes as Var(w) = (/(+))^2Var(c) + (/(+))^2Var(n) + 2/(+)^2Cov(c, n); (iii) since Cov(c, n) 0.05-0.09 and Var(n) Var(c), the dominant shrinkage factor is /(+); (iv) projection onto the simplex W is non-expansive in variance wang2013projection, yielding the stated bound.</w:t>
       </w:r>
     </w:p>
     <w:p>
@@ -132,7 +289,7 @@
     </w:p>
     <w:p>
       <w:r>
-        <w:t>The explicit tightness construction for the bottleneck lower-bound theorem is provided in Supplementary Note~S3.</w:t>
+        <w:t>The explicit tightness construction for the bottleneck lower-bound theorem is provided in Section A.3 below.</w:t>
       </w:r>
     </w:p>
     <w:p>
@@ -142,17 +299,7 @@
     </w:p>
     <w:p>
       <w:r>
-        <w:t>equation</w:t>
-      </w:r>
-    </w:p>
-    <w:p>
-      <w:r>
         <w:t>L(w_1) = (+)(w_1^2 + w_1^2) - (w_1) = 2(+)w_1^2 - (w_1).</w:t>
-      </w:r>
-    </w:p>
-    <w:p>
-      <w:r>
-        <w:t>equation</w:t>
       </w:r>
     </w:p>
     <w:p>
@@ -162,17 +309,7 @@
     </w:p>
     <w:p>
       <w:r>
-        <w:t>equation</w:t>
-      </w:r>
-    </w:p>
-    <w:p>
-      <w:r>
         <w:t>dLdw_1 = 4(+)w_1 - w_1 = 0 w_1^* = 4(+).</w:t>
-      </w:r>
-    </w:p>
-    <w:p>
-      <w:r>
-        <w:t>equation</w:t>
       </w:r>
     </w:p>
     <w:p>
@@ -200,17 +337,7 @@
     </w:p>
     <w:p>
       <w:r>
-        <w:t>equation</w:t>
-      </w:r>
-    </w:p>
-    <w:p>
-      <w:r>
-        <w:t>R = bmatrix 1.0  |  0.9 0.9  |  1.0 bmatrix.</w:t>
-      </w:r>
-    </w:p>
-    <w:p>
-      <w:r>
-        <w:t>equation</w:t>
+        <w:t>R = bmatrix 1.0 &amp; 0.9 0.9 &amp; 1.0 bmatrix.</w:t>
       </w:r>
     </w:p>
     <w:p>
@@ -225,17 +352,7 @@
     </w:p>
     <w:p>
       <w:r>
-        <w:t>equation</w:t>
-      </w:r>
-    </w:p>
-    <w:p>
-      <w:r>
         <w:t>L(w_1, w_2) = 1.0[(w_1-0.6)^2 + (w_2-0.4)^2] + 0.5[(w_1-0.5)^2 + (w_2-0.5)^2] + 0.2(w_1^2 + 20.9 w_1w_2 + w_2^2).</w:t>
-      </w:r>
-    </w:p>
-    <w:p>
-      <w:r>
-        <w:t>equation</w:t>
       </w:r>
     </w:p>
     <w:p>
@@ -271,58 +388,42 @@
     </w:p>
     <w:p>
       <w:r>
-        <w:t>Table~[tab:per-size] breaks down the controlled synthetic ranking metrics by trace size (k = 3 to 8) for the three SC-FMA variants and raw CIU. Within this controlled proxy-label benchmark, SC-FMA QP is strongest at all k, with the largest gains at k 6 where redundancy effects are most pronounced.</w:t>
+        <w:t>Table tab:per-size breaks down the controlled synthetic ranking metrics by trace size (k = 3 to 8) for the three SC-FMA variants and raw CIU. Within this controlled proxy-label benchmark, SC-FMA QP is strongest at all k, with the largest gains at k 6 where redundancy effects are most pronounced.</w:t>
       </w:r>
     </w:p>
     <w:p>
       <w:r>
-        <w:t>table[ht]</w:t>
+        <w:t>Caption: Step importance ranking metrics stratified by trace size k. Mean Spearman over traces of each size. Standard errors in parentheses (bootstrap, 10k resamples).</w:t>
       </w:r>
     </w:p>
     <w:p>
       <w:r>
-        <w:rPr>
-          <w:b/>
-        </w:rPr>
-        <w:t xml:space="preserve">Caption: </w:t>
-      </w:r>
-      <w:r>
-        <w:t>Step importance ranking metrics stratified by trace size k. Mean Spearman over traces of each size. Standard errors in parentheses (bootstrap, 10k resamples).</w:t>
+        <w:t>Method | k=3 | k=4 | k=5 | k=6 | k 7</w:t>
       </w:r>
     </w:p>
     <w:p>
       <w:r>
-        <w:t>Method  |  k=3  |  k=4  |  k=5  |  k=6  |  k 7</w:t>
+        <w:t>SC-FMA QP | 0.582 (0.041) | 0.601 (0.038) | 0.615 (0.035) | 0.622 (0.033) | 0.634 (0.029)</w:t>
       </w:r>
     </w:p>
     <w:p>
       <w:r>
-        <w:t>SC-FMA QP  |  0.582 (0.041)  |  0.601 (0.038)  |  0.615 (0.035)  |  0.622 (0.033)  |  0.634 (0.029)</w:t>
+        <w:t>SC-FMA Ridge | 0.521 (0.044) | 0.534 (0.040) | 0.540 (0.037) | 0.538 (0.035) | 0.542 (0.032)</w:t>
       </w:r>
     </w:p>
     <w:p>
       <w:r>
-        <w:t>SC-FMA Ridge  |  0.521 (0.044)  |  0.534 (0.040)  |  0.540 (0.037)  |  0.538 (0.035)  |  0.542 (0.032)</w:t>
+        <w:t>SC-FMA Proj. | 0.328 (0.048) | 0.341 (0.044) | 0.345 (0.041) | 0.339 (0.039) | 0.342 (0.036)</w:t>
       </w:r>
     </w:p>
     <w:p>
       <w:r>
-        <w:t>SC-FMA Proj.  |  0.328 (0.048)  |  0.341 (0.044)  |  0.345 (0.041)  |  0.339 (0.039)  |  0.342 (0.036)</w:t>
+        <w:t>Raw CIU | 0.471 (0.045) | 0.485 (0.041) | 0.490 (0.038) | 0.482 (0.036) | 0.486 (0.033)</w:t>
       </w:r>
     </w:p>
     <w:p>
       <w:r>
-        <w:t>Raw CIU  |  0.471 (0.045)  |  0.485 (0.041)  |  0.490 (0.038)  |  0.482 (0.036)  |  0.486 (0.033)</w:t>
-      </w:r>
-    </w:p>
-    <w:p>
-      <w:r>
-        <w:t>(QP - CIU)  |  +0.111  |  +0.116  |  +0.125  |  +0.140  |  +0.148</w:t>
-      </w:r>
-    </w:p>
-    <w:p>
-      <w:r>
-        <w:t>table</w:t>
+        <w:t>(QP - CIU) | +0.111 | +0.116 | +0.125 | +0.140 | +0.148</w:t>
       </w:r>
     </w:p>
     <w:p>
@@ -353,68 +454,52 @@
     </w:p>
     <w:p>
       <w:r>
-        <w:t>table[ht]</w:t>
+        <w:t>Caption: Compact notation reference for the SC-FMA objective.</w:t>
       </w:r>
     </w:p>
     <w:p>
       <w:r>
-        <w:rPr>
-          <w:b/>
-        </w:rPr>
-        <w:t xml:space="preserve">Caption: </w:t>
-      </w:r>
-      <w:r>
-        <w:t>Compact notation reference for the SC-FMA objective.</w:t>
+        <w:t>Symbol | Meaning</w:t>
       </w:r>
     </w:p>
     <w:p>
       <w:r>
-        <w:t>Symbol  |  Meaning</w:t>
+        <w:t>k | Number of reflective or verification steps in a trace.</w:t>
       </w:r>
     </w:p>
     <w:p>
       <w:r>
-        <w:t>k  |  Number of reflective or verification steps in a trace.</w:t>
+        <w:t>w | Calibrated step-weight vector on the probability simplex.</w:t>
       </w:r>
     </w:p>
     <w:p>
       <w:r>
-        <w:t>w  |  Calibrated step-weight vector on the probability simplex.</w:t>
+        <w:t>c | Normalized utility or proxy-fidelity input.</w:t>
       </w:r>
     </w:p>
     <w:p>
       <w:r>
-        <w:t>c  |  Normalized utility or proxy-fidelity input.</w:t>
+        <w:t>n | Normalized graph-level structural necessity.</w:t>
       </w:r>
     </w:p>
     <w:p>
       <w:r>
-        <w:t>n  |  Normalized graph-level structural necessity.</w:t>
+        <w:t>R | Pairwise redundancy matrix.</w:t>
       </w:r>
     </w:p>
     <w:p>
       <w:r>
-        <w:t>R  |  Pairwise redundancy matrix.</w:t>
+        <w:t>b | Bottleneck indicator vector.</w:t>
       </w:r>
     </w:p>
     <w:p>
       <w:r>
-        <w:t>b  |  Bottleneck indicator vector.</w:t>
+        <w:t>,,, | Fidelity, structure, redundancy, and bottleneck weights.</w:t>
       </w:r>
     </w:p>
     <w:p>
       <w:r>
-        <w:t>,,,  |  Fidelity, structure, redundancy, and bottleneck weights.</w:t>
-      </w:r>
-    </w:p>
-    <w:p>
-      <w:r>
-        <w:t>table</w:t>
-      </w:r>
-    </w:p>
-    <w:p>
-      <w:r>
-        <w:t>SC-FMA is positioned between process supervision and graph-aware audit analysis. Process Reward Models supply step-level supervision signals; attribution methods supply local importance scores; graph diagnostics supply structural constraints. SC-FMA does not train a PRM, certify a KBS deployment, or identify causal estimands. It calibrates an existing fidelity signal using observable trace structure.</w:t>
+        <w:t>SC-FMA is positioned between process supervision and graph-aware audit analysis. Process Reward Models supply step-level supervision signals; attribution methods supply local importance scores; graph diagnostics supply structural constraints. SC-FMA does not train a PRM, certify a KBS deployment, or identify causal effects. It calibrates an existing fidelity signal using observable trace structure.</w:t>
       </w:r>
     </w:p>
     <w:p>
@@ -427,23 +512,12 @@
     </w:p>
     <w:p>
       <w:r>
-        <w:t>algorithm[ht]</w:t>
+        <w:t>Caption: Structural Necessity Computation</w:t>
       </w:r>
     </w:p>
     <w:p>
       <w:r>
-        <w:rPr>
-          <w:b/>
-        </w:rPr>
-        <w:t xml:space="preserve">Caption: </w:t>
-      </w:r>
-      <w:r>
-        <w:t>Structural Necessity Computation</w:t>
-      </w:r>
-    </w:p>
-    <w:p>
-      <w:r>
-        <w:t>Reflection DAG G=(V,E), node v_i, intervention mode m\Prune,Cascade,Bypass\</w:t>
+        <w:t>Reflection DAG G=(V,E), node v_i, intervention mode mPrune,Cascade,Bypass</w:t>
       </w:r>
     </w:p>
     <w:p>
@@ -473,23 +547,7 @@
     </w:p>
     <w:p>
       <w:r>
-        <w:t>algorithm</w:t>
-      </w:r>
-    </w:p>
-    <w:p>
-      <w:r>
-        <w:t>algorithm[ht]</w:t>
-      </w:r>
-    </w:p>
-    <w:p>
-      <w:r>
-        <w:rPr>
-          <w:b/>
-        </w:rPr>
-        <w:t xml:space="preserve">Caption: </w:t>
-      </w:r>
-      <w:r>
-        <w:t>SC-FMA QP Calibration</w:t>
+        <w:t>Caption: SC-FMA QP Calibration</w:t>
       </w:r>
     </w:p>
     <w:p>
@@ -504,7 +562,7 @@
     </w:p>
     <w:p>
       <w:r>
-        <w:t>Define the simplex W=\w 0,_i w_i=1\.</w:t>
+        <w:t>Define the simplex W=w 0,_i w_i=1.</w:t>
       </w:r>
     </w:p>
     <w:p>
@@ -523,11 +581,6 @@
       </w:r>
     </w:p>
     <w:p>
-      <w:r>
-        <w:t>algorithm</w:t>
-      </w:r>
-    </w:p>
-    <w:p>
       <w:pPr>
         <w:pStyle w:val="Heading2"/>
       </w:pPr>
@@ -537,129 +590,97 @@
     </w:p>
     <w:p>
       <w:r>
-        <w:t>table[ht]</w:t>
+        <w:t>Caption: Hyperparameter search grid and selected values used for the controlled synthetic benchmark.</w:t>
       </w:r>
     </w:p>
     <w:p>
       <w:r>
-        <w:rPr>
-          <w:b/>
-        </w:rPr>
-        <w:t xml:space="preserve">Caption: </w:t>
-      </w:r>
-      <w:r>
-        <w:t>Hyperparameter search grid and selected values used for the controlled synthetic benchmark.</w:t>
+        <w:t>Parameter | Search range | Selected value | Role</w:t>
       </w:r>
     </w:p>
     <w:p>
       <w:r>
-        <w:t>Parameter  |  Search range  |  Selected value  |  Role</w:t>
+        <w:t>| 0.1,0.5,1.0,2.0 | 1.0 | Fidelity to supplied utility anchor.</w:t>
       </w:r>
     </w:p>
     <w:p>
       <w:r>
-        <w:t xml:space="preserve"> |  \0.1,0.5,1.0,2.0\  |  1.0  |  Fidelity to supplied utility anchor.</w:t>
+        <w:t>| 0.0,0.25,0.5,1.0 | 0.5 | Structural necessity alignment.</w:t>
       </w:r>
     </w:p>
     <w:p>
       <w:r>
-        <w:t xml:space="preserve"> |  \0.0,0.25,0.5,1.0\  |  0.5  |  Structural necessity alignment.</w:t>
+        <w:t>| 0.0,0.1,0.2,0.5 | 0.2 | Redundancy penalty.</w:t>
       </w:r>
     </w:p>
     <w:p>
       <w:r>
-        <w:t xml:space="preserve"> |  \0.0,0.1,0.2,0.5\  |  0.2  |  Redundancy penalty.</w:t>
+        <w:t>| 0.0,0.05,0.1,0.2 | 0.1 | Bottleneck log-barrier.</w:t>
       </w:r>
     </w:p>
     <w:p>
       <w:r>
-        <w:t xml:space="preserve"> |  \0.0,0.05,0.1,0.2\  |  0.1  |  Bottleneck log-barrier.</w:t>
+        <w:t>| 10^-6,10^-5,10^-4,10^-3 | 10^-4 | Numerical floor for weights.</w:t>
       </w:r>
     </w:p>
     <w:p>
       <w:r>
-        <w:t xml:space="preserve"> |  \10^-6,10^-5,10^-4,10^-3\  |  10^-4  |  Numerical floor for weights.</w:t>
+        <w:t>Caption: Extended ablation results moved from the main manuscript. is relative to full SC-FMA QP.</w:t>
       </w:r>
     </w:p>
     <w:p>
       <w:r>
-        <w:t>table</w:t>
+        <w:t>Variant | Spearman |</w:t>
       </w:r>
     </w:p>
     <w:p>
       <w:r>
-        <w:t>table[ht]</w:t>
+        <w:t>SC-FMA QP (full) | 0.608 | --</w:t>
       </w:r>
     </w:p>
     <w:p>
       <w:r>
-        <w:rPr>
-          <w:b/>
-        </w:rPr>
-        <w:t xml:space="preserve">Caption: </w:t>
-      </w:r>
-      <w:r>
-        <w:t>Extended ablation results moved from the main manuscript. is relative to full SC-FMA QP.</w:t>
+        <w:t>- Structure | 0.551 | -0.057</w:t>
       </w:r>
     </w:p>
     <w:p>
       <w:r>
-        <w:t xml:space="preserve">Variant  |  Spearman  | </w:t>
+        <w:t>- Fidelity | 0.536 | -0.072</w:t>
       </w:r>
     </w:p>
     <w:p>
       <w:r>
-        <w:t>SC-FMA QP (full)  |  0.608  |  --</w:t>
+        <w:t>- Redundancy | 0.586 | -0.022</w:t>
       </w:r>
     </w:p>
     <w:p>
       <w:r>
-        <w:t>- Structure  |  0.551  |  -0.057</w:t>
+        <w:t>- Bottleneck | 0.595 | -0.013</w:t>
       </w:r>
     </w:p>
     <w:p>
       <w:r>
-        <w:t>- Fidelity  |  0.536  |  -0.072</w:t>
+        <w:t>Structure only | 0.438 | -0.170</w:t>
       </w:r>
     </w:p>
     <w:p>
       <w:r>
-        <w:t>- Redundancy  |  0.586  |  -0.022</w:t>
+        <w:t>Fidelity only (Raw CIU) | 0.483 | -0.125</w:t>
       </w:r>
     </w:p>
     <w:p>
       <w:r>
-        <w:t>- Bottleneck  |  0.595  |  -0.013</w:t>
+        <w:t>Fidelity + Structure | 0.573 | -0.035</w:t>
       </w:r>
     </w:p>
     <w:p>
       <w:r>
-        <w:t>Structure only  |  0.438  |  -0.170</w:t>
+        <w:t>Fidelity + Redundancy | 0.518 | -0.090</w:t>
       </w:r>
     </w:p>
     <w:p>
       <w:r>
-        <w:t>Fidelity only (Raw CIU)  |  0.483  |  -0.125</w:t>
-      </w:r>
-    </w:p>
-    <w:p>
-      <w:r>
-        <w:t>Fidelity + Structure  |  0.573  |  -0.035</w:t>
-      </w:r>
-    </w:p>
-    <w:p>
-      <w:r>
-        <w:t>Fidelity + Redundancy  |  0.518  |  -0.090</w:t>
-      </w:r>
-    </w:p>
-    <w:p>
-      <w:r>
-        <w:t>Fidelity + Bottleneck  |  0.504  |  -0.104</w:t>
-      </w:r>
-    </w:p>
-    <w:p>
-      <w:r>
-        <w:t>table</w:t>
+        <w:t>Fidelity + Bottleneck | 0.504 | -0.104</w:t>
       </w:r>
     </w:p>
     <w:p>
@@ -672,73 +693,57 @@
     </w:p>
     <w:p>
       <w:r>
-        <w:t>table[ht]</w:t>
+        <w:t>Caption: Computational efficiency moved from the main manuscript. Times are per-trace mean over the synthetic test set.</w:t>
       </w:r>
     </w:p>
     <w:p>
       <w:r>
-        <w:rPr>
-          <w:b/>
-        </w:rPr>
-        <w:t xml:space="preserve">Caption: </w:t>
-      </w:r>
-      <w:r>
-        <w:t>Computational efficiency moved from the main manuscript. Times are per-trace mean over the synthetic test set.</w:t>
+        <w:t>Method | Wall-clock (ms) | Scaling exponent p</w:t>
       </w:r>
     </w:p>
     <w:p>
       <w:r>
-        <w:t>Method  |  Wall-clock (ms)  |  Scaling exponent p</w:t>
+        <w:t>SC-FMA QP | 6.8 2.9 | 2.81</w:t>
       </w:r>
     </w:p>
     <w:p>
       <w:r>
-        <w:t>SC-FMA QP  |  6.8 2.9  |  2.81</w:t>
+        <w:t>SC-FMA Ridge | 0.4 0.1 | 0.97</w:t>
       </w:r>
     </w:p>
     <w:p>
       <w:r>
-        <w:t>SC-FMA Ridge  |  0.4 0.1  |  0.97</w:t>
+        <w:t>SC-FMA Projection | 0.2 0.05 | 0.98</w:t>
       </w:r>
     </w:p>
     <w:p>
       <w:r>
-        <w:t>SC-FMA Projection  |  0.2 0.05  |  0.98</w:t>
+        <w:t>Raw CIU | 0.8 0.2 | 0.95</w:t>
       </w:r>
     </w:p>
     <w:p>
       <w:r>
-        <w:t>Raw CIU  |  0.8 0.2  |  0.95</w:t>
+        <w:t>MC Shapley (500 permutations) | 3,420 890 | 1.03</w:t>
       </w:r>
     </w:p>
     <w:p>
       <w:r>
-        <w:t>MC Shapley (500 permutations)  |  3,420 890  |  1.03</w:t>
+        <w:t>GradientInput | 12.4 3.1 | 1.12</w:t>
       </w:r>
     </w:p>
     <w:p>
       <w:r>
-        <w:t>GradientInput  |  12.4 3.1  |  1.12</w:t>
+        <w:t>Attention Rollout | 8.1 1.7 | 1.15</w:t>
       </w:r>
     </w:p>
     <w:p>
       <w:r>
-        <w:t>Attention Rollout  |  8.1 1.7  |  1.15</w:t>
+        <w:t>Token Surprisal | 45.2 8.3 | 1.08</w:t>
       </w:r>
     </w:p>
     <w:p>
       <w:r>
-        <w:t>Token Surprisal  |  45.2 8.3  |  1.08</w:t>
-      </w:r>
-    </w:p>
-    <w:p>
-      <w:r>
-        <w:t>table</w:t>
-      </w:r>
-    </w:p>
-    <w:p>
-      <w:r>
-        <w:t>The full scaling figure remains available as Figure~[fig:resilience-app] and in the source figure bundle. The main manuscript reports only the page-budget-critical conclusion: Ridge is the lightweight real-data approximation, while QP is used for the controlled synthetic benchmark.</w:t>
+        <w:t>The full scaling figure remains available as Figure fig:resilience-app and in the source figure bundle. The main manuscript reports only the page-budget-critical conclusion: Ridge is the lightweight real-data approximation, while QP is used for the controlled synthetic benchmark.</w:t>
       </w:r>
     </w:p>
     <w:p>
@@ -751,129 +756,102 @@
     </w:p>
     <w:p>
       <w:r>
-        <w:t>table[ht]</w:t>
+        <w:t>: The core PRM800K audit-prioritization readout has been moved to the main manuscript, Section 6 (KBS Audit Demonstration). The tables below provide extended variant comparisons and additional baselines that supplement the main-text results.</w:t>
       </w:r>
     </w:p>
     <w:p>
       <w:r>
-        <w:rPr>
-          <w:b/>
-        </w:rPr>
-        <w:t xml:space="preserve">Caption: </w:t>
-      </w:r>
-      <w:r>
-        <w:t>SC-FMA calibration variant comparison on the PRM800K locked split. All variants use w_struct predictions as the fidelity input.</w:t>
+        <w:t>Caption: SC-FMA calibration variant comparison on the PRM800K locked split. All variants use w_struct predictions as the fidelity input.</w:t>
       </w:r>
     </w:p>
     <w:p>
       <w:r>
-        <w:t>Method  |  Mean  |  95% CI  |  vs. w_struct</w:t>
+        <w:t>Method | Mean | 95% CI | vs. w_struct</w:t>
       </w:r>
     </w:p>
     <w:p>
       <w:r>
-        <w:t>w_struct  |  0.611  |  [0.605,0.618]  |  --</w:t>
+        <w:t>w_struct | 0.611 | [0.605,0.618] | --</w:t>
       </w:r>
     </w:p>
     <w:p>
       <w:r>
-        <w:t>SC-FMA Ridge  |  0.604  |  [0.597,0.611]  |  -0.007</w:t>
+        <w:t>SC-FMA Ridge | 0.604 | [0.597,0.611] | -0.007</w:t>
       </w:r>
     </w:p>
     <w:p>
       <w:r>
-        <w:t>SC-FMA QP  |  0.442  |  [0.432,0.452]  |  -0.169</w:t>
+        <w:t>SC-FMA QP | 0.442 | [0.432,0.452] | -0.169</w:t>
       </w:r>
     </w:p>
     <w:p>
       <w:r>
-        <w:t>SC-FMA Projection  |  -0.135  |  [-0.147,-0.122]  |  -0.746</w:t>
+        <w:t>SC-FMA Projection | -0.135 | [-0.147,-0.122] | -0.746</w:t>
       </w:r>
     </w:p>
     <w:p>
       <w:r>
-        <w:t>Raw local utility  |  -0.078  |  [-0.092,-0.064]  |  -0.689</w:t>
+        <w:t>Raw local utility | -0.078 | [-0.092,-0.064] | -0.689</w:t>
       </w:r>
     </w:p>
     <w:p>
       <w:r>
-        <w:t>Frozen PRM prefix score  |  0.252  |  --  |  -0.359</w:t>
+        <w:t>Frozen PRM prefix score | 0.252 | -- | -0.359</w:t>
       </w:r>
     </w:p>
     <w:p>
       <w:r>
-        <w:t>Random  |  0.006  |  [-0.008,0.020]  |  -0.606</w:t>
+        <w:t>Random | 0.006 | [-0.008,0.020] | -0.606</w:t>
       </w:r>
     </w:p>
     <w:p>
       <w:r>
-        <w:t>table</w:t>
+        <w:t>Caption: Offline PRM800K audit-prioritization readout under a fixed review budget.</w:t>
       </w:r>
     </w:p>
     <w:p>
       <w:r>
-        <w:t>table[ht]</w:t>
+        <w:t>Method | Top-1 hit | Mass@25% | NDCG@25%</w:t>
       </w:r>
     </w:p>
     <w:p>
       <w:r>
-        <w:rPr>
-          <w:b/>
-        </w:rPr>
-        <w:t xml:space="preserve">Caption: </w:t>
-      </w:r>
-      <w:r>
-        <w:t>Offline PRM800K audit-prioritization readout under a fixed review budget.</w:t>
+        <w:t>w_struct | 0.9169 | 0.3809 | 0.9506</w:t>
       </w:r>
     </w:p>
     <w:p>
       <w:r>
-        <w:t>Method  |  Top-1 hit  |  Mass@25%  |  NDCG@25%</w:t>
+        <w:t>SC-FMA Ridge | 0.9054 | 0.3796 | 0.9460</w:t>
       </w:r>
     </w:p>
     <w:p>
       <w:r>
-        <w:t>w_struct  |  0.9169  |  0.3809  |  0.9506</w:t>
+        <w:t>SC-FMA QP | 0.9033 | 0.3790 | 0.9439</w:t>
       </w:r>
     </w:p>
     <w:p>
       <w:r>
-        <w:t>SC-FMA Ridge  |  0.9054  |  0.3796  |  0.9460</w:t>
+        <w:t>Frozen PRM prefix score | -- | -- | 0.8465</w:t>
       </w:r>
     </w:p>
     <w:p>
       <w:r>
-        <w:t>SC-FMA QP  |  0.9033  |  0.3790  |  0.9439</w:t>
+        <w:t>Random | -- | -- | 0.7757</w:t>
       </w:r>
     </w:p>
     <w:p>
       <w:r>
-        <w:t>Frozen PRM prefix score  |  --  |  --  |  0.8465</w:t>
+        <w:t>Span length | -- | -- | 0.7526</w:t>
       </w:r>
     </w:p>
     <w:p>
       <w:r>
-        <w:t>Random  |  --  |  --  |  0.7757</w:t>
+        <w:t>Raw local utility | -- | -- | 0.7221</w:t>
       </w:r>
     </w:p>
     <w:p>
       <w:r>
-        <w:t>Span length  |  --  |  --  |  0.7526</w:t>
-      </w:r>
-    </w:p>
-    <w:p>
-      <w:r>
-        <w:t>Raw local utility  |  --  |  --  |  0.7221</w:t>
-      </w:r>
-    </w:p>
-    <w:p>
-      <w:r>
-        <w:t>Relative position  |  --  |  --  |  0.3204</w:t>
-      </w:r>
-    </w:p>
-    <w:p>
-      <w:r>
-        <w:t>table</w:t>
+        <w:t>Relative position | -- | -- | 0.3204</w:t>
       </w:r>
     </w:p>
     <w:p>
@@ -886,12 +864,100 @@
         <w:pStyle w:val="Heading2"/>
       </w:pPr>
       <w:r>
+        <w:t>MuSiQue KBS-style Knowledge-Audit Details</w:t>
+      </w:r>
+    </w:p>
+    <w:p>
+      <w:r>
+        <w:t>The MuSiQue route is an offline, deterministic KBS-style audit-prioritization experiment. It constructs trace records from MuSiQue decomposition evidence chains with retrieval, entity-binding, evidence-check, distractor-rejection, and answer-synthesis steps. The label source is musique_decomposition_constructed_audit_labels; these labels are constructed from decomposition support structure and are not production-scene human curation labels. The route is therefore reported only as kbs_style_audit_prioritization_evidence_only.</w:t>
+      </w:r>
+    </w:p>
+    <w:p>
+      <w:r>
+        <w:t>The split is locked by hash: 585 samples are used for dev training or calibration, and 1,415 samples with 12,715 steps are reserved for final reporting. No API calls are used. The leakage audit reports that locked labels are not used for scoring, forbidden fields are excluded from scoring, and label permutation reduces the mean diagnostic delta from 0.1347 to 0.0078.</w:t>
+      </w:r>
+    </w:p>
+    <w:p>
+      <w:r>
+        <w:t>Caption: Full MuSiQue KBS-style knowledge-audit prioritization results on the locked split (1,415 samples, 12,715 steps).</w:t>
+      </w:r>
+    </w:p>
+    <w:p>
+      <w:r>
+        <w:t>Method | Spearman | Top-1 hit | Mass@25% | NDCG@25% | AUPRC</w:t>
+      </w:r>
+    </w:p>
+    <w:p>
+      <w:r>
+        <w:t>w_struct | 0.9652 | 1.0000 | 0.3939 | 1.0000 | 1.0000</w:t>
+      </w:r>
+    </w:p>
+    <w:p>
+      <w:r>
+        <w:t>SC-FMA Ridge | 0.9653 | 1.0000 | 0.3939 | 1.0000 | 1.0000</w:t>
+      </w:r>
+    </w:p>
+    <w:p>
+      <w:r>
+        <w:t>SC-FMA QP | 0.9105 | 1.0000 | 0.3939 | 1.0000 | 1.0000</w:t>
+      </w:r>
+    </w:p>
+    <w:p>
+      <w:r>
+        <w:t>SC-FMA Projection | 0.9111 | 0.2728 | 0.3939 | 0.9544 | 0.6364</w:t>
+      </w:r>
+    </w:p>
+    <w:p>
+      <w:r>
+        <w:t>Graph centrality | 0.6573 | 1.0000 | 0.3494 | 0.8807 | 1.0000</w:t>
+      </w:r>
+    </w:p>
+    <w:p>
+      <w:r>
+        <w:t>Simple average | 0.8380 | 1.0000 | 0.3433 | 0.8653 | 1.0000</w:t>
+      </w:r>
+    </w:p>
+    <w:p>
+      <w:r>
+        <w:t>Relative position | 0.2815 | 1.0000 | 0.2243 | 0.6841 | 1.0000</w:t>
+      </w:r>
+    </w:p>
+    <w:p>
+      <w:r>
+        <w:t>Raw local utility | 0.7596 | 0.0000 | 0.2952 | 0.5797 | 0.3078</w:t>
+      </w:r>
+    </w:p>
+    <w:p>
+      <w:r>
+        <w:t>Random | 0.0165 | 0.1152 | 0.2585 | 0.5449 | 0.3195</w:t>
+      </w:r>
+    </w:p>
+    <w:p>
+      <w:r>
+        <w:t>Retrieval overlap | -0.0589 | 0.0000 | 0.2354 | 0.4242 | 0.2561</w:t>
+      </w:r>
+    </w:p>
+    <w:p>
+      <w:r>
+        <w:t>Span length | -0.3216 | 0.0035 | 0.2168 | 0.3800 | 0.1571</w:t>
+      </w:r>
+    </w:p>
+    <w:p>
+      <w:r>
+        <w:t>The support decision is based on the best SC-FMA method versus the strongest non-SC-FMA control. SC-FMA QP reaches NDCG@25% of 1.0000; graph centrality, the best control, reaches 0.8807. The resulting NDCG@25% is 0.1193, with bootstrap 95% CI [0.1187, 0.1199], exceeding the required threshold of 0.05. This supports KBS-style audit prioritization on constructed MuSiQue evidence-chain traces only; it is not production KBS deployment validation.</w:t>
+      </w:r>
+    </w:p>
+    <w:p>
+      <w:pPr>
+        <w:pStyle w:val="Heading2"/>
+      </w:pPr>
+      <w:r>
         <w:t>KBS Integration Notes and KG Fixture Pilot</w:t>
       </w:r>
     </w:p>
     <w:p>
       <w:r>
-        <w:t>The main manuscript compresses KBS implications to the methodological level. The detailed mapping is: high-necessity steps suggest review-priority knowledge assertions or verification rules; high-redundancy steps suggest candidate consolidation; bottleneck steps suggest single points of failure that deserve fallback or curation. These mappings remain analogies until tested in a rule engine, ontology reasoner, KG query engine, or production KBS workflow.</w:t>
+        <w:t>: The KBS methodological analogy, including the detailed mapping of high-necessity, high-redundancy, and bottleneck steps to KBS review concepts, has been moved to the main manuscript, Section 6.5 (KBS Methodological Analogy). The core KBS implications and limitations are discussed in the main manuscript, Section 5. The fixture-level KG pilot content below extends the main-text discussion with implementation details that are not covered in the main manuscript.</w:t>
       </w:r>
     </w:p>
     <w:p>
@@ -909,85 +975,22 @@
     </w:p>
     <w:p>
       <w:r>
-        <w:t>Figures~[fig:mode-comparison]-[fig:resilience-app] provide the supplementary structural diagnostic figures referenced in the main text.</w:t>
+        <w:t>Figures fig:mode-comparison-fig:resilience-app provide the supplementary structural diagnostic figures referenced in the main text.</w:t>
       </w:r>
     </w:p>
     <w:p>
       <w:r>
-        <w:t>figure[ht]</w:t>
+        <w:t>Caption: Structural diagnostic summary by perturbation mode. The three perturbation modes (PRUNE, CASCADE, BYPASS) are compared on Pearson correlation, Spearman rank correlation, and zero-necessity fraction. Error bars indicate 95% bootstrap confidence intervals. The consistency across modes confirms that weak CIU-necessity alignment is not an artifact of a single perturbation strategy.</w:t>
       </w:r>
     </w:p>
     <w:p>
       <w:r>
-        <w:t>[Supplementary figure retained in LaTeX/PDF source package]</w:t>
+        <w:t>Caption: Redundancy density and compensation analysis. Panel (a): per-trace redundancy density distribution (mean 0.3842). Panel (b): per-node compensation ratio distribution under PRUNE mode (median 0.000, mean 0.0084). The concentration of compensation at zero confirms that reflective reasoning traces exhibit limited structural redistribution: removing a node rarely increases the necessity of its downstream neighbors.</w:t>
       </w:r>
     </w:p>
     <w:p>
       <w:r>
-        <w:rPr>
-          <w:b/>
-        </w:rPr>
-        <w:t xml:space="preserve">Caption: </w:t>
-      </w:r>
-      <w:r>
-        <w:t>Structural diagnostic summary by perturbation mode. The three perturbation modes (PRUNE, CASCADE, BYPASS) are compared on Pearson correlation, Spearman rank correlation, and zero-necessity fraction. Error bars indicate 95% bootstrap confidence intervals. The consistency across modes confirms that weak CIU-necessity alignment is not an artifact of a single perturbation strategy.</w:t>
-      </w:r>
-    </w:p>
-    <w:p>
-      <w:r>
-        <w:t>figure</w:t>
-      </w:r>
-    </w:p>
-    <w:p>
-      <w:r>
-        <w:t>figure[ht]</w:t>
-      </w:r>
-    </w:p>
-    <w:p>
-      <w:r>
-        <w:t>[Supplementary figure retained in LaTeX/PDF source package]</w:t>
-      </w:r>
-    </w:p>
-    <w:p>
-      <w:r>
-        <w:rPr>
-          <w:b/>
-        </w:rPr>
-        <w:t xml:space="preserve">Caption: </w:t>
-      </w:r>
-      <w:r>
-        <w:t>Redundancy density and compensation analysis. Panel (a): per-trace redundancy density distribution (mean 0.3842). Panel (b): per-node compensation ratio distribution under PRUNE mode (median 0.000, mean 0.0084). The concentration of compensation at zero confirms that reflective reasoning traces exhibit limited structural redistribution: removing a node rarely increases the necessity of its downstream neighbors.</w:t>
-      </w:r>
-    </w:p>
-    <w:p>
-      <w:r>
-        <w:t>figure</w:t>
-      </w:r>
-    </w:p>
-    <w:p>
-      <w:r>
-        <w:t>figure[ht]</w:t>
-      </w:r>
-    </w:p>
-    <w:p>
-      <w:r>
-        <w:t>[Supplementary figure retained in LaTeX/PDF source package]</w:t>
-      </w:r>
-    </w:p>
-    <w:p>
-      <w:r>
-        <w:rPr>
-          <w:b/>
-        </w:rPr>
-        <w:t xml:space="preserve">Caption: </w:t>
-      </w:r>
-      <w:r>
-        <w:t>Resilience curves under ordered node removal. Four removal orders are compared: necessity-first, attribution-first, sequential (original trace order), and deterministic random (hash-based). The y-axis shows remaining structural necessity fraction; the x-axis is the fraction of nodes removed. AUC values are annotated. The necessity-first curve degrades sharply (AUC 0.1488), while attribution-first (AUC 0.4761) is close to random (AUC 0.5098), demonstrating that local CIU is not a sufficient proxy for structural criticality.</w:t>
-      </w:r>
-    </w:p>
-    <w:p>
-      <w:r>
-        <w:t>figure</w:t>
+        <w:t>Caption: Resilience curves under ordered node removal. Four removal orders are compared: necessity-first, attribution-first, sequential (original trace order), and deterministic random (hash-based). The y-axis shows remaining structural necessity fraction; the x-axis is the fraction of nodes removed. AUC values are annotated. The necessity-first curve degrades sharply (AUC 0.1488), while attribution-first (AUC 0.4761) is close to random (AUC 0.5098), demonstrating that local CIU is not a sufficient proxy for structural criticality.</w:t>
       </w:r>
     </w:p>
     <w:p>
@@ -1000,7 +1003,7 @@
     </w:p>
     <w:p>
       <w:r>
-        <w:t>The Stage 2 held-out validation results stratified by trace difficulty tier show substantial heterogeneity: S_high yields Spearman = 0.287 (CI [0.108, 0.451]), while S_mid and S_rand include zero in their confidence intervals. The aggregate signal ( = 0.163, CI [0.092, 0.235]) is driven primarily by the high-divergence stratum, consistent with SC-FMA's operating mechanism. Full stratum results are provided in Supplementary Note~S6.</w:t>
+        <w:t>The Stage 2 held-out validation results stratified by trace difficulty tier show substantial heterogeneity: S_high yields Spearman = 0.287 (CI [0.108, 0.451]), while S_mid and S_rand include zero in their confidence intervals. The aggregate signal ( = 0.163, CI [0.092, 0.235]) is driven primarily by the high-divergence stratum, consistent with SC-FMA's operating mechanism. Full stratum results are archived in the structured data file outputs/stage2_stratified_metrics.json.</w:t>
       </w:r>
     </w:p>
     <w:p>
@@ -1013,7 +1016,7 @@
     </w:p>
     <w:p>
       <w:r>
-        <w:t>The ablation analysis stratified by reflective operation category reveals that structure alignment () provides the largest gain for ERROR_CORRECTION and VERIFICATION categories, while redundancy penalty () contributes most for BACKTRACKING and PLANNING categories. Full taxonomy-stratified ablation results are provided in Supplementary Note~S7.</w:t>
+        <w:t>The ablation analysis stratified by reflective operation category reveals that structure alignment () provides the largest gain for ERROR_CORRECTION and VERIFICATION categories, while redundancy penalty () contributes most for BACKTRACKING and PLANNING categories. Full taxonomy-stratified ablation results are archived in the structured data file outputs/counterfactual_ablation_results.jsonl.</w:t>
       </w:r>
     </w:p>
     <w:p>
@@ -1039,12 +1042,7 @@
     </w:p>
     <w:p>
       <w:r>
-        <w:t>enumerate</w:t>
-      </w:r>
-    </w:p>
-    <w:p>
-      <w:r>
-        <w:t>Environment. Python 3.11, dependencies specified in requirements.txt with pinned versions. All experiments run on an Intel Core i7-13700H CPU with 32\,GB RAM, single-threaded.</w:t>
+        <w:t>Environment. Python 3.11, dependencies specified in requirements.txt with pinned versions. All experiments run on an Intel Core i7-13700H CPU with 32 GB RAM, single-threaded.</w:t>
       </w:r>
     </w:p>
     <w:p>
@@ -1079,12 +1077,12 @@
     </w:p>
     <w:p>
       <w:r>
-        <w:t>Output artifacts. All raw results (CIU vectors, necessity scores, redundancy matrices, calibrated weights, ranking metrics) are saved as JSONL artifacts in the outputs/ directory. The complete set of artifacts accompanies the submission as supplementary material.</w:t>
+        <w:t>MuSiQue audit route. The KBS-style MuSiQue audit route is reproduced with python scripts/run_knowledge_audit_eval.py -hf-dataset dgslibisey/MuSiQue -source-format musique -hf-split train -max-records 2000 -shuffle-seed 42 -bootstrap-samples 1000 -bootstrap-seed 42. It writes outputs/kbs_real_audit_v1/knowledge_audit_report.json, knowledge_audit_summary.md, knowledge_audit_traces.jsonl, and dataset_manifest.json; the run uses zero API calls.</w:t>
       </w:r>
     </w:p>
     <w:p>
       <w:r>
-        <w:t>enumerate</w:t>
+        <w:t>Output artifacts. All raw results (CIU vectors, necessity scores, redundancy matrices, calibrated weights, ranking metrics) are saved as JSONL or JSON artifacts in the outputs/ directory. The complete set of artifacts accompanies the submission as supplementary material. The MuSiQue route is archived under outputs/kbs_real_audit_v1 and is labeled kbs_style_audit_prioritization_evidence_only.</w:t>
       </w:r>
     </w:p>
     <w:p>
@@ -1097,7 +1095,7 @@
     </w:p>
     <w:p>
       <w:r>
-        <w:t>SLSQP convergence statistics across N = 1,027 steps (200 traces): mean iterations to convergence 5.3 2.1 (std), median 5, maximum 12. The worst-case trace (k=8, dense redundancy) required 12 iterations and 14.7\,ms. Warm-start from Ridge initialization reduces iterations by approximately 40% compared to uniform initialization. Under default hyperparameters (=1.0, =0.5, =0.2, =0.1, =10^-4), the Hessian condition number (H) 3.2, guaranteeing numerically stable optimization. Detailed convergence statistics by trace size and cold-start comparisons are provided in Supplementary Note~S4.</w:t>
+        <w:t>SLSQP convergence statistics across N = 1,027 steps (200 traces): mean iterations to convergence 5.3 2.1 (std), median 5, maximum 12. The worst-case trace (k=8, dense redundancy) required 12 iterations and 14.7 ms. Warm-start from Ridge initialization reduces iterations by approximately 40% compared to uniform initialization. Under default hyperparameters (=1.0, =0.5, =0.2, =0.1, =10^-4), the Hessian condition number (H) 3.2, guaranteeing numerically stable optimization. Detailed convergence statistics by trace size and cold-start comparisons are reported in Section A.6 below.</w:t>
       </w:r>
     </w:p>
     <w:p>
@@ -1110,7 +1108,7 @@
     </w:p>
     <w:p>
       <w:r>
-        <w:t>The keyword-heuristic graph construction introduces two free parameters: _tfidf = 0.35 and w_topical = 0.75. Sensitivity analysis ( 20% perturbation) shows || &lt; 0.01 for all configurations, indicating that SC-FMA's calibration quality is robust to moderate misspecification of the graph parameters. Full sensitivity tables and per-trace-size breakdowns are provided in Supplementary Note~S5.</w:t>
+        <w:t>The keyword-heuristic graph construction introduces two free parameters: _tfidf = 0.35 and w_topical = 0.75. Sensitivity analysis ( 20% perturbation) shows || &lt; 0.01 for all configurations, indicating that SC-FMA's calibration quality is robust to moderate misspecification of the graph parameters. Full sensitivity tables and per-trace-size breakdowns are archived in the structured data file outputs/phase6_sensitivity.json.</w:t>
       </w:r>
     </w:p>
     <w:p>
@@ -1128,43 +1126,27 @@
     </w:p>
     <w:p>
       <w:r>
-        <w:t>table[ht]</w:t>
+        <w:t>Caption: Cross-correlation between controlled proxy-label components and SCU inputs across 1,027 steps. All correlations are below || &lt; 0.15, confirming low input overlap.</w:t>
       </w:r>
     </w:p>
     <w:p>
       <w:r>
-        <w:rPr>
-          <w:b/>
-        </w:rPr>
-        <w:t xml:space="preserve">Caption: </w:t>
-      </w:r>
-      <w:r>
-        <w:t>Cross-correlation between controlled proxy-label components and SCU inputs across 1,027 steps. All correlations are below || &lt; 0.15, confirming low input overlap.</w:t>
+        <w:t>| c_i (CIU) | n_i (necessity) | r_i (redundancy)</w:t>
       </w:r>
     </w:p>
     <w:p>
       <w:r>
-        <w:t xml:space="preserve"> |  c_i (CIU)  |  n_i (necessity)  |  r_i (redundancy)</w:t>
+        <w:t>s_i (correctness) | 0.08 | -0.04 | -0.07</w:t>
       </w:r>
     </w:p>
     <w:p>
       <w:r>
-        <w:t>s_i (correctness)  |  0.08  |  -0.04  |  -0.07</w:t>
+        <w:t>d_i (lexical diversity) | -0.12 | 0.06 | 0.03</w:t>
       </w:r>
     </w:p>
     <w:p>
       <w:r>
-        <w:t>d_i (lexical diversity)  |  -0.12  |  0.06  |  0.03</w:t>
-      </w:r>
-    </w:p>
-    <w:p>
-      <w:r>
-        <w:t>p_i (position value)  |  0.11  |  -0.09  |  -0.02</w:t>
-      </w:r>
-    </w:p>
-    <w:p>
-      <w:r>
-        <w:t>table</w:t>
+        <w:t>p_i (position value) | 0.11 | -0.09 | -0.02</w:t>
       </w:r>
     </w:p>
     <w:p>
@@ -1174,7 +1156,7 @@
     </w:p>
     <w:sectPr>
       <w:pgSz w:w="12240" w:h="15840"/>
-      <w:pgMar w:top="1152" w:right="1152" w:bottom="1152" w:left="1152" w:header="720" w:footer="720" w:gutter="0"/>
+      <w:pgMar w:top="1440" w:right="1800" w:bottom="1440" w:left="1800" w:header="720" w:footer="720" w:gutter="0"/>
       <w:cols w:space="720"/>
       <w:docGrid w:linePitch="360"/>
     </w:sectPr>
@@ -1545,10 +1527,6 @@
     <w:name w:val="Normal"/>
     <w:qFormat/>
     <w:rsid w:val="00FC693F"/>
-    <w:rPr>
-      <w:rFonts w:ascii="Arial" w:hAnsi="Arial"/>
-      <w:sz w:val="20"/>
-    </w:rPr>
   </w:style>
   <w:style w:type="paragraph" w:styleId="Header">
     <w:name w:val="header"/>
@@ -1609,7 +1587,7 @@
       <w:outlineLvl w:val="0"/>
     </w:pPr>
     <w:rPr>
-      <w:rFonts w:asciiTheme="majorHAnsi" w:eastAsiaTheme="majorEastAsia" w:hAnsiTheme="majorHAnsi" w:cstheme="majorBidi" w:ascii="Arial" w:hAnsi="Arial"/>
+      <w:rFonts w:asciiTheme="majorHAnsi" w:eastAsiaTheme="majorEastAsia" w:hAnsiTheme="majorHAnsi" w:cstheme="majorBidi"/>
       <w:b/>
       <w:bCs/>
       <w:color w:val="365F91" w:themeColor="accent1" w:themeShade="BF"/>
@@ -1633,7 +1611,7 @@
       <w:outlineLvl w:val="1"/>
     </w:pPr>
     <w:rPr>
-      <w:rFonts w:asciiTheme="majorHAnsi" w:eastAsiaTheme="majorEastAsia" w:hAnsiTheme="majorHAnsi" w:cstheme="majorBidi" w:ascii="Arial" w:hAnsi="Arial"/>
+      <w:rFonts w:asciiTheme="majorHAnsi" w:eastAsiaTheme="majorEastAsia" w:hAnsiTheme="majorHAnsi" w:cstheme="majorBidi"/>
       <w:b/>
       <w:bCs/>
       <w:color w:val="4F81BD" w:themeColor="accent1"/>
@@ -1657,7 +1635,7 @@
       <w:outlineLvl w:val="2"/>
     </w:pPr>
     <w:rPr>
-      <w:rFonts w:asciiTheme="majorHAnsi" w:eastAsiaTheme="majorEastAsia" w:hAnsiTheme="majorHAnsi" w:cstheme="majorBidi" w:ascii="Arial" w:hAnsi="Arial"/>
+      <w:rFonts w:asciiTheme="majorHAnsi" w:eastAsiaTheme="majorEastAsia" w:hAnsiTheme="majorHAnsi" w:cstheme="majorBidi"/>
       <w:b/>
       <w:bCs/>
       <w:color w:val="4F81BD" w:themeColor="accent1"/>

</xml_diff>

<commit_message>
Refine FMA pipeline and validation artifacts
</commit_message>
<xml_diff>
--- a/paper/kbs_submission/final_package/supplementary.docx
+++ b/paper/kbs_submission/final_package/supplementary.docx
@@ -869,7 +869,7 @@
     </w:p>
     <w:p>
       <w:r>
-        <w:t>The MuSiQue route is an offline, deterministic KBS-style audit-prioritization experiment. It constructs trace records from MuSiQue decomposition evidence chains with retrieval, entity-binding, evidence-check, distractor-rejection, and answer-synthesis steps. The label source is musique_decomposition_constructed_audit_labels; these labels are constructed from decomposition support structure and are not production-scene human curation labels. The route is therefore reported only as kbs_style_audit_prioritization_evidence_only.</w:t>
+        <w:t>The MuSiQue route is an offline, deterministic KBS-style audit-prioritization experiment. It constructs trace records from MuSiQue decomposition evidence chains with retrieval, entity-binding, evidence-check, distractor-rejection, and answer-synthesis steps. The label source is musique_decomposition_constructed_audit_labels; these labels are assigned deterministically by step type (e.g., answer synthesis 2.0, bridge binding 1.7, distractor rejection 0.0) and are not production-scene human curation labels. The scoring features are likewise deterministic functions of step type: raw_local_utility is a per-type constant, and evidence_role/bridge_role are one-hot subsets of step type. The labels and the w_struct features therefore share a common source (step_type), so the route tests whether a learned linear combination of step-type-derived features reproduces a step-type-derived label vector, not whether step-type-derived features recover an independently grounded audit priority. The route is therefore reported only as a feasibility demonstration (kbs_style_audit_prioritization_evidence_only) and provides no independent audit-prioritization evidence.</w:t>
       </w:r>
     </w:p>
     <w:p>
@@ -879,7 +879,7 @@
     </w:p>
     <w:p>
       <w:r>
-        <w:t>Caption: Full MuSiQue KBS-style knowledge-audit prioritization results on the locked split (1,415 samples, 12,715 steps).</w:t>
+        <w:t>Caption: Full MuSiQue constructed-label feasibility demonstration on the locked split (1,415 samples, 12,715 steps). Both audit labels and scoring features are deterministic functions of step type, so metrics are reported as a feasibility demonstration only.</w:t>
       </w:r>
     </w:p>
     <w:p>
@@ -944,7 +944,7 @@
     </w:p>
     <w:p>
       <w:r>
-        <w:t>The support decision is based on the best SC-FMA method versus the strongest non-SC-FMA control. SC-FMA QP reaches NDCG@25% of 1.0000; graph centrality, the best control, reaches 0.8807. The resulting NDCG@25% is 0.1193, with bootstrap 95% CI [0.1187, 0.1199], exceeding the required threshold of 0.05. This supports KBS-style audit prioritization on constructed MuSiQue evidence-chain traces only; it is not production KBS deployment validation.</w:t>
+        <w:t>The support decision is reported for completeness but is not interpreted as positive evidence. Because the audit labels and scoring features share a common step-type source, the task is close to trivial: a hand-coded step-type priority rule (answer synthesis &gt; bridge binding &gt; evidence check &gt; retrieval/question decomposition &gt; distractor rejection) attains NDCG@25% of 1.0000, Top-1 hit of 1.0000, and Mass@25% of 0.3939 across all 1,415 locked traces, identical to the w_struct, SC-FMA Ridge, and SC-FMA QP rows. The NDCG@25% delta of 0.1193 over graph centrality (0.8807), with bootstrap 95% CI [0.1187, 0.1199], therefore reflects the gap between methods that use the step-type priority and controls that do not, not a calibration advantage; the narrow interval is itself a consequence of the label structure (only three distinct label vectors across the 1,415 locked traces). The field-level leakage audit is clean (locked labels are not read during scoring, forbidden fields are excluded, and label permutation reduces the mean diagnostic delta from 0.1347 to 0.0078), but field-level checks cannot detect construction-level homology. The route is therefore a feasibility demonstration only; it is not production KBS deployment validation and does not provide independent audit-prioritization evidence.</w:t>
       </w:r>
     </w:p>
     <w:p>
@@ -1077,12 +1077,12 @@
     </w:p>
     <w:p>
       <w:r>
-        <w:t>MuSiQue audit route. The KBS-style MuSiQue audit route is reproduced with python scripts/run_knowledge_audit_eval.py -hf-dataset dgslibisey/MuSiQue -source-format musique -hf-split train -max-records 2000 -shuffle-seed 42 -bootstrap-samples 1000 -bootstrap-seed 42. It writes outputs/kbs_real_audit_v1/knowledge_audit_report.json, knowledge_audit_summary.md, knowledge_audit_traces.jsonl, and dataset_manifest.json; the run uses zero API calls.</w:t>
+        <w:t>MuSiQue audit route. The MuSiQue route is reproduced with python scripts/run_knowledge_audit_eval.py -hf-dataset dgslibisey/MuSiQue -source-format musique -hf-split train -max-records 2000 -shuffle-seed 42 -bootstrap-samples 1000 -bootstrap-seed 42. It writes outputs/kbs_real_audit_v1/knowledge_audit_report.json, knowledge_audit_summary.md, knowledge_audit_traces.jsonl, and dataset_manifest.json; the run uses zero API calls. Because the audit labels and scoring features are both deterministic functions of step type, this route is a feasibility demonstration only and is not used as positive audit-prioritization evidence.</w:t>
       </w:r>
     </w:p>
     <w:p>
       <w:r>
-        <w:t>Output artifacts. All raw results (CIU vectors, necessity scores, redundancy matrices, calibrated weights, ranking metrics) are saved as JSONL or JSON artifacts in the outputs/ directory. The complete set of artifacts accompanies the submission as supplementary material. The MuSiQue route is archived under outputs/kbs_real_audit_v1 and is labeled kbs_style_audit_prioritization_evidence_only.</w:t>
+        <w:t>Output artifacts. All raw results (CIU vectors, necessity scores, redundancy matrices, calibrated weights, ranking metrics) are saved as JSONL or JSON artifacts in the outputs/ directory. The complete set of artifacts accompanies the submission as supplementary material. The MuSiQue route is archived under outputs/kbs_real_audit_v1 and is reported as a constructed-label feasibility demonstration (kbs_style_audit_prioritization_evidence_only).</w:t>
       </w:r>
     </w:p>
     <w:p>

</xml_diff>

<commit_message>
Revise SC-FMA manuscript with audit framework and validation
</commit_message>
<xml_diff>
--- a/paper/kbs_submission/final_package/supplementary.docx
+++ b/paper/kbs_submission/final_package/supplementary.docx
@@ -4,40 +4,52 @@
   <w:body>
     <w:p>
       <w:pPr>
-        <w:spacing w:after="200"/>
-        <w:jc w:val="left"/>
+        <w:jc w:val="center"/>
       </w:pPr>
       <w:r>
         <w:rPr>
+          <w:rFonts w:ascii="Arial" w:hAnsi="Arial"/>
           <w:b/>
-          <w:color w:val="000000"/>
-          <w:sz w:val="40"/>
+          <w:color w:val="1F4E79"/>
+          <w:sz w:val="30"/>
         </w:rPr>
         <w:t>Supplementary Material for Structurally-Calibrated Functional Attribution for Audit Prioritization in Knowledge-Intensive Reasoning</w:t>
       </w:r>
     </w:p>
     <w:p>
       <w:pPr>
-        <w:spacing w:after="120"/>
+        <w:jc w:val="center"/>
       </w:pPr>
       <w:r>
+        <w:rPr>
+          <w:rFonts w:ascii="Arial" w:hAnsi="Arial"/>
+          <w:sz w:val="20"/>
+        </w:rPr>
         <w:t>Haoran Ma; Ningning Wang</w:t>
       </w:r>
     </w:p>
     <w:p>
       <w:pPr>
-        <w:spacing w:after="120"/>
+        <w:spacing w:after="120" w:line="259" w:lineRule="auto"/>
       </w:pPr>
       <w:r>
-        <w:t>Abstract. This supplementary material records extended proof notes, method details, route-specific diagnostics, and reproducibility information for the KBS submission package. The LaTeX source bundle remains the authoritative source for mathematical layout; this Word file is a clean readable supplement for portal upload.</w:t>
+        <w:rPr>
+          <w:rFonts w:ascii="Arial" w:hAnsi="Arial"/>
+          <w:sz w:val="19"/>
+        </w:rPr>
+        <w:t>Abstract. This supplementary material records extended proof notes, method details, route-specific diagnostics, oracle auto audit-target validation, graph-construction ablations, and reproducibility information for the KBS submission package. The LaTeX source bundle remains the authoritative source for mathematical layout; this Word file is a clean readable supplement for portal upload.</w:t>
       </w:r>
     </w:p>
     <w:p>
       <w:pPr>
-        <w:spacing w:after="120"/>
+        <w:spacing w:after="120" w:line="259" w:lineRule="auto"/>
       </w:pPr>
       <w:r>
-        <w:t>Keywords. supplementary material; structural calibration; audit prioritization; reproducibility; knowledge graph pilot</w:t>
+        <w:rPr>
+          <w:rFonts w:ascii="Arial" w:hAnsi="Arial"/>
+          <w:sz w:val="19"/>
+        </w:rPr>
+        <w:t>Keywords. supplementary material; structural calibration; audit prioritization; oracle auto validation; graph construction; reproducibility</w:t>
       </w:r>
     </w:p>
     <w:p>
@@ -46,41 +58,70 @@
       </w:pPr>
       <w:r>
         <w:rPr>
-          <w:color w:val="2E74B5"/>
+          <w:rFonts w:ascii="Arial" w:hAnsi="Arial"/>
+          <w:color w:val="1F4E79"/>
         </w:rPr>
         <w:t>Verification Boundary</w:t>
       </w:r>
     </w:p>
     <w:p>
       <w:pPr>
-        <w:spacing w:after="120"/>
+        <w:spacing w:after="120" w:line="259" w:lineRule="auto"/>
       </w:pPr>
       <w:r>
+        <w:rPr>
+          <w:rFonts w:ascii="Arial" w:hAnsi="Arial"/>
+          <w:sz w:val="19"/>
+        </w:rPr>
         <w:t>MuSiQue KBS-style Knowledge-Audit Details</w:t>
       </w:r>
     </w:p>
     <w:p>
       <w:pPr>
-        <w:spacing w:after="120"/>
+        <w:spacing w:after="120" w:line="259" w:lineRule="auto"/>
       </w:pPr>
       <w:r>
+        <w:rPr>
+          <w:rFonts w:ascii="Arial" w:hAnsi="Arial"/>
+          <w:sz w:val="19"/>
+        </w:rPr>
         <w:t>kbs_style_audit_prioritization_evidence_only</w:t>
       </w:r>
     </w:p>
     <w:p>
       <w:pPr>
-        <w:spacing w:after="120"/>
+        <w:spacing w:after="120" w:line="259" w:lineRule="auto"/>
       </w:pPr>
       <w:r>
+        <w:rPr>
+          <w:rFonts w:ascii="Arial" w:hAnsi="Arial"/>
+          <w:sz w:val="19"/>
+        </w:rPr>
         <w:t>The MuSiQue route is reported as a constructed-label feasibility demonstration only because audit labels and scoring features are deterministic functions of step type. It is not used as independent audit-prioritization evidence.</w:t>
       </w:r>
     </w:p>
     <w:p>
       <w:pPr>
-        <w:spacing w:after="120"/>
+        <w:spacing w:after="120" w:line="259" w:lineRule="auto"/>
       </w:pPr>
       <w:r>
+        <w:rPr>
+          <w:rFonts w:ascii="Arial" w:hAnsi="Arial"/>
+          <w:sz w:val="19"/>
+        </w:rPr>
         <w:t>The WebQSP route is reported as a supplementary fixed-schema trace-audit diagnostic. It is not KGQA accuracy evidence, semantic parsing evidence, entity-linking evidence, or production KBS validation.</w:t>
+      </w:r>
+    </w:p>
+    <w:p>
+      <w:pPr>
+        <w:spacing w:after="120" w:line="259" w:lineRule="auto"/>
+      </w:pPr>
+      <w:r>
+        <w:rPr>
+          <w:rFonts w:ascii="Arial" w:hAnsi="Arial"/>
+          <w:sz w:val="19"/>
+        </w:rPr>
+        <w:t>The oracle auto audit-target validation is zero-human: human_subjects=false, human_efficiency_claim=false, validated_kbs_workflow=false, evidence_level=oracle_auto_audit_validation. It supports decision traceability and automatic information recovery, not human-performance claims.</w:t>
       </w:r>
     </w:p>
     <w:p>
@@ -89,7 +130,8 @@
       </w:pPr>
       <w:r>
         <w:rPr>
-          <w:color w:val="2E74B5"/>
+          <w:rFonts w:ascii="Arial" w:hAnsi="Arial"/>
+          <w:color w:val="1F4E79"/>
         </w:rPr>
         <w:t>Supplementary Evidence Map</w:t>
       </w:r>
@@ -103,28 +145,30 @@
         <w:tblLook w:firstColumn="1" w:firstRow="1" w:lastColumn="0" w:lastRow="0" w:noHBand="0" w:noVBand="1" w:val="04A0"/>
       </w:tblPr>
       <w:tblGrid>
-        <w:gridCol w:w="2340"/>
-        <w:gridCol w:w="2340"/>
-        <w:gridCol w:w="2340"/>
-        <w:gridCol w:w="2340"/>
+        <w:gridCol w:w="2520"/>
+        <w:gridCol w:w="2520"/>
+        <w:gridCol w:w="2520"/>
+        <w:gridCol w:w="2520"/>
       </w:tblGrid>
       <w:tr>
         <w:tc>
           <w:tcPr>
-            <w:tcW w:type="dxa" w:w="2088"/>
+            <w:tcW w:type="dxa" w:w="1944"/>
+            <w:shd w:fill="D9EAF7"/>
             <w:vAlign w:val="center"/>
             <w:tcMar>
               <w:top w:w="80" w:type="dxa"/>
-              <w:start w:w="120" w:type="dxa"/>
+              <w:start w:w="100" w:type="dxa"/>
               <w:bottom w:w="80" w:type="dxa"/>
-              <w:end w:w="120" w:type="dxa"/>
+              <w:end w:w="100" w:type="dxa"/>
             </w:tcMar>
-            <w:shd w:fill="E8EEF5"/>
           </w:tcPr>
           <w:p>
             <w:r>
               <w:rPr>
+                <w:rFonts w:ascii="Arial" w:hAnsi="Arial"/>
                 <w:b/>
+                <w:sz w:val="17"/>
               </w:rPr>
               <w:t>Route</w:t>
             </w:r>
@@ -132,20 +176,22 @@
         </w:tc>
         <w:tc>
           <w:tcPr>
-            <w:tcW w:type="dxa" w:w="2592"/>
+            <w:tcW w:type="dxa" w:w="2664"/>
+            <w:shd w:fill="D9EAF7"/>
             <w:vAlign w:val="center"/>
             <w:tcMar>
               <w:top w:w="80" w:type="dxa"/>
-              <w:start w:w="120" w:type="dxa"/>
+              <w:start w:w="100" w:type="dxa"/>
               <w:bottom w:w="80" w:type="dxa"/>
-              <w:end w:w="120" w:type="dxa"/>
+              <w:end w:w="100" w:type="dxa"/>
             </w:tcMar>
-            <w:shd w:fill="E8EEF5"/>
           </w:tcPr>
           <w:p>
             <w:r>
               <w:rPr>
+                <w:rFonts w:ascii="Arial" w:hAnsi="Arial"/>
                 <w:b/>
+                <w:sz w:val="17"/>
               </w:rPr>
               <w:t>Artifact</w:t>
             </w:r>
@@ -153,20 +199,22 @@
         </w:tc>
         <w:tc>
           <w:tcPr>
-            <w:tcW w:type="dxa" w:w="1944"/>
+            <w:tcW w:type="dxa" w:w="1440"/>
+            <w:shd w:fill="D9EAF7"/>
             <w:vAlign w:val="center"/>
             <w:tcMar>
               <w:top w:w="80" w:type="dxa"/>
-              <w:start w:w="120" w:type="dxa"/>
+              <w:start w:w="100" w:type="dxa"/>
               <w:bottom w:w="80" w:type="dxa"/>
-              <w:end w:w="120" w:type="dxa"/>
+              <w:end w:w="100" w:type="dxa"/>
             </w:tcMar>
-            <w:shd w:fill="E8EEF5"/>
           </w:tcPr>
           <w:p>
             <w:r>
               <w:rPr>
+                <w:rFonts w:ascii="Arial" w:hAnsi="Arial"/>
                 <w:b/>
+                <w:sz w:val="17"/>
               </w:rPr>
               <w:t>Status</w:t>
             </w:r>
@@ -174,20 +222,22 @@
         </w:tc>
         <w:tc>
           <w:tcPr>
-            <w:tcW w:type="dxa" w:w="2736"/>
+            <w:tcW w:type="dxa" w:w="3240"/>
+            <w:shd w:fill="D9EAF7"/>
             <w:vAlign w:val="center"/>
             <w:tcMar>
               <w:top w:w="80" w:type="dxa"/>
-              <w:start w:w="120" w:type="dxa"/>
+              <w:start w:w="100" w:type="dxa"/>
               <w:bottom w:w="80" w:type="dxa"/>
-              <w:end w:w="120" w:type="dxa"/>
+              <w:end w:w="100" w:type="dxa"/>
             </w:tcMar>
-            <w:shd w:fill="E8EEF5"/>
           </w:tcPr>
           <w:p>
             <w:r>
               <w:rPr>
+                <w:rFonts w:ascii="Arial" w:hAnsi="Arial"/>
                 <w:b/>
+                <w:sz w:val="17"/>
               </w:rPr>
               <w:t>Allowed interpretation</w:t>
             </w:r>
@@ -197,68 +247,96 @@
       <w:tr>
         <w:tc>
           <w:tcPr>
-            <w:tcW w:type="dxa" w:w="2088"/>
+            <w:tcW w:type="dxa" w:w="1944"/>
             <w:vAlign w:val="center"/>
             <w:tcMar>
               <w:top w:w="80" w:type="dxa"/>
-              <w:start w:w="120" w:type="dxa"/>
+              <w:start w:w="100" w:type="dxa"/>
               <w:bottom w:w="80" w:type="dxa"/>
-              <w:end w:w="120" w:type="dxa"/>
+              <w:end w:w="100" w:type="dxa"/>
             </w:tcMar>
           </w:tcPr>
           <w:p>
+            <w:pPr>
+              <w:spacing w:after="0"/>
+            </w:pPr>
             <w:r>
+              <w:rPr>
+                <w:rFonts w:ascii="Arial" w:hAnsi="Arial"/>
+                <w:sz w:val="16"/>
+              </w:rPr>
               <w:t>Synthetic structural stress-test</w:t>
             </w:r>
           </w:p>
         </w:tc>
         <w:tc>
           <w:tcPr>
-            <w:tcW w:type="dxa" w:w="2592"/>
+            <w:tcW w:type="dxa" w:w="2664"/>
             <w:vAlign w:val="center"/>
             <w:tcMar>
               <w:top w:w="80" w:type="dxa"/>
-              <w:start w:w="120" w:type="dxa"/>
+              <w:start w:w="100" w:type="dxa"/>
               <w:bottom w:w="80" w:type="dxa"/>
-              <w:end w:w="120" w:type="dxa"/>
+              <w:end w:w="100" w:type="dxa"/>
             </w:tcMar>
           </w:tcPr>
           <w:p>
+            <w:pPr>
+              <w:spacing w:after="0"/>
+            </w:pPr>
             <w:r>
+              <w:rPr>
+                <w:rFonts w:ascii="Arial" w:hAnsi="Arial"/>
+                <w:sz w:val="16"/>
+              </w:rPr>
               <w:t>scripts/run_scu_stress_test.py; outputs/reviewer_v2_experiments</w:t>
             </w:r>
           </w:p>
         </w:tc>
         <w:tc>
           <w:tcPr>
-            <w:tcW w:type="dxa" w:w="1944"/>
+            <w:tcW w:type="dxa" w:w="1440"/>
             <w:vAlign w:val="center"/>
             <w:tcMar>
               <w:top w:w="80" w:type="dxa"/>
-              <w:start w:w="120" w:type="dxa"/>
+              <w:start w:w="100" w:type="dxa"/>
               <w:bottom w:w="80" w:type="dxa"/>
-              <w:end w:w="120" w:type="dxa"/>
+              <w:end w:w="100" w:type="dxa"/>
             </w:tcMar>
           </w:tcPr>
           <w:p>
+            <w:pPr>
+              <w:spacing w:after="0"/>
+            </w:pPr>
             <w:r>
+              <w:rPr>
+                <w:rFonts w:ascii="Arial" w:hAnsi="Arial"/>
+                <w:sz w:val="16"/>
+              </w:rPr>
               <w:t>mechanism ablation</w:t>
             </w:r>
           </w:p>
         </w:tc>
         <w:tc>
           <w:tcPr>
-            <w:tcW w:type="dxa" w:w="2736"/>
+            <w:tcW w:type="dxa" w:w="3240"/>
             <w:vAlign w:val="center"/>
             <w:tcMar>
               <w:top w:w="80" w:type="dxa"/>
-              <w:start w:w="120" w:type="dxa"/>
+              <w:start w:w="100" w:type="dxa"/>
               <w:bottom w:w="80" w:type="dxa"/>
-              <w:end w:w="120" w:type="dxa"/>
+              <w:end w:w="100" w:type="dxa"/>
             </w:tcMar>
           </w:tcPr>
           <w:p>
+            <w:pPr>
+              <w:spacing w:after="0"/>
+            </w:pPr>
             <w:r>
+              <w:rPr>
+                <w:rFonts w:ascii="Arial" w:hAnsi="Arial"/>
+                <w:sz w:val="16"/>
+              </w:rPr>
               <w:t>QP behavior under designed structural conflict</w:t>
             </w:r>
           </w:p>
@@ -267,68 +345,96 @@
       <w:tr>
         <w:tc>
           <w:tcPr>
-            <w:tcW w:type="dxa" w:w="2088"/>
+            <w:tcW w:type="dxa" w:w="1944"/>
             <w:vAlign w:val="center"/>
             <w:tcMar>
               <w:top w:w="80" w:type="dxa"/>
-              <w:start w:w="120" w:type="dxa"/>
+              <w:start w:w="100" w:type="dxa"/>
               <w:bottom w:w="80" w:type="dxa"/>
-              <w:end w:w="120" w:type="dxa"/>
+              <w:end w:w="100" w:type="dxa"/>
             </w:tcMar>
           </w:tcPr>
           <w:p>
+            <w:pPr>
+              <w:spacing w:after="0"/>
+            </w:pPr>
             <w:r>
+              <w:rPr>
+                <w:rFonts w:ascii="Arial" w:hAnsi="Arial"/>
+                <w:sz w:val="16"/>
+              </w:rPr>
               <w:t>PRM800K locked split</w:t>
             </w:r>
           </w:p>
         </w:tc>
         <w:tc>
           <w:tcPr>
-            <w:tcW w:type="dxa" w:w="2592"/>
+            <w:tcW w:type="dxa" w:w="2664"/>
             <w:vAlign w:val="center"/>
             <w:tcMar>
               <w:top w:w="80" w:type="dxa"/>
-              <w:start w:w="120" w:type="dxa"/>
+              <w:start w:w="100" w:type="dxa"/>
               <w:bottom w:w="80" w:type="dxa"/>
-              <w:end w:w="120" w:type="dxa"/>
+              <w:end w:w="100" w:type="dxa"/>
             </w:tcMar>
           </w:tcPr>
           <w:p>
+            <w:pPr>
+              <w:spacing w:after="0"/>
+            </w:pPr>
             <w:r>
+              <w:rPr>
+                <w:rFonts w:ascii="Arial" w:hAnsi="Arial"/>
+                <w:sz w:val="16"/>
+              </w:rPr>
               <w:t>outputs/real_task_v3_6_prm800k_hash; v3.8 PRM context</w:t>
             </w:r>
           </w:p>
         </w:tc>
         <w:tc>
           <w:tcPr>
-            <w:tcW w:type="dxa" w:w="1944"/>
+            <w:tcW w:type="dxa" w:w="1440"/>
             <w:vAlign w:val="center"/>
             <w:tcMar>
               <w:top w:w="80" w:type="dxa"/>
-              <w:start w:w="120" w:type="dxa"/>
+              <w:start w:w="100" w:type="dxa"/>
               <w:bottom w:w="80" w:type="dxa"/>
-              <w:end w:w="120" w:type="dxa"/>
+              <w:end w:w="100" w:type="dxa"/>
             </w:tcMar>
           </w:tcPr>
           <w:p>
+            <w:pPr>
+              <w:spacing w:after="0"/>
+            </w:pPr>
             <w:r>
+              <w:rPr>
+                <w:rFonts w:ascii="Arial" w:hAnsi="Arial"/>
+                <w:sz w:val="16"/>
+              </w:rPr>
               <w:t>positive within boundary</w:t>
             </w:r>
           </w:p>
         </w:tc>
         <w:tc>
           <w:tcPr>
-            <w:tcW w:type="dxa" w:w="2736"/>
+            <w:tcW w:type="dxa" w:w="3240"/>
             <w:vAlign w:val="center"/>
             <w:tcMar>
               <w:top w:w="80" w:type="dxa"/>
-              <w:start w:w="120" w:type="dxa"/>
+              <w:start w:w="100" w:type="dxa"/>
               <w:bottom w:w="80" w:type="dxa"/>
-              <w:end w:w="120" w:type="dxa"/>
+              <w:end w:w="100" w:type="dxa"/>
             </w:tcMar>
           </w:tcPr>
           <w:p>
+            <w:pPr>
+              <w:spacing w:after="0"/>
+            </w:pPr>
             <w:r>
+              <w:rPr>
+                <w:rFonts w:ascii="Arial" w:hAnsi="Arial"/>
+                <w:sz w:val="16"/>
+              </w:rPr>
               <w:t>real step-label ranking and PRM800K-like audit prioritization only</w:t>
             </w:r>
           </w:p>
@@ -337,68 +443,292 @@
       <w:tr>
         <w:tc>
           <w:tcPr>
-            <w:tcW w:type="dxa" w:w="2088"/>
+            <w:tcW w:type="dxa" w:w="1944"/>
             <w:vAlign w:val="center"/>
             <w:tcMar>
               <w:top w:w="80" w:type="dxa"/>
-              <w:start w:w="120" w:type="dxa"/>
+              <w:start w:w="100" w:type="dxa"/>
               <w:bottom w:w="80" w:type="dxa"/>
-              <w:end w:w="120" w:type="dxa"/>
+              <w:end w:w="100" w:type="dxa"/>
             </w:tcMar>
           </w:tcPr>
           <w:p>
+            <w:pPr>
+              <w:spacing w:after="0"/>
+            </w:pPr>
             <w:r>
+              <w:rPr>
+                <w:rFonts w:ascii="Arial" w:hAnsi="Arial"/>
+                <w:sz w:val="16"/>
+              </w:rPr>
+              <w:t>Oracle auto audit-target validation</w:t>
+            </w:r>
+          </w:p>
+        </w:tc>
+        <w:tc>
+          <w:tcPr>
+            <w:tcW w:type="dxa" w:w="2664"/>
+            <w:vAlign w:val="center"/>
+            <w:tcMar>
+              <w:top w:w="80" w:type="dxa"/>
+              <w:start w:w="100" w:type="dxa"/>
+              <w:bottom w:w="80" w:type="dxa"/>
+              <w:end w:w="100" w:type="dxa"/>
+            </w:tcMar>
+          </w:tcPr>
+          <w:p>
+            <w:pPr>
+              <w:spacing w:after="0"/>
+            </w:pPr>
+            <w:r>
+              <w:rPr>
+                <w:rFonts w:ascii="Arial" w:hAnsi="Arial"/>
+                <w:sz w:val="16"/>
+              </w:rPr>
+              <w:t>outputs/kbs_audit_card_auto_validation_v1</w:t>
+            </w:r>
+          </w:p>
+        </w:tc>
+        <w:tc>
+          <w:tcPr>
+            <w:tcW w:type="dxa" w:w="1440"/>
+            <w:vAlign w:val="center"/>
+            <w:tcMar>
+              <w:top w:w="80" w:type="dxa"/>
+              <w:start w:w="100" w:type="dxa"/>
+              <w:bottom w:w="80" w:type="dxa"/>
+              <w:end w:w="100" w:type="dxa"/>
+            </w:tcMar>
+          </w:tcPr>
+          <w:p>
+            <w:pPr>
+              <w:spacing w:after="0"/>
+            </w:pPr>
+            <w:r>
+              <w:rPr>
+                <w:rFonts w:ascii="Arial" w:hAnsi="Arial"/>
+                <w:sz w:val="16"/>
+              </w:rPr>
+              <w:t>zero-human validation</w:t>
+            </w:r>
+          </w:p>
+        </w:tc>
+        <w:tc>
+          <w:tcPr>
+            <w:tcW w:type="dxa" w:w="3240"/>
+            <w:vAlign w:val="center"/>
+            <w:tcMar>
+              <w:top w:w="80" w:type="dxa"/>
+              <w:start w:w="100" w:type="dxa"/>
+              <w:bottom w:w="80" w:type="dxa"/>
+              <w:end w:w="100" w:type="dxa"/>
+            </w:tcMar>
+          </w:tcPr>
+          <w:p>
+            <w:pPr>
+              <w:spacing w:after="0"/>
+            </w:pPr>
+            <w:r>
+              <w:rPr>
+                <w:rFonts w:ascii="Arial" w:hAnsi="Arial"/>
+                <w:sz w:val="16"/>
+              </w:rPr>
+              <w:t>automatic failure-mode localization and decomposition information gain</w:t>
+            </w:r>
+          </w:p>
+        </w:tc>
+      </w:tr>
+      <w:tr>
+        <w:tc>
+          <w:tcPr>
+            <w:tcW w:type="dxa" w:w="1944"/>
+            <w:vAlign w:val="center"/>
+            <w:tcMar>
+              <w:top w:w="80" w:type="dxa"/>
+              <w:start w:w="100" w:type="dxa"/>
+              <w:bottom w:w="80" w:type="dxa"/>
+              <w:end w:w="100" w:type="dxa"/>
+            </w:tcMar>
+          </w:tcPr>
+          <w:p>
+            <w:pPr>
+              <w:spacing w:after="0"/>
+            </w:pPr>
+            <w:r>
+              <w:rPr>
+                <w:rFonts w:ascii="Arial" w:hAnsi="Arial"/>
+                <w:sz w:val="16"/>
+              </w:rPr>
+              <w:t>Embedding graph-construction ablation</w:t>
+            </w:r>
+          </w:p>
+        </w:tc>
+        <w:tc>
+          <w:tcPr>
+            <w:tcW w:type="dxa" w:w="2664"/>
+            <w:vAlign w:val="center"/>
+            <w:tcMar>
+              <w:top w:w="80" w:type="dxa"/>
+              <w:start w:w="100" w:type="dxa"/>
+              <w:bottom w:w="80" w:type="dxa"/>
+              <w:end w:w="100" w:type="dxa"/>
+            </w:tcMar>
+          </w:tcPr>
+          <w:p>
+            <w:pPr>
+              <w:spacing w:after="0"/>
+            </w:pPr>
+            <w:r>
+              <w:rPr>
+                <w:rFonts w:ascii="Arial" w:hAnsi="Arial"/>
+                <w:sz w:val="16"/>
+              </w:rPr>
+              <w:t>outputs/reviewer_v2_experiments/graph_construction_ablation</w:t>
+            </w:r>
+          </w:p>
+        </w:tc>
+        <w:tc>
+          <w:tcPr>
+            <w:tcW w:type="dxa" w:w="1440"/>
+            <w:vAlign w:val="center"/>
+            <w:tcMar>
+              <w:top w:w="80" w:type="dxa"/>
+              <w:start w:w="100" w:type="dxa"/>
+              <w:bottom w:w="80" w:type="dxa"/>
+              <w:end w:w="100" w:type="dxa"/>
+            </w:tcMar>
+          </w:tcPr>
+          <w:p>
+            <w:pPr>
+              <w:spacing w:after="0"/>
+            </w:pPr>
+            <w:r>
+              <w:rPr>
+                <w:rFonts w:ascii="Arial" w:hAnsi="Arial"/>
+                <w:sz w:val="16"/>
+              </w:rPr>
+              <w:t>graph-interface ablation</w:t>
+            </w:r>
+          </w:p>
+        </w:tc>
+        <w:tc>
+          <w:tcPr>
+            <w:tcW w:type="dxa" w:w="3240"/>
+            <w:vAlign w:val="center"/>
+            <w:tcMar>
+              <w:top w:w="80" w:type="dxa"/>
+              <w:start w:w="100" w:type="dxa"/>
+              <w:bottom w:w="80" w:type="dxa"/>
+              <w:end w:w="100" w:type="dxa"/>
+            </w:tcMar>
+          </w:tcPr>
+          <w:p>
+            <w:pPr>
+              <w:spacing w:after="0"/>
+            </w:pPr>
+            <w:r>
+              <w:rPr>
+                <w:rFonts w:ascii="Arial" w:hAnsi="Arial"/>
+                <w:sz w:val="16"/>
+              </w:rPr>
+              <w:t>TF-IDF is replaceable by semantic embeddings without changing SCU</w:t>
+            </w:r>
+          </w:p>
+        </w:tc>
+      </w:tr>
+      <w:tr>
+        <w:tc>
+          <w:tcPr>
+            <w:tcW w:type="dxa" w:w="1944"/>
+            <w:vAlign w:val="center"/>
+            <w:tcMar>
+              <w:top w:w="80" w:type="dxa"/>
+              <w:start w:w="100" w:type="dxa"/>
+              <w:bottom w:w="80" w:type="dxa"/>
+              <w:end w:w="100" w:type="dxa"/>
+            </w:tcMar>
+          </w:tcPr>
+          <w:p>
+            <w:pPr>
+              <w:spacing w:after="0"/>
+            </w:pPr>
+            <w:r>
+              <w:rPr>
+                <w:rFonts w:ascii="Arial" w:hAnsi="Arial"/>
+                <w:sz w:val="16"/>
+              </w:rPr>
               <w:t>MuSiQue decomposition route</w:t>
             </w:r>
           </w:p>
         </w:tc>
         <w:tc>
           <w:tcPr>
-            <w:tcW w:type="dxa" w:w="2592"/>
+            <w:tcW w:type="dxa" w:w="2664"/>
             <w:vAlign w:val="center"/>
             <w:tcMar>
               <w:top w:w="80" w:type="dxa"/>
-              <w:start w:w="120" w:type="dxa"/>
+              <w:start w:w="100" w:type="dxa"/>
               <w:bottom w:w="80" w:type="dxa"/>
-              <w:end w:w="120" w:type="dxa"/>
+              <w:end w:w="100" w:type="dxa"/>
             </w:tcMar>
           </w:tcPr>
           <w:p>
+            <w:pPr>
+              <w:spacing w:after="0"/>
+            </w:pPr>
             <w:r>
+              <w:rPr>
+                <w:rFonts w:ascii="Arial" w:hAnsi="Arial"/>
+                <w:sz w:val="16"/>
+              </w:rPr>
               <w:t>outputs/kbs_real_audit_v1</w:t>
             </w:r>
           </w:p>
         </w:tc>
         <w:tc>
           <w:tcPr>
-            <w:tcW w:type="dxa" w:w="1944"/>
+            <w:tcW w:type="dxa" w:w="1440"/>
             <w:vAlign w:val="center"/>
             <w:tcMar>
               <w:top w:w="80" w:type="dxa"/>
-              <w:start w:w="120" w:type="dxa"/>
+              <w:start w:w="100" w:type="dxa"/>
               <w:bottom w:w="80" w:type="dxa"/>
-              <w:end w:w="120" w:type="dxa"/>
+              <w:end w:w="100" w:type="dxa"/>
             </w:tcMar>
           </w:tcPr>
           <w:p>
+            <w:pPr>
+              <w:spacing w:after="0"/>
+            </w:pPr>
             <w:r>
+              <w:rPr>
+                <w:rFonts w:ascii="Arial" w:hAnsi="Arial"/>
+                <w:sz w:val="16"/>
+              </w:rPr>
               <w:t>feasibility only</w:t>
             </w:r>
           </w:p>
         </w:tc>
         <w:tc>
           <w:tcPr>
-            <w:tcW w:type="dxa" w:w="2736"/>
+            <w:tcW w:type="dxa" w:w="3240"/>
             <w:vAlign w:val="center"/>
             <w:tcMar>
               <w:top w:w="80" w:type="dxa"/>
-              <w:start w:w="120" w:type="dxa"/>
+              <w:start w:w="100" w:type="dxa"/>
               <w:bottom w:w="80" w:type="dxa"/>
-              <w:end w:w="120" w:type="dxa"/>
+              <w:end w:w="100" w:type="dxa"/>
             </w:tcMar>
           </w:tcPr>
           <w:p>
+            <w:pPr>
+              <w:spacing w:after="0"/>
+            </w:pPr>
             <w:r>
+              <w:rPr>
+                <w:rFonts w:ascii="Arial" w:hAnsi="Arial"/>
+                <w:sz w:val="16"/>
+              </w:rPr>
               <w:t>constructed-label pipeline demonstration; no independent audit evidence</w:t>
             </w:r>
           </w:p>
@@ -407,68 +737,96 @@
       <w:tr>
         <w:tc>
           <w:tcPr>
-            <w:tcW w:type="dxa" w:w="2088"/>
+            <w:tcW w:type="dxa" w:w="1944"/>
             <w:vAlign w:val="center"/>
             <w:tcMar>
               <w:top w:w="80" w:type="dxa"/>
-              <w:start w:w="120" w:type="dxa"/>
+              <w:start w:w="100" w:type="dxa"/>
               <w:bottom w:w="80" w:type="dxa"/>
-              <w:end w:w="120" w:type="dxa"/>
+              <w:end w:w="100" w:type="dxa"/>
             </w:tcMar>
           </w:tcPr>
           <w:p>
+            <w:pPr>
+              <w:spacing w:after="0"/>
+            </w:pPr>
             <w:r>
+              <w:rPr>
+                <w:rFonts w:ascii="Arial" w:hAnsi="Arial"/>
+                <w:sz w:val="16"/>
+              </w:rPr>
               <w:t>WebQSP fixed-schema route</w:t>
             </w:r>
           </w:p>
         </w:tc>
         <w:tc>
           <w:tcPr>
-            <w:tcW w:type="dxa" w:w="2592"/>
+            <w:tcW w:type="dxa" w:w="2664"/>
             <w:vAlign w:val="center"/>
             <w:tcMar>
               <w:top w:w="80" w:type="dxa"/>
-              <w:start w:w="120" w:type="dxa"/>
+              <w:start w:w="100" w:type="dxa"/>
               <w:bottom w:w="80" w:type="dxa"/>
-              <w:end w:w="120" w:type="dxa"/>
+              <w:end w:w="100" w:type="dxa"/>
             </w:tcMar>
           </w:tcPr>
           <w:p>
+            <w:pPr>
+              <w:spacing w:after="0"/>
+            </w:pPr>
             <w:r>
+              <w:rPr>
+                <w:rFonts w:ascii="Arial" w:hAnsi="Arial"/>
+                <w:sz w:val="16"/>
+              </w:rPr>
               <w:t>outputs/webqsp_trace_audit_v1_train/test</w:t>
             </w:r>
           </w:p>
         </w:tc>
         <w:tc>
           <w:tcPr>
-            <w:tcW w:type="dxa" w:w="1944"/>
+            <w:tcW w:type="dxa" w:w="1440"/>
             <w:vAlign w:val="center"/>
             <w:tcMar>
               <w:top w:w="80" w:type="dxa"/>
-              <w:start w:w="120" w:type="dxa"/>
+              <w:start w:w="100" w:type="dxa"/>
               <w:bottom w:w="80" w:type="dxa"/>
-              <w:end w:w="120" w:type="dxa"/>
+              <w:end w:w="100" w:type="dxa"/>
             </w:tcMar>
           </w:tcPr>
           <w:p>
+            <w:pPr>
+              <w:spacing w:after="0"/>
+            </w:pPr>
             <w:r>
+              <w:rPr>
+                <w:rFonts w:ascii="Arial" w:hAnsi="Arial"/>
+                <w:sz w:val="16"/>
+              </w:rPr>
               <w:t>diagnostic only</w:t>
             </w:r>
           </w:p>
         </w:tc>
         <w:tc>
           <w:tcPr>
-            <w:tcW w:type="dxa" w:w="2736"/>
+            <w:tcW w:type="dxa" w:w="3240"/>
             <w:vAlign w:val="center"/>
             <w:tcMar>
               <w:top w:w="80" w:type="dxa"/>
-              <w:start w:w="120" w:type="dxa"/>
+              <w:start w:w="100" w:type="dxa"/>
               <w:bottom w:w="80" w:type="dxa"/>
-              <w:end w:w="120" w:type="dxa"/>
+              <w:end w:w="100" w:type="dxa"/>
             </w:tcMar>
           </w:tcPr>
           <w:p>
+            <w:pPr>
+              <w:spacing w:after="0"/>
+            </w:pPr>
             <w:r>
+              <w:rPr>
+                <w:rFonts w:ascii="Arial" w:hAnsi="Arial"/>
+                <w:sz w:val="16"/>
+              </w:rPr>
               <w:t>separability and metric-artifact diagnostic, not KGQA performance</w:t>
             </w:r>
           </w:p>
@@ -477,68 +835,96 @@
       <w:tr>
         <w:tc>
           <w:tcPr>
-            <w:tcW w:type="dxa" w:w="2088"/>
+            <w:tcW w:type="dxa" w:w="1944"/>
             <w:vAlign w:val="center"/>
             <w:tcMar>
               <w:top w:w="80" w:type="dxa"/>
-              <w:start w:w="120" w:type="dxa"/>
+              <w:start w:w="100" w:type="dxa"/>
               <w:bottom w:w="80" w:type="dxa"/>
-              <w:end w:w="120" w:type="dxa"/>
+              <w:end w:w="100" w:type="dxa"/>
             </w:tcMar>
           </w:tcPr>
           <w:p>
+            <w:pPr>
+              <w:spacing w:after="0"/>
+            </w:pPr>
             <w:r>
+              <w:rPr>
+                <w:rFonts w:ascii="Arial" w:hAnsi="Arial"/>
+                <w:sz w:val="16"/>
+              </w:rPr>
               <w:t>Countries-KG pilot</w:t>
             </w:r>
           </w:p>
         </w:tc>
         <w:tc>
           <w:tcPr>
-            <w:tcW w:type="dxa" w:w="2592"/>
+            <w:tcW w:type="dxa" w:w="2664"/>
             <w:vAlign w:val="center"/>
             <w:tcMar>
               <w:top w:w="80" w:type="dxa"/>
-              <w:start w:w="120" w:type="dxa"/>
+              <w:start w:w="100" w:type="dxa"/>
               <w:bottom w:w="80" w:type="dxa"/>
-              <w:end w:w="120" w:type="dxa"/>
+              <w:end w:w="100" w:type="dxa"/>
             </w:tcMar>
           </w:tcPr>
           <w:p>
+            <w:pPr>
+              <w:spacing w:after="0"/>
+            </w:pPr>
             <w:r>
+              <w:rPr>
+                <w:rFonts w:ascii="Arial" w:hAnsi="Arial"/>
+                <w:sz w:val="16"/>
+              </w:rPr>
               <w:t>outputs/kbs_ontology_edge_pilot/kg_pilot_report.json</w:t>
             </w:r>
           </w:p>
         </w:tc>
         <w:tc>
           <w:tcPr>
-            <w:tcW w:type="dxa" w:w="1944"/>
+            <w:tcW w:type="dxa" w:w="1440"/>
             <w:vAlign w:val="center"/>
             <w:tcMar>
               <w:top w:w="80" w:type="dxa"/>
-              <w:start w:w="120" w:type="dxa"/>
+              <w:start w:w="100" w:type="dxa"/>
               <w:bottom w:w="80" w:type="dxa"/>
-              <w:end w:w="120" w:type="dxa"/>
+              <w:end w:w="100" w:type="dxa"/>
             </w:tcMar>
           </w:tcPr>
           <w:p>
+            <w:pPr>
+              <w:spacing w:after="0"/>
+            </w:pPr>
             <w:r>
+              <w:rPr>
+                <w:rFonts w:ascii="Arial" w:hAnsi="Arial"/>
+                <w:sz w:val="16"/>
+              </w:rPr>
               <w:t>pilot diagnostic</w:t>
             </w:r>
           </w:p>
         </w:tc>
         <w:tc>
           <w:tcPr>
-            <w:tcW w:type="dxa" w:w="2736"/>
+            <w:tcW w:type="dxa" w:w="3240"/>
             <w:vAlign w:val="center"/>
             <w:tcMar>
               <w:top w:w="80" w:type="dxa"/>
-              <w:start w:w="120" w:type="dxa"/>
+              <w:start w:w="100" w:type="dxa"/>
               <w:bottom w:w="80" w:type="dxa"/>
-              <w:end w:w="120" w:type="dxa"/>
+              <w:end w:w="100" w:type="dxa"/>
             </w:tcMar>
           </w:tcPr>
           <w:p>
+            <w:pPr>
+              <w:spacing w:after="0"/>
+            </w:pPr>
             <w:r>
+              <w:rPr>
+                <w:rFonts w:ascii="Arial" w:hAnsi="Arial"/>
+                <w:sz w:val="16"/>
+              </w:rPr>
               <w:t>typed ontology edges can change structural diagnostics; validated_kbs_workflow=false</w:t>
             </w:r>
           </w:p>
@@ -552,16 +938,1287 @@
       </w:pPr>
       <w:r>
         <w:rPr>
-          <w:color w:val="2E74B5"/>
+          <w:rFonts w:ascii="Arial" w:hAnsi="Arial"/>
+          <w:color w:val="1F4E79"/>
+        </w:rPr>
+        <w:t>Oracle Auto Audit-Target Validation</w:t>
+      </w:r>
+    </w:p>
+    <w:p>
+      <w:pPr>
+        <w:spacing w:after="120" w:line="259" w:lineRule="auto"/>
+      </w:pPr>
+      <w:r>
+        <w:rPr>
+          <w:rFonts w:ascii="Arial" w:hAnsi="Arial"/>
+          <w:sz w:val="19"/>
+        </w:rPr>
+        <w:t>Failure-mode localization is evaluated as an information-retrieval task over traces. The scalar condition uses only the w_struct score, while the SC-FMA condition uses fidelity, structural necessity, redundancy, bottleneck status, and recommended action fields. Oracle targets are rule-derived from PRM800K labels, ranking disagreement, redundancy density, bottleneck flags, and the existing failure taxonomy; they are not human adjudications.</w:t>
+      </w:r>
+    </w:p>
+    <w:tbl>
+      <w:tblPr>
+        <w:tblStyle w:val="TableGrid"/>
+        <w:tblW w:type="auto" w:w="0"/>
+        <w:jc w:val="center"/>
+        <w:tblLayout w:type="fixed"/>
+        <w:tblLook w:firstColumn="1" w:firstRow="1" w:lastColumn="0" w:lastRow="0" w:noHBand="0" w:noVBand="1" w:val="04A0"/>
+      </w:tblPr>
+      <w:tblGrid>
+        <w:gridCol w:w="1680"/>
+        <w:gridCol w:w="1680"/>
+        <w:gridCol w:w="1680"/>
+        <w:gridCol w:w="1680"/>
+        <w:gridCol w:w="1680"/>
+        <w:gridCol w:w="1680"/>
+      </w:tblGrid>
+      <w:tr>
+        <w:tc>
+          <w:tcPr>
+            <w:tcW w:type="dxa" w:w="2376"/>
+            <w:shd w:fill="D9EAF7"/>
+            <w:vAlign w:val="center"/>
+            <w:tcMar>
+              <w:top w:w="80" w:type="dxa"/>
+              <w:start w:w="100" w:type="dxa"/>
+              <w:bottom w:w="80" w:type="dxa"/>
+              <w:end w:w="100" w:type="dxa"/>
+            </w:tcMar>
+          </w:tcPr>
+          <w:p>
+            <w:r>
+              <w:rPr>
+                <w:rFonts w:ascii="Arial" w:hAnsi="Arial"/>
+                <w:b/>
+                <w:sz w:val="17"/>
+              </w:rPr>
+              <w:t>View</w:t>
+            </w:r>
+          </w:p>
+        </w:tc>
+        <w:tc>
+          <w:tcPr>
+            <w:tcW w:type="dxa" w:w="1224"/>
+            <w:shd w:fill="D9EAF7"/>
+            <w:vAlign w:val="center"/>
+            <w:tcMar>
+              <w:top w:w="80" w:type="dxa"/>
+              <w:start w:w="100" w:type="dxa"/>
+              <w:bottom w:w="80" w:type="dxa"/>
+              <w:end w:w="100" w:type="dxa"/>
+            </w:tcMar>
+          </w:tcPr>
+          <w:p>
+            <w:r>
+              <w:rPr>
+                <w:rFonts w:ascii="Arial" w:hAnsi="Arial"/>
+                <w:b/>
+                <w:sz w:val="17"/>
+              </w:rPr>
+              <w:t>Recall@25%</w:t>
+            </w:r>
+          </w:p>
+        </w:tc>
+        <w:tc>
+          <w:tcPr>
+            <w:tcW w:type="dxa" w:w="1224"/>
+            <w:shd w:fill="D9EAF7"/>
+            <w:vAlign w:val="center"/>
+            <w:tcMar>
+              <w:top w:w="80" w:type="dxa"/>
+              <w:start w:w="100" w:type="dxa"/>
+              <w:bottom w:w="80" w:type="dxa"/>
+              <w:end w:w="100" w:type="dxa"/>
+            </w:tcMar>
+          </w:tcPr>
+          <w:p>
+            <w:r>
+              <w:rPr>
+                <w:rFonts w:ascii="Arial" w:hAnsi="Arial"/>
+                <w:b/>
+                <w:sz w:val="17"/>
+              </w:rPr>
+              <w:t>NDCG@25%</w:t>
+            </w:r>
+          </w:p>
+        </w:tc>
+        <w:tc>
+          <w:tcPr>
+            <w:tcW w:type="dxa" w:w="936"/>
+            <w:shd w:fill="D9EAF7"/>
+            <w:vAlign w:val="center"/>
+            <w:tcMar>
+              <w:top w:w="80" w:type="dxa"/>
+              <w:start w:w="100" w:type="dxa"/>
+              <w:bottom w:w="80" w:type="dxa"/>
+              <w:end w:w="100" w:type="dxa"/>
+            </w:tcMar>
+          </w:tcPr>
+          <w:p>
+            <w:r>
+              <w:rPr>
+                <w:rFonts w:ascii="Arial" w:hAnsi="Arial"/>
+                <w:b/>
+                <w:sz w:val="17"/>
+              </w:rPr>
+              <w:t>MRR</w:t>
+            </w:r>
+          </w:p>
+        </w:tc>
+        <w:tc>
+          <w:tcPr>
+            <w:tcW w:type="dxa" w:w="1080"/>
+            <w:shd w:fill="D9EAF7"/>
+            <w:vAlign w:val="center"/>
+            <w:tcMar>
+              <w:top w:w="80" w:type="dxa"/>
+              <w:start w:w="100" w:type="dxa"/>
+              <w:bottom w:w="80" w:type="dxa"/>
+              <w:end w:w="100" w:type="dxa"/>
+            </w:tcMar>
+          </w:tcPr>
+          <w:p>
+            <w:r>
+              <w:rPr>
+                <w:rFonts w:ascii="Arial" w:hAnsi="Arial"/>
+                <w:b/>
+                <w:sz w:val="17"/>
+              </w:rPr>
+              <w:t>Top-1 hit</w:t>
+            </w:r>
+          </w:p>
+        </w:tc>
+        <w:tc>
+          <w:tcPr>
+            <w:tcW w:type="dxa" w:w="1152"/>
+            <w:shd w:fill="D9EAF7"/>
+            <w:vAlign w:val="center"/>
+            <w:tcMar>
+              <w:top w:w="80" w:type="dxa"/>
+              <w:start w:w="100" w:type="dxa"/>
+              <w:bottom w:w="80" w:type="dxa"/>
+              <w:end w:w="100" w:type="dxa"/>
+            </w:tcMar>
+          </w:tcPr>
+          <w:p>
+            <w:r>
+              <w:rPr>
+                <w:rFonts w:ascii="Arial" w:hAnsi="Arial"/>
+                <w:b/>
+                <w:sz w:val="17"/>
+              </w:rPr>
+              <w:t>Cost proxy</w:t>
+            </w:r>
+          </w:p>
+        </w:tc>
+      </w:tr>
+      <w:tr>
+        <w:tc>
+          <w:tcPr>
+            <w:tcW w:type="dxa" w:w="2376"/>
+            <w:vAlign w:val="center"/>
+            <w:tcMar>
+              <w:top w:w="80" w:type="dxa"/>
+              <w:start w:w="100" w:type="dxa"/>
+              <w:bottom w:w="80" w:type="dxa"/>
+              <w:end w:w="100" w:type="dxa"/>
+            </w:tcMar>
+          </w:tcPr>
+          <w:p>
+            <w:pPr>
+              <w:spacing w:after="0"/>
+            </w:pPr>
+            <w:r>
+              <w:rPr>
+                <w:rFonts w:ascii="Arial" w:hAnsi="Arial"/>
+                <w:sz w:val="16"/>
+              </w:rPr>
+              <w:t>w_struct scalar only</w:t>
+            </w:r>
+          </w:p>
+        </w:tc>
+        <w:tc>
+          <w:tcPr>
+            <w:tcW w:type="dxa" w:w="1224"/>
+            <w:vAlign w:val="center"/>
+            <w:tcMar>
+              <w:top w:w="80" w:type="dxa"/>
+              <w:start w:w="100" w:type="dxa"/>
+              <w:bottom w:w="80" w:type="dxa"/>
+              <w:end w:w="100" w:type="dxa"/>
+            </w:tcMar>
+          </w:tcPr>
+          <w:p>
+            <w:pPr>
+              <w:spacing w:after="0"/>
+            </w:pPr>
+            <w:r>
+              <w:rPr>
+                <w:rFonts w:ascii="Arial" w:hAnsi="Arial"/>
+                <w:sz w:val="16"/>
+              </w:rPr>
+              <w:t>0.235</w:t>
+            </w:r>
+          </w:p>
+        </w:tc>
+        <w:tc>
+          <w:tcPr>
+            <w:tcW w:type="dxa" w:w="1224"/>
+            <w:vAlign w:val="center"/>
+            <w:tcMar>
+              <w:top w:w="80" w:type="dxa"/>
+              <w:start w:w="100" w:type="dxa"/>
+              <w:bottom w:w="80" w:type="dxa"/>
+              <w:end w:w="100" w:type="dxa"/>
+            </w:tcMar>
+          </w:tcPr>
+          <w:p>
+            <w:pPr>
+              <w:spacing w:after="0"/>
+            </w:pPr>
+            <w:r>
+              <w:rPr>
+                <w:rFonts w:ascii="Arial" w:hAnsi="Arial"/>
+                <w:sz w:val="16"/>
+              </w:rPr>
+              <w:t>0.353</w:t>
+            </w:r>
+          </w:p>
+        </w:tc>
+        <w:tc>
+          <w:tcPr>
+            <w:tcW w:type="dxa" w:w="936"/>
+            <w:vAlign w:val="center"/>
+            <w:tcMar>
+              <w:top w:w="80" w:type="dxa"/>
+              <w:start w:w="100" w:type="dxa"/>
+              <w:bottom w:w="80" w:type="dxa"/>
+              <w:end w:w="100" w:type="dxa"/>
+            </w:tcMar>
+          </w:tcPr>
+          <w:p>
+            <w:pPr>
+              <w:spacing w:after="0"/>
+            </w:pPr>
+            <w:r>
+              <w:rPr>
+                <w:rFonts w:ascii="Arial" w:hAnsi="Arial"/>
+                <w:sz w:val="16"/>
+              </w:rPr>
+              <w:t>0.354</w:t>
+            </w:r>
+          </w:p>
+        </w:tc>
+        <w:tc>
+          <w:tcPr>
+            <w:tcW w:type="dxa" w:w="1080"/>
+            <w:vAlign w:val="center"/>
+            <w:tcMar>
+              <w:top w:w="80" w:type="dxa"/>
+              <w:start w:w="100" w:type="dxa"/>
+              <w:bottom w:w="80" w:type="dxa"/>
+              <w:end w:w="100" w:type="dxa"/>
+            </w:tcMar>
+          </w:tcPr>
+          <w:p>
+            <w:pPr>
+              <w:spacing w:after="0"/>
+            </w:pPr>
+            <w:r>
+              <w:rPr>
+                <w:rFonts w:ascii="Arial" w:hAnsi="Arial"/>
+                <w:sz w:val="16"/>
+              </w:rPr>
+              <w:t>0.000</w:t>
+            </w:r>
+          </w:p>
+        </w:tc>
+        <w:tc>
+          <w:tcPr>
+            <w:tcW w:type="dxa" w:w="1152"/>
+            <w:vAlign w:val="center"/>
+            <w:tcMar>
+              <w:top w:w="80" w:type="dxa"/>
+              <w:start w:w="100" w:type="dxa"/>
+              <w:bottom w:w="80" w:type="dxa"/>
+              <w:end w:w="100" w:type="dxa"/>
+            </w:tcMar>
+          </w:tcPr>
+          <w:p>
+            <w:pPr>
+              <w:spacing w:after="0"/>
+            </w:pPr>
+            <w:r>
+              <w:rPr>
+                <w:rFonts w:ascii="Arial" w:hAnsi="Arial"/>
+                <w:sz w:val="16"/>
+              </w:rPr>
+              <w:t>0.0007</w:t>
+            </w:r>
+          </w:p>
+        </w:tc>
+      </w:tr>
+      <w:tr>
+        <w:tc>
+          <w:tcPr>
+            <w:tcW w:type="dxa" w:w="2376"/>
+            <w:vAlign w:val="center"/>
+            <w:tcMar>
+              <w:top w:w="80" w:type="dxa"/>
+              <w:start w:w="100" w:type="dxa"/>
+              <w:bottom w:w="80" w:type="dxa"/>
+              <w:end w:w="100" w:type="dxa"/>
+            </w:tcMar>
+          </w:tcPr>
+          <w:p>
+            <w:pPr>
+              <w:spacing w:after="0"/>
+            </w:pPr>
+            <w:r>
+              <w:rPr>
+                <w:rFonts w:ascii="Arial" w:hAnsi="Arial"/>
+                <w:sz w:val="16"/>
+              </w:rPr>
+              <w:t>SC-FMA decomposition</w:t>
+            </w:r>
+          </w:p>
+        </w:tc>
+        <w:tc>
+          <w:tcPr>
+            <w:tcW w:type="dxa" w:w="1224"/>
+            <w:vAlign w:val="center"/>
+            <w:tcMar>
+              <w:top w:w="80" w:type="dxa"/>
+              <w:start w:w="100" w:type="dxa"/>
+              <w:bottom w:w="80" w:type="dxa"/>
+              <w:end w:w="100" w:type="dxa"/>
+            </w:tcMar>
+          </w:tcPr>
+          <w:p>
+            <w:pPr>
+              <w:spacing w:after="0"/>
+            </w:pPr>
+            <w:r>
+              <w:rPr>
+                <w:rFonts w:ascii="Arial" w:hAnsi="Arial"/>
+                <w:sz w:val="16"/>
+              </w:rPr>
+              <w:t>0.699</w:t>
+            </w:r>
+          </w:p>
+        </w:tc>
+        <w:tc>
+          <w:tcPr>
+            <w:tcW w:type="dxa" w:w="1224"/>
+            <w:vAlign w:val="center"/>
+            <w:tcMar>
+              <w:top w:w="80" w:type="dxa"/>
+              <w:start w:w="100" w:type="dxa"/>
+              <w:bottom w:w="80" w:type="dxa"/>
+              <w:end w:w="100" w:type="dxa"/>
+            </w:tcMar>
+          </w:tcPr>
+          <w:p>
+            <w:pPr>
+              <w:spacing w:after="0"/>
+            </w:pPr>
+            <w:r>
+              <w:rPr>
+                <w:rFonts w:ascii="Arial" w:hAnsi="Arial"/>
+                <w:sz w:val="16"/>
+              </w:rPr>
+              <w:t>0.978</w:t>
+            </w:r>
+          </w:p>
+        </w:tc>
+        <w:tc>
+          <w:tcPr>
+            <w:tcW w:type="dxa" w:w="936"/>
+            <w:vAlign w:val="center"/>
+            <w:tcMar>
+              <w:top w:w="80" w:type="dxa"/>
+              <w:start w:w="100" w:type="dxa"/>
+              <w:bottom w:w="80" w:type="dxa"/>
+              <w:end w:w="100" w:type="dxa"/>
+            </w:tcMar>
+          </w:tcPr>
+          <w:p>
+            <w:pPr>
+              <w:spacing w:after="0"/>
+            </w:pPr>
+            <w:r>
+              <w:rPr>
+                <w:rFonts w:ascii="Arial" w:hAnsi="Arial"/>
+                <w:sz w:val="16"/>
+              </w:rPr>
+              <w:t>1.000</w:t>
+            </w:r>
+          </w:p>
+        </w:tc>
+        <w:tc>
+          <w:tcPr>
+            <w:tcW w:type="dxa" w:w="1080"/>
+            <w:vAlign w:val="center"/>
+            <w:tcMar>
+              <w:top w:w="80" w:type="dxa"/>
+              <w:start w:w="100" w:type="dxa"/>
+              <w:bottom w:w="80" w:type="dxa"/>
+              <w:end w:w="100" w:type="dxa"/>
+            </w:tcMar>
+          </w:tcPr>
+          <w:p>
+            <w:pPr>
+              <w:spacing w:after="0"/>
+            </w:pPr>
+            <w:r>
+              <w:rPr>
+                <w:rFonts w:ascii="Arial" w:hAnsi="Arial"/>
+                <w:sz w:val="16"/>
+              </w:rPr>
+              <w:t>1.000</w:t>
+            </w:r>
+          </w:p>
+        </w:tc>
+        <w:tc>
+          <w:tcPr>
+            <w:tcW w:type="dxa" w:w="1152"/>
+            <w:vAlign w:val="center"/>
+            <w:tcMar>
+              <w:top w:w="80" w:type="dxa"/>
+              <w:start w:w="100" w:type="dxa"/>
+              <w:bottom w:w="80" w:type="dxa"/>
+              <w:end w:w="100" w:type="dxa"/>
+            </w:tcMar>
+          </w:tcPr>
+          <w:p>
+            <w:pPr>
+              <w:spacing w:after="0"/>
+            </w:pPr>
+            <w:r>
+              <w:rPr>
+                <w:rFonts w:ascii="Arial" w:hAnsi="Arial"/>
+                <w:sz w:val="16"/>
+              </w:rPr>
+              <w:t>0.0002</w:t>
+            </w:r>
+          </w:p>
+        </w:tc>
+      </w:tr>
+    </w:tbl>
+    <w:p/>
+    <w:p>
+      <w:pPr>
+        <w:spacing w:after="120" w:line="259" w:lineRule="auto"/>
+      </w:pPr>
+      <w:r>
+        <w:rPr>
+          <w:rFonts w:ascii="Arial" w:hAnsi="Arial"/>
+          <w:sz w:val="19"/>
+        </w:rPr>
+        <w:t>Interpretation: the decomposition fields recover rule-defined audit targets more effectively than the scalar-only view. This is decision-traceability and information-recovery evidence, not human-subject or human-efficiency evidence.</w:t>
+      </w:r>
+    </w:p>
+    <w:p>
+      <w:pPr>
+        <w:pStyle w:val="Heading1"/>
+      </w:pPr>
+      <w:r>
+        <w:rPr>
+          <w:rFonts w:ascii="Arial" w:hAnsi="Arial"/>
+          <w:color w:val="1F4E79"/>
+        </w:rPr>
+        <w:t>Graph Construction and Embedding Ablation</w:t>
+      </w:r>
+    </w:p>
+    <w:p>
+      <w:pPr>
+        <w:spacing w:after="120" w:line="259" w:lineRule="auto"/>
+      </w:pPr>
+      <w:r>
+        <w:rPr>
+          <w:rFonts w:ascii="Arial" w:hAnsi="Arial"/>
+          <w:sz w:val="19"/>
+        </w:rPr>
+        <w:t>The graph-construction ablation compares temporal-only, TF-IDF topical, Jaccard topical, Sentence-BERT embedding topical, and shuffled-topical variants under the same diagnostic protocol. The embedding route uses sentence-transformers/all-MiniLM-L6-v2 through sentence-transformers version 3.4.1 with 384-dimensional vectors. The report records the HuggingFace cache path, download/cache status, runtime status, and graph-constructor metadata.</w:t>
+      </w:r>
+    </w:p>
+    <w:tbl>
+      <w:tblPr>
+        <w:tblStyle w:val="TableGrid"/>
+        <w:tblW w:type="auto" w:w="0"/>
+        <w:jc w:val="center"/>
+        <w:tblLayout w:type="fixed"/>
+        <w:tblLook w:firstColumn="1" w:firstRow="1" w:lastColumn="0" w:lastRow="0" w:noHBand="0" w:noVBand="1" w:val="04A0"/>
+      </w:tblPr>
+      <w:tblGrid>
+        <w:gridCol w:w="2016"/>
+        <w:gridCol w:w="2016"/>
+        <w:gridCol w:w="2016"/>
+        <w:gridCol w:w="2016"/>
+        <w:gridCol w:w="2016"/>
+      </w:tblGrid>
+      <w:tr>
+        <w:tc>
+          <w:tcPr>
+            <w:tcW w:type="dxa" w:w="2232"/>
+            <w:shd w:fill="D9EAF7"/>
+            <w:vAlign w:val="center"/>
+            <w:tcMar>
+              <w:top w:w="80" w:type="dxa"/>
+              <w:start w:w="100" w:type="dxa"/>
+              <w:bottom w:w="80" w:type="dxa"/>
+              <w:end w:w="100" w:type="dxa"/>
+            </w:tcMar>
+          </w:tcPr>
+          <w:p>
+            <w:r>
+              <w:rPr>
+                <w:rFonts w:ascii="Arial" w:hAnsi="Arial"/>
+                <w:b/>
+                <w:sz w:val="17"/>
+              </w:rPr>
+              <w:t>Constructor</w:t>
+            </w:r>
+          </w:p>
+        </w:tc>
+        <w:tc>
+          <w:tcPr>
+            <w:tcW w:type="dxa" w:w="1440"/>
+            <w:shd w:fill="D9EAF7"/>
+            <w:vAlign w:val="center"/>
+            <w:tcMar>
+              <w:top w:w="80" w:type="dxa"/>
+              <w:start w:w="100" w:type="dxa"/>
+              <w:bottom w:w="80" w:type="dxa"/>
+              <w:end w:w="100" w:type="dxa"/>
+            </w:tcMar>
+          </w:tcPr>
+          <w:p>
+            <w:r>
+              <w:rPr>
+                <w:rFonts w:ascii="Arial" w:hAnsi="Arial"/>
+                <w:b/>
+                <w:sz w:val="17"/>
+              </w:rPr>
+              <w:t>Spearman rho</w:t>
+            </w:r>
+          </w:p>
+        </w:tc>
+        <w:tc>
+          <w:tcPr>
+            <w:tcW w:type="dxa" w:w="1296"/>
+            <w:shd w:fill="D9EAF7"/>
+            <w:vAlign w:val="center"/>
+            <w:tcMar>
+              <w:top w:w="80" w:type="dxa"/>
+              <w:start w:w="100" w:type="dxa"/>
+              <w:bottom w:w="80" w:type="dxa"/>
+              <w:end w:w="100" w:type="dxa"/>
+            </w:tcMar>
+          </w:tcPr>
+          <w:p>
+            <w:r>
+              <w:rPr>
+                <w:rFonts w:ascii="Arial" w:hAnsi="Arial"/>
+                <w:b/>
+                <w:sz w:val="17"/>
+              </w:rPr>
+              <w:t>Kendall tau</w:t>
+            </w:r>
+          </w:p>
+        </w:tc>
+        <w:tc>
+          <w:tcPr>
+            <w:tcW w:type="dxa" w:w="1368"/>
+            <w:shd w:fill="D9EAF7"/>
+            <w:vAlign w:val="center"/>
+            <w:tcMar>
+              <w:top w:w="80" w:type="dxa"/>
+              <w:start w:w="100" w:type="dxa"/>
+              <w:bottom w:w="80" w:type="dxa"/>
+              <w:end w:w="100" w:type="dxa"/>
+            </w:tcMar>
+          </w:tcPr>
+          <w:p>
+            <w:r>
+              <w:rPr>
+                <w:rFonts w:ascii="Arial" w:hAnsi="Arial"/>
+                <w:b/>
+                <w:sz w:val="17"/>
+              </w:rPr>
+              <w:t>Faithfulness</w:t>
+            </w:r>
+          </w:p>
+        </w:tc>
+        <w:tc>
+          <w:tcPr>
+            <w:tcW w:type="dxa" w:w="1080"/>
+            <w:shd w:fill="D9EAF7"/>
+            <w:vAlign w:val="center"/>
+            <w:tcMar>
+              <w:top w:w="80" w:type="dxa"/>
+              <w:start w:w="100" w:type="dxa"/>
+              <w:bottom w:w="80" w:type="dxa"/>
+              <w:end w:w="100" w:type="dxa"/>
+            </w:tcMar>
+          </w:tcPr>
+          <w:p>
+            <w:r>
+              <w:rPr>
+                <w:rFonts w:ascii="Arial" w:hAnsi="Arial"/>
+                <w:b/>
+                <w:sz w:val="17"/>
+              </w:rPr>
+              <w:t>Edges</w:t>
+            </w:r>
+          </w:p>
+        </w:tc>
+      </w:tr>
+      <w:tr>
+        <w:tc>
+          <w:tcPr>
+            <w:tcW w:type="dxa" w:w="2232"/>
+            <w:vAlign w:val="center"/>
+            <w:tcMar>
+              <w:top w:w="80" w:type="dxa"/>
+              <w:start w:w="100" w:type="dxa"/>
+              <w:bottom w:w="80" w:type="dxa"/>
+              <w:end w:w="100" w:type="dxa"/>
+            </w:tcMar>
+          </w:tcPr>
+          <w:p>
+            <w:pPr>
+              <w:spacing w:after="0"/>
+            </w:pPr>
+            <w:r>
+              <w:rPr>
+                <w:rFonts w:ascii="Arial" w:hAnsi="Arial"/>
+                <w:sz w:val="16"/>
+              </w:rPr>
+              <w:t>embedding_topical</w:t>
+            </w:r>
+          </w:p>
+        </w:tc>
+        <w:tc>
+          <w:tcPr>
+            <w:tcW w:type="dxa" w:w="1440"/>
+            <w:vAlign w:val="center"/>
+            <w:tcMar>
+              <w:top w:w="80" w:type="dxa"/>
+              <w:start w:w="100" w:type="dxa"/>
+              <w:bottom w:w="80" w:type="dxa"/>
+              <w:end w:w="100" w:type="dxa"/>
+            </w:tcMar>
+          </w:tcPr>
+          <w:p>
+            <w:pPr>
+              <w:spacing w:after="0"/>
+            </w:pPr>
+            <w:r>
+              <w:rPr>
+                <w:rFonts w:ascii="Arial" w:hAnsi="Arial"/>
+                <w:sz w:val="16"/>
+              </w:rPr>
+              <w:t>0.0615</w:t>
+            </w:r>
+          </w:p>
+        </w:tc>
+        <w:tc>
+          <w:tcPr>
+            <w:tcW w:type="dxa" w:w="1296"/>
+            <w:vAlign w:val="center"/>
+            <w:tcMar>
+              <w:top w:w="80" w:type="dxa"/>
+              <w:start w:w="100" w:type="dxa"/>
+              <w:bottom w:w="80" w:type="dxa"/>
+              <w:end w:w="100" w:type="dxa"/>
+            </w:tcMar>
+          </w:tcPr>
+          <w:p>
+            <w:pPr>
+              <w:spacing w:after="0"/>
+            </w:pPr>
+            <w:r>
+              <w:rPr>
+                <w:rFonts w:ascii="Arial" w:hAnsi="Arial"/>
+                <w:sz w:val="16"/>
+              </w:rPr>
+              <w:t>0.0541</w:t>
+            </w:r>
+          </w:p>
+        </w:tc>
+        <w:tc>
+          <w:tcPr>
+            <w:tcW w:type="dxa" w:w="1368"/>
+            <w:vAlign w:val="center"/>
+            <w:tcMar>
+              <w:top w:w="80" w:type="dxa"/>
+              <w:start w:w="100" w:type="dxa"/>
+              <w:bottom w:w="80" w:type="dxa"/>
+              <w:end w:w="100" w:type="dxa"/>
+            </w:tcMar>
+          </w:tcPr>
+          <w:p>
+            <w:pPr>
+              <w:spacing w:after="0"/>
+            </w:pPr>
+            <w:r>
+              <w:rPr>
+                <w:rFonts w:ascii="Arial" w:hAnsi="Arial"/>
+                <w:sz w:val="16"/>
+              </w:rPr>
+              <w:t>0.0863</w:t>
+            </w:r>
+          </w:p>
+        </w:tc>
+        <w:tc>
+          <w:tcPr>
+            <w:tcW w:type="dxa" w:w="1080"/>
+            <w:vAlign w:val="center"/>
+            <w:tcMar>
+              <w:top w:w="80" w:type="dxa"/>
+              <w:start w:w="100" w:type="dxa"/>
+              <w:bottom w:w="80" w:type="dxa"/>
+              <w:end w:w="100" w:type="dxa"/>
+            </w:tcMar>
+          </w:tcPr>
+          <w:p>
+            <w:pPr>
+              <w:spacing w:after="0"/>
+            </w:pPr>
+            <w:r>
+              <w:rPr>
+                <w:rFonts w:ascii="Arial" w:hAnsi="Arial"/>
+                <w:sz w:val="16"/>
+              </w:rPr>
+              <w:t>2,282</w:t>
+            </w:r>
+          </w:p>
+        </w:tc>
+      </w:tr>
+      <w:tr>
+        <w:tc>
+          <w:tcPr>
+            <w:tcW w:type="dxa" w:w="2232"/>
+            <w:vAlign w:val="center"/>
+            <w:tcMar>
+              <w:top w:w="80" w:type="dxa"/>
+              <w:start w:w="100" w:type="dxa"/>
+              <w:bottom w:w="80" w:type="dxa"/>
+              <w:end w:w="100" w:type="dxa"/>
+            </w:tcMar>
+          </w:tcPr>
+          <w:p>
+            <w:pPr>
+              <w:spacing w:after="0"/>
+            </w:pPr>
+            <w:r>
+              <w:rPr>
+                <w:rFonts w:ascii="Arial" w:hAnsi="Arial"/>
+                <w:sz w:val="16"/>
+              </w:rPr>
+              <w:t>temporal_only</w:t>
+            </w:r>
+          </w:p>
+        </w:tc>
+        <w:tc>
+          <w:tcPr>
+            <w:tcW w:type="dxa" w:w="1440"/>
+            <w:vAlign w:val="center"/>
+            <w:tcMar>
+              <w:top w:w="80" w:type="dxa"/>
+              <w:start w:w="100" w:type="dxa"/>
+              <w:bottom w:w="80" w:type="dxa"/>
+              <w:end w:w="100" w:type="dxa"/>
+            </w:tcMar>
+          </w:tcPr>
+          <w:p>
+            <w:pPr>
+              <w:spacing w:after="0"/>
+            </w:pPr>
+            <w:r>
+              <w:rPr>
+                <w:rFonts w:ascii="Arial" w:hAnsi="Arial"/>
+                <w:sz w:val="16"/>
+              </w:rPr>
+              <w:t>0.0596</w:t>
+            </w:r>
+          </w:p>
+        </w:tc>
+        <w:tc>
+          <w:tcPr>
+            <w:tcW w:type="dxa" w:w="1296"/>
+            <w:vAlign w:val="center"/>
+            <w:tcMar>
+              <w:top w:w="80" w:type="dxa"/>
+              <w:start w:w="100" w:type="dxa"/>
+              <w:bottom w:w="80" w:type="dxa"/>
+              <w:end w:w="100" w:type="dxa"/>
+            </w:tcMar>
+          </w:tcPr>
+          <w:p>
+            <w:pPr>
+              <w:spacing w:after="0"/>
+            </w:pPr>
+            <w:r>
+              <w:rPr>
+                <w:rFonts w:ascii="Arial" w:hAnsi="Arial"/>
+                <w:sz w:val="16"/>
+              </w:rPr>
+              <w:t>0.0525</w:t>
+            </w:r>
+          </w:p>
+        </w:tc>
+        <w:tc>
+          <w:tcPr>
+            <w:tcW w:type="dxa" w:w="1368"/>
+            <w:vAlign w:val="center"/>
+            <w:tcMar>
+              <w:top w:w="80" w:type="dxa"/>
+              <w:start w:w="100" w:type="dxa"/>
+              <w:bottom w:w="80" w:type="dxa"/>
+              <w:end w:w="100" w:type="dxa"/>
+            </w:tcMar>
+          </w:tcPr>
+          <w:p>
+            <w:pPr>
+              <w:spacing w:after="0"/>
+            </w:pPr>
+            <w:r>
+              <w:rPr>
+                <w:rFonts w:ascii="Arial" w:hAnsi="Arial"/>
+                <w:sz w:val="16"/>
+              </w:rPr>
+              <w:t>0.0507</w:t>
+            </w:r>
+          </w:p>
+        </w:tc>
+        <w:tc>
+          <w:tcPr>
+            <w:tcW w:type="dxa" w:w="1080"/>
+            <w:vAlign w:val="center"/>
+            <w:tcMar>
+              <w:top w:w="80" w:type="dxa"/>
+              <w:start w:w="100" w:type="dxa"/>
+              <w:bottom w:w="80" w:type="dxa"/>
+              <w:end w:w="100" w:type="dxa"/>
+            </w:tcMar>
+          </w:tcPr>
+          <w:p>
+            <w:pPr>
+              <w:spacing w:after="0"/>
+            </w:pPr>
+            <w:r>
+              <w:rPr>
+                <w:rFonts w:ascii="Arial" w:hAnsi="Arial"/>
+                <w:sz w:val="16"/>
+              </w:rPr>
+              <w:t>2,098</w:t>
+            </w:r>
+          </w:p>
+        </w:tc>
+      </w:tr>
+      <w:tr>
+        <w:tc>
+          <w:tcPr>
+            <w:tcW w:type="dxa" w:w="2232"/>
+            <w:vAlign w:val="center"/>
+            <w:tcMar>
+              <w:top w:w="80" w:type="dxa"/>
+              <w:start w:w="100" w:type="dxa"/>
+              <w:bottom w:w="80" w:type="dxa"/>
+              <w:end w:w="100" w:type="dxa"/>
+            </w:tcMar>
+          </w:tcPr>
+          <w:p>
+            <w:pPr>
+              <w:spacing w:after="0"/>
+            </w:pPr>
+            <w:r>
+              <w:rPr>
+                <w:rFonts w:ascii="Arial" w:hAnsi="Arial"/>
+                <w:sz w:val="16"/>
+              </w:rPr>
+              <w:t>jaccard_topical</w:t>
+            </w:r>
+          </w:p>
+        </w:tc>
+        <w:tc>
+          <w:tcPr>
+            <w:tcW w:type="dxa" w:w="1440"/>
+            <w:vAlign w:val="center"/>
+            <w:tcMar>
+              <w:top w:w="80" w:type="dxa"/>
+              <w:start w:w="100" w:type="dxa"/>
+              <w:bottom w:w="80" w:type="dxa"/>
+              <w:end w:w="100" w:type="dxa"/>
+            </w:tcMar>
+          </w:tcPr>
+          <w:p>
+            <w:pPr>
+              <w:spacing w:after="0"/>
+            </w:pPr>
+            <w:r>
+              <w:rPr>
+                <w:rFonts w:ascii="Arial" w:hAnsi="Arial"/>
+                <w:sz w:val="16"/>
+              </w:rPr>
+              <w:t>0.0517</w:t>
+            </w:r>
+          </w:p>
+        </w:tc>
+        <w:tc>
+          <w:tcPr>
+            <w:tcW w:type="dxa" w:w="1296"/>
+            <w:vAlign w:val="center"/>
+            <w:tcMar>
+              <w:top w:w="80" w:type="dxa"/>
+              <w:start w:w="100" w:type="dxa"/>
+              <w:bottom w:w="80" w:type="dxa"/>
+              <w:end w:w="100" w:type="dxa"/>
+            </w:tcMar>
+          </w:tcPr>
+          <w:p>
+            <w:pPr>
+              <w:spacing w:after="0"/>
+            </w:pPr>
+            <w:r>
+              <w:rPr>
+                <w:rFonts w:ascii="Arial" w:hAnsi="Arial"/>
+                <w:sz w:val="16"/>
+              </w:rPr>
+              <w:t>0.0459</w:t>
+            </w:r>
+          </w:p>
+        </w:tc>
+        <w:tc>
+          <w:tcPr>
+            <w:tcW w:type="dxa" w:w="1368"/>
+            <w:vAlign w:val="center"/>
+            <w:tcMar>
+              <w:top w:w="80" w:type="dxa"/>
+              <w:start w:w="100" w:type="dxa"/>
+              <w:bottom w:w="80" w:type="dxa"/>
+              <w:end w:w="100" w:type="dxa"/>
+            </w:tcMar>
+          </w:tcPr>
+          <w:p>
+            <w:pPr>
+              <w:spacing w:after="0"/>
+            </w:pPr>
+            <w:r>
+              <w:rPr>
+                <w:rFonts w:ascii="Arial" w:hAnsi="Arial"/>
+                <w:sz w:val="16"/>
+              </w:rPr>
+              <w:t>0.0557</w:t>
+            </w:r>
+          </w:p>
+        </w:tc>
+        <w:tc>
+          <w:tcPr>
+            <w:tcW w:type="dxa" w:w="1080"/>
+            <w:vAlign w:val="center"/>
+            <w:tcMar>
+              <w:top w:w="80" w:type="dxa"/>
+              <w:start w:w="100" w:type="dxa"/>
+              <w:bottom w:w="80" w:type="dxa"/>
+              <w:end w:w="100" w:type="dxa"/>
+            </w:tcMar>
+          </w:tcPr>
+          <w:p>
+            <w:pPr>
+              <w:spacing w:after="0"/>
+            </w:pPr>
+            <w:r>
+              <w:rPr>
+                <w:rFonts w:ascii="Arial" w:hAnsi="Arial"/>
+                <w:sz w:val="16"/>
+              </w:rPr>
+              <w:t>1,655</w:t>
+            </w:r>
+          </w:p>
+        </w:tc>
+      </w:tr>
+      <w:tr>
+        <w:tc>
+          <w:tcPr>
+            <w:tcW w:type="dxa" w:w="2232"/>
+            <w:vAlign w:val="center"/>
+            <w:tcMar>
+              <w:top w:w="80" w:type="dxa"/>
+              <w:start w:w="100" w:type="dxa"/>
+              <w:bottom w:w="80" w:type="dxa"/>
+              <w:end w:w="100" w:type="dxa"/>
+            </w:tcMar>
+          </w:tcPr>
+          <w:p>
+            <w:pPr>
+              <w:spacing w:after="0"/>
+            </w:pPr>
+            <w:r>
+              <w:rPr>
+                <w:rFonts w:ascii="Arial" w:hAnsi="Arial"/>
+                <w:sz w:val="16"/>
+              </w:rPr>
+              <w:t>tfidf_topical</w:t>
+            </w:r>
+          </w:p>
+        </w:tc>
+        <w:tc>
+          <w:tcPr>
+            <w:tcW w:type="dxa" w:w="1440"/>
+            <w:vAlign w:val="center"/>
+            <w:tcMar>
+              <w:top w:w="80" w:type="dxa"/>
+              <w:start w:w="100" w:type="dxa"/>
+              <w:bottom w:w="80" w:type="dxa"/>
+              <w:end w:w="100" w:type="dxa"/>
+            </w:tcMar>
+          </w:tcPr>
+          <w:p>
+            <w:pPr>
+              <w:spacing w:after="0"/>
+            </w:pPr>
+            <w:r>
+              <w:rPr>
+                <w:rFonts w:ascii="Arial" w:hAnsi="Arial"/>
+                <w:sz w:val="16"/>
+              </w:rPr>
+              <w:t>0.0515</w:t>
+            </w:r>
+          </w:p>
+        </w:tc>
+        <w:tc>
+          <w:tcPr>
+            <w:tcW w:type="dxa" w:w="1296"/>
+            <w:vAlign w:val="center"/>
+            <w:tcMar>
+              <w:top w:w="80" w:type="dxa"/>
+              <w:start w:w="100" w:type="dxa"/>
+              <w:bottom w:w="80" w:type="dxa"/>
+              <w:end w:w="100" w:type="dxa"/>
+            </w:tcMar>
+          </w:tcPr>
+          <w:p>
+            <w:pPr>
+              <w:spacing w:after="0"/>
+            </w:pPr>
+            <w:r>
+              <w:rPr>
+                <w:rFonts w:ascii="Arial" w:hAnsi="Arial"/>
+                <w:sz w:val="16"/>
+              </w:rPr>
+              <w:t>0.0458</w:t>
+            </w:r>
+          </w:p>
+        </w:tc>
+        <w:tc>
+          <w:tcPr>
+            <w:tcW w:type="dxa" w:w="1368"/>
+            <w:vAlign w:val="center"/>
+            <w:tcMar>
+              <w:top w:w="80" w:type="dxa"/>
+              <w:start w:w="100" w:type="dxa"/>
+              <w:bottom w:w="80" w:type="dxa"/>
+              <w:end w:w="100" w:type="dxa"/>
+            </w:tcMar>
+          </w:tcPr>
+          <w:p>
+            <w:pPr>
+              <w:spacing w:after="0"/>
+            </w:pPr>
+            <w:r>
+              <w:rPr>
+                <w:rFonts w:ascii="Arial" w:hAnsi="Arial"/>
+                <w:sz w:val="16"/>
+              </w:rPr>
+              <w:t>0.0542</w:t>
+            </w:r>
+          </w:p>
+        </w:tc>
+        <w:tc>
+          <w:tcPr>
+            <w:tcW w:type="dxa" w:w="1080"/>
+            <w:vAlign w:val="center"/>
+            <w:tcMar>
+              <w:top w:w="80" w:type="dxa"/>
+              <w:start w:w="100" w:type="dxa"/>
+              <w:bottom w:w="80" w:type="dxa"/>
+              <w:end w:w="100" w:type="dxa"/>
+            </w:tcMar>
+          </w:tcPr>
+          <w:p>
+            <w:pPr>
+              <w:spacing w:after="0"/>
+            </w:pPr>
+            <w:r>
+              <w:rPr>
+                <w:rFonts w:ascii="Arial" w:hAnsi="Arial"/>
+                <w:sz w:val="16"/>
+              </w:rPr>
+              <w:t>1,648</w:t>
+            </w:r>
+          </w:p>
+        </w:tc>
+      </w:tr>
+      <w:tr>
+        <w:tc>
+          <w:tcPr>
+            <w:tcW w:type="dxa" w:w="2232"/>
+            <w:vAlign w:val="center"/>
+            <w:tcMar>
+              <w:top w:w="80" w:type="dxa"/>
+              <w:start w:w="100" w:type="dxa"/>
+              <w:bottom w:w="80" w:type="dxa"/>
+              <w:end w:w="100" w:type="dxa"/>
+            </w:tcMar>
+          </w:tcPr>
+          <w:p>
+            <w:pPr>
+              <w:spacing w:after="0"/>
+            </w:pPr>
+            <w:r>
+              <w:rPr>
+                <w:rFonts w:ascii="Arial" w:hAnsi="Arial"/>
+                <w:sz w:val="16"/>
+              </w:rPr>
+              <w:t>shuffled_topical</w:t>
+            </w:r>
+          </w:p>
+        </w:tc>
+        <w:tc>
+          <w:tcPr>
+            <w:tcW w:type="dxa" w:w="1440"/>
+            <w:vAlign w:val="center"/>
+            <w:tcMar>
+              <w:top w:w="80" w:type="dxa"/>
+              <w:start w:w="100" w:type="dxa"/>
+              <w:bottom w:w="80" w:type="dxa"/>
+              <w:end w:w="100" w:type="dxa"/>
+            </w:tcMar>
+          </w:tcPr>
+          <w:p>
+            <w:pPr>
+              <w:spacing w:after="0"/>
+            </w:pPr>
+            <w:r>
+              <w:rPr>
+                <w:rFonts w:ascii="Arial" w:hAnsi="Arial"/>
+                <w:sz w:val="16"/>
+              </w:rPr>
+              <w:t>0.0515</w:t>
+            </w:r>
+          </w:p>
+        </w:tc>
+        <w:tc>
+          <w:tcPr>
+            <w:tcW w:type="dxa" w:w="1296"/>
+            <w:vAlign w:val="center"/>
+            <w:tcMar>
+              <w:top w:w="80" w:type="dxa"/>
+              <w:start w:w="100" w:type="dxa"/>
+              <w:bottom w:w="80" w:type="dxa"/>
+              <w:end w:w="100" w:type="dxa"/>
+            </w:tcMar>
+          </w:tcPr>
+          <w:p>
+            <w:pPr>
+              <w:spacing w:after="0"/>
+            </w:pPr>
+            <w:r>
+              <w:rPr>
+                <w:rFonts w:ascii="Arial" w:hAnsi="Arial"/>
+                <w:sz w:val="16"/>
+              </w:rPr>
+              <w:t>0.0458</w:t>
+            </w:r>
+          </w:p>
+        </w:tc>
+        <w:tc>
+          <w:tcPr>
+            <w:tcW w:type="dxa" w:w="1368"/>
+            <w:vAlign w:val="center"/>
+            <w:tcMar>
+              <w:top w:w="80" w:type="dxa"/>
+              <w:start w:w="100" w:type="dxa"/>
+              <w:bottom w:w="80" w:type="dxa"/>
+              <w:end w:w="100" w:type="dxa"/>
+            </w:tcMar>
+          </w:tcPr>
+          <w:p>
+            <w:pPr>
+              <w:spacing w:after="0"/>
+            </w:pPr>
+            <w:r>
+              <w:rPr>
+                <w:rFonts w:ascii="Arial" w:hAnsi="Arial"/>
+                <w:sz w:val="16"/>
+              </w:rPr>
+              <w:t>0.0542</w:t>
+            </w:r>
+          </w:p>
+        </w:tc>
+        <w:tc>
+          <w:tcPr>
+            <w:tcW w:type="dxa" w:w="1080"/>
+            <w:vAlign w:val="center"/>
+            <w:tcMar>
+              <w:top w:w="80" w:type="dxa"/>
+              <w:start w:w="100" w:type="dxa"/>
+              <w:bottom w:w="80" w:type="dxa"/>
+              <w:end w:w="100" w:type="dxa"/>
+            </w:tcMar>
+          </w:tcPr>
+          <w:p>
+            <w:pPr>
+              <w:spacing w:after="0"/>
+            </w:pPr>
+            <w:r>
+              <w:rPr>
+                <w:rFonts w:ascii="Arial" w:hAnsi="Arial"/>
+                <w:sz w:val="16"/>
+              </w:rPr>
+              <w:t>1,648</w:t>
+            </w:r>
+          </w:p>
+        </w:tc>
+      </w:tr>
+    </w:tbl>
+    <w:p/>
+    <w:p>
+      <w:pPr>
+        <w:spacing w:after="120" w:line="259" w:lineRule="auto"/>
+      </w:pPr>
+      <w:r>
+        <w:rPr>
+          <w:rFonts w:ascii="Arial" w:hAnsi="Arial"/>
+          <w:sz w:val="19"/>
+        </w:rPr>
+        <w:t>Interpretation: the result is graph-interface robustness evidence. TF-IDF is a lightweight default constructor; Sentence-BERT embeddings can be substituted at the graph interface. The manuscript does not claim a production graph-ranking or live KBS performance result.</w:t>
+      </w:r>
+    </w:p>
+    <w:p>
+      <w:pPr>
+        <w:pStyle w:val="Heading1"/>
+      </w:pPr>
+      <w:r>
+        <w:rPr>
+          <w:rFonts w:ascii="Arial" w:hAnsi="Arial"/>
+          <w:color w:val="1F4E79"/>
         </w:rPr>
         <w:t>Hyperparameter and Stress-Test Diagnostics</w:t>
       </w:r>
     </w:p>
     <w:p>
       <w:pPr>
-        <w:spacing w:after="120"/>
+        <w:spacing w:after="120" w:line="259" w:lineRule="auto"/>
       </w:pPr>
       <w:r>
+        <w:rPr>
+          <w:rFonts w:ascii="Arial" w:hAnsi="Arial"/>
+          <w:sz w:val="19"/>
+        </w:rPr>
         <w:t>The QP hyperparameter sensitivity grid sweeps gamma in {0.0, 0.1, 0.2, 0.5, 0.8} and delta in {0.0, 0.05, 0.1, 0.2, 0.4}. The diagnostic default is gamma=0.2 and delta=0.1. The grid is supplementary QP robustness evidence only; it is not positive external validation and does not change the PRM800K Ridge recommendation.</w:t>
       </w:r>
     </w:p>
@@ -574,26 +2231,28 @@
         <w:tblLook w:firstColumn="1" w:firstRow="1" w:lastColumn="0" w:lastRow="0" w:noHBand="0" w:noVBand="1" w:val="04A0"/>
       </w:tblPr>
       <w:tblGrid>
-        <w:gridCol w:w="4680"/>
-        <w:gridCol w:w="4680"/>
+        <w:gridCol w:w="5040"/>
+        <w:gridCol w:w="5040"/>
       </w:tblGrid>
       <w:tr>
         <w:tc>
           <w:tcPr>
-            <w:tcW w:type="dxa" w:w="4032"/>
+            <w:tcW w:type="dxa" w:w="4320"/>
+            <w:shd w:fill="D9EAF7"/>
             <w:vAlign w:val="center"/>
             <w:tcMar>
               <w:top w:w="80" w:type="dxa"/>
-              <w:start w:w="120" w:type="dxa"/>
+              <w:start w:w="100" w:type="dxa"/>
               <w:bottom w:w="80" w:type="dxa"/>
-              <w:end w:w="120" w:type="dxa"/>
+              <w:end w:w="100" w:type="dxa"/>
             </w:tcMar>
-            <w:shd w:fill="E8EEF5"/>
           </w:tcPr>
           <w:p>
             <w:r>
               <w:rPr>
+                <w:rFonts w:ascii="Arial" w:hAnsi="Arial"/>
                 <w:b/>
+                <w:sz w:val="17"/>
               </w:rPr>
               <w:t>Finding</w:t>
             </w:r>
@@ -602,19 +2261,21 @@
         <w:tc>
           <w:tcPr>
             <w:tcW w:type="dxa" w:w="5328"/>
+            <w:shd w:fill="D9EAF7"/>
             <w:vAlign w:val="center"/>
             <w:tcMar>
               <w:top w:w="80" w:type="dxa"/>
-              <w:start w:w="120" w:type="dxa"/>
+              <w:start w:w="100" w:type="dxa"/>
               <w:bottom w:w="80" w:type="dxa"/>
-              <w:end w:w="120" w:type="dxa"/>
+              <w:end w:w="100" w:type="dxa"/>
             </w:tcMar>
-            <w:shd w:fill="E8EEF5"/>
           </w:tcPr>
           <w:p>
             <w:r>
               <w:rPr>
+                <w:rFonts w:ascii="Arial" w:hAnsi="Arial"/>
                 <w:b/>
+                <w:sz w:val="17"/>
               </w:rPr>
               <w:t>Interpretation</w:t>
             </w:r>
@@ -624,17 +2285,24 @@
       <w:tr>
         <w:tc>
           <w:tcPr>
-            <w:tcW w:type="dxa" w:w="4032"/>
+            <w:tcW w:type="dxa" w:w="4320"/>
             <w:vAlign w:val="center"/>
             <w:tcMar>
               <w:top w:w="80" w:type="dxa"/>
-              <w:start w:w="120" w:type="dxa"/>
+              <w:start w:w="100" w:type="dxa"/>
               <w:bottom w:w="80" w:type="dxa"/>
-              <w:end w:w="120" w:type="dxa"/>
+              <w:end w:w="100" w:type="dxa"/>
             </w:tcMar>
           </w:tcPr>
           <w:p>
+            <w:pPr>
+              <w:spacing w:after="0"/>
+            </w:pPr>
             <w:r>
+              <w:rPr>
+                <w:rFonts w:ascii="Arial" w:hAnsi="Arial"/>
+                <w:sz w:val="16"/>
+              </w:rPr>
               <w:t>Removing bottleneck pressure lowers Spearman relative to the default on the stress-test generator.</w:t>
             </w:r>
           </w:p>
@@ -645,13 +2313,20 @@
             <w:vAlign w:val="center"/>
             <w:tcMar>
               <w:top w:w="80" w:type="dxa"/>
-              <w:start w:w="120" w:type="dxa"/>
+              <w:start w:w="100" w:type="dxa"/>
               <w:bottom w:w="80" w:type="dxa"/>
-              <w:end w:w="120" w:type="dxa"/>
+              <w:end w:w="100" w:type="dxa"/>
             </w:tcMar>
           </w:tcPr>
           <w:p>
+            <w:pPr>
+              <w:spacing w:after="0"/>
+            </w:pPr>
             <w:r>
+              <w:rPr>
+                <w:rFonts w:ascii="Arial" w:hAnsi="Arial"/>
+                <w:sz w:val="16"/>
+              </w:rPr>
               <w:t>The bottleneck term is useful in the synthetic regime where labels encode bottleneck protection.</w:t>
             </w:r>
           </w:p>
@@ -660,17 +2335,24 @@
       <w:tr>
         <w:tc>
           <w:tcPr>
-            <w:tcW w:type="dxa" w:w="4032"/>
+            <w:tcW w:type="dxa" w:w="4320"/>
             <w:vAlign w:val="center"/>
             <w:tcMar>
               <w:top w:w="80" w:type="dxa"/>
-              <w:start w:w="120" w:type="dxa"/>
+              <w:start w:w="100" w:type="dxa"/>
               <w:bottom w:w="80" w:type="dxa"/>
-              <w:end w:w="120" w:type="dxa"/>
+              <w:end w:w="100" w:type="dxa"/>
             </w:tcMar>
           </w:tcPr>
           <w:p>
+            <w:pPr>
+              <w:spacing w:after="0"/>
+            </w:pPr>
             <w:r>
+              <w:rPr>
+                <w:rFonts w:ascii="Arial" w:hAnsi="Arial"/>
+                <w:sz w:val="16"/>
+              </w:rPr>
               <w:t>Moderate-to-strong redundancy and bottleneck weights remain competitive on the structural stress-test.</w:t>
             </w:r>
           </w:p>
@@ -681,13 +2363,20 @@
             <w:vAlign w:val="center"/>
             <w:tcMar>
               <w:top w:w="80" w:type="dxa"/>
-              <w:start w:w="120" w:type="dxa"/>
+              <w:start w:w="100" w:type="dxa"/>
               <w:bottom w:w="80" w:type="dxa"/>
-              <w:end w:w="120" w:type="dxa"/>
+              <w:end w:w="100" w:type="dxa"/>
             </w:tcMar>
           </w:tcPr>
           <w:p>
+            <w:pPr>
+              <w:spacing w:after="0"/>
+            </w:pPr>
             <w:r>
+              <w:rPr>
+                <w:rFonts w:ascii="Arial" w:hAnsi="Arial"/>
+                <w:sz w:val="16"/>
+              </w:rPr>
               <w:t>The stress-test behavior is not a single-point hyperparameter artifact.</w:t>
             </w:r>
           </w:p>
@@ -696,17 +2385,24 @@
       <w:tr>
         <w:tc>
           <w:tcPr>
-            <w:tcW w:type="dxa" w:w="4032"/>
+            <w:tcW w:type="dxa" w:w="4320"/>
             <w:vAlign w:val="center"/>
             <w:tcMar>
               <w:top w:w="80" w:type="dxa"/>
-              <w:start w:w="120" w:type="dxa"/>
+              <w:start w:w="100" w:type="dxa"/>
               <w:bottom w:w="80" w:type="dxa"/>
-              <w:end w:w="120" w:type="dxa"/>
+              <w:end w:w="100" w:type="dxa"/>
             </w:tcMar>
           </w:tcPr>
           <w:p>
+            <w:pPr>
+              <w:spacing w:after="0"/>
+            </w:pPr>
             <w:r>
+              <w:rPr>
+                <w:rFonts w:ascii="Arial" w:hAnsi="Arial"/>
+                <w:sz w:val="16"/>
+              </w:rPr>
               <w:t>PRM800K still favors w_struct and the Ridge approximation.</w:t>
             </w:r>
           </w:p>
@@ -717,13 +2413,20 @@
             <w:vAlign w:val="center"/>
             <w:tcMar>
               <w:top w:w="80" w:type="dxa"/>
-              <w:start w:w="120" w:type="dxa"/>
+              <w:start w:w="100" w:type="dxa"/>
               <w:bottom w:w="80" w:type="dxa"/>
-              <w:end w:w="120" w:type="dxa"/>
+              <w:end w:w="100" w:type="dxa"/>
             </w:tcMar>
           </w:tcPr>
           <w:p>
+            <w:pPr>
+              <w:spacing w:after="0"/>
+            </w:pPr>
             <w:r>
+              <w:rPr>
+                <w:rFonts w:ascii="Arial" w:hAnsi="Arial"/>
+                <w:sz w:val="16"/>
+              </w:rPr>
               <w:t>QP is reserved for high-structure-conflict settings; Ridge is recommended when learned fidelity is already strong.</w:t>
             </w:r>
           </w:p>
@@ -737,17 +2440,22 @@
       </w:pPr>
       <w:r>
         <w:rPr>
-          <w:color w:val="2E74B5"/>
+          <w:rFonts w:ascii="Arial" w:hAnsi="Arial"/>
+          <w:color w:val="1F4E79"/>
         </w:rPr>
         <w:t>PRM800K Variant and Audit Readout</w:t>
       </w:r>
     </w:p>
     <w:p>
       <w:pPr>
-        <w:spacing w:after="120"/>
+        <w:spacing w:after="120" w:line="259" w:lineRule="auto"/>
       </w:pPr>
       <w:r>
-        <w:t>The strongest real-data signal is w_struct. SC-FMA Ridge is a preservation-with-decomposition approximation: it closely preserves w_struct while exposing fidelity, structural necessity, redundancy, and bottleneck components for audit triage.</w:t>
+        <w:rPr>
+          <w:rFonts w:ascii="Arial" w:hAnsi="Arial"/>
+          <w:sz w:val="19"/>
+        </w:rPr>
+        <w:t>The strongest real-data signal is w_struct. SC-FMA Ridge is a preservation-with-decomposition approximation: it closely preserves w_struct while exposing fidelity, structural necessity, redundancy, and bottleneck fields for audit cards. QP remains useful for controlled structural-conflict settings but is downgraded on PRM800K.</w:t>
       </w:r>
     </w:p>
     <w:tbl>
@@ -759,27 +2467,29 @@
         <w:tblLook w:firstColumn="1" w:firstRow="1" w:lastColumn="0" w:lastRow="0" w:noHBand="0" w:noVBand="1" w:val="04A0"/>
       </w:tblPr>
       <w:tblGrid>
-        <w:gridCol w:w="3120"/>
-        <w:gridCol w:w="3120"/>
-        <w:gridCol w:w="3120"/>
+        <w:gridCol w:w="3360"/>
+        <w:gridCol w:w="3360"/>
+        <w:gridCol w:w="3360"/>
       </w:tblGrid>
       <w:tr>
         <w:tc>
           <w:tcPr>
-            <w:tcW w:type="dxa" w:w="2376"/>
+            <w:tcW w:type="dxa" w:w="2304"/>
+            <w:shd w:fill="D9EAF7"/>
             <w:vAlign w:val="center"/>
             <w:tcMar>
               <w:top w:w="80" w:type="dxa"/>
-              <w:start w:w="120" w:type="dxa"/>
+              <w:start w:w="100" w:type="dxa"/>
               <w:bottom w:w="80" w:type="dxa"/>
-              <w:end w:w="120" w:type="dxa"/>
+              <w:end w:w="100" w:type="dxa"/>
             </w:tcMar>
-            <w:shd w:fill="E8EEF5"/>
           </w:tcPr>
           <w:p>
             <w:r>
               <w:rPr>
+                <w:rFonts w:ascii="Arial" w:hAnsi="Arial"/>
                 <w:b/>
+                <w:sz w:val="17"/>
               </w:rPr>
               <w:t>Method</w:t>
             </w:r>
@@ -787,20 +2497,22 @@
         </w:tc>
         <w:tc>
           <w:tcPr>
-            <w:tcW w:type="dxa" w:w="1944"/>
+            <w:tcW w:type="dxa" w:w="1584"/>
+            <w:shd w:fill="D9EAF7"/>
             <w:vAlign w:val="center"/>
             <w:tcMar>
               <w:top w:w="80" w:type="dxa"/>
-              <w:start w:w="120" w:type="dxa"/>
+              <w:start w:w="100" w:type="dxa"/>
               <w:bottom w:w="80" w:type="dxa"/>
-              <w:end w:w="120" w:type="dxa"/>
+              <w:end w:w="100" w:type="dxa"/>
             </w:tcMar>
-            <w:shd w:fill="E8EEF5"/>
           </w:tcPr>
           <w:p>
             <w:r>
               <w:rPr>
+                <w:rFonts w:ascii="Arial" w:hAnsi="Arial"/>
                 <w:b/>
+                <w:sz w:val="17"/>
               </w:rPr>
               <w:t>Mean Spearman</w:t>
             </w:r>
@@ -808,20 +2520,22 @@
         </w:tc>
         <w:tc>
           <w:tcPr>
-            <w:tcW w:type="dxa" w:w="5040"/>
+            <w:tcW w:type="dxa" w:w="5760"/>
+            <w:shd w:fill="D9EAF7"/>
             <w:vAlign w:val="center"/>
             <w:tcMar>
               <w:top w:w="80" w:type="dxa"/>
-              <w:start w:w="120" w:type="dxa"/>
+              <w:start w:w="100" w:type="dxa"/>
               <w:bottom w:w="80" w:type="dxa"/>
-              <w:end w:w="120" w:type="dxa"/>
+              <w:end w:w="100" w:type="dxa"/>
             </w:tcMar>
-            <w:shd w:fill="E8EEF5"/>
           </w:tcPr>
           <w:p>
             <w:r>
               <w:rPr>
+                <w:rFonts w:ascii="Arial" w:hAnsi="Arial"/>
                 <w:b/>
+                <w:sz w:val="17"/>
               </w:rPr>
               <w:t>Audit interpretation</w:t>
             </w:r>
@@ -831,51 +2545,72 @@
       <w:tr>
         <w:tc>
           <w:tcPr>
-            <w:tcW w:type="dxa" w:w="2376"/>
+            <w:tcW w:type="dxa" w:w="2304"/>
             <w:vAlign w:val="center"/>
             <w:tcMar>
               <w:top w:w="80" w:type="dxa"/>
-              <w:start w:w="120" w:type="dxa"/>
+              <w:start w:w="100" w:type="dxa"/>
               <w:bottom w:w="80" w:type="dxa"/>
-              <w:end w:w="120" w:type="dxa"/>
+              <w:end w:w="100" w:type="dxa"/>
             </w:tcMar>
           </w:tcPr>
           <w:p>
+            <w:pPr>
+              <w:spacing w:after="0"/>
+            </w:pPr>
             <w:r>
+              <w:rPr>
+                <w:rFonts w:ascii="Arial" w:hAnsi="Arial"/>
+                <w:sz w:val="16"/>
+              </w:rPr>
               <w:t>w_struct</w:t>
             </w:r>
           </w:p>
         </w:tc>
         <w:tc>
           <w:tcPr>
-            <w:tcW w:type="dxa" w:w="1944"/>
+            <w:tcW w:type="dxa" w:w="1584"/>
             <w:vAlign w:val="center"/>
             <w:tcMar>
               <w:top w:w="80" w:type="dxa"/>
-              <w:start w:w="120" w:type="dxa"/>
+              <w:start w:w="100" w:type="dxa"/>
               <w:bottom w:w="80" w:type="dxa"/>
-              <w:end w:w="120" w:type="dxa"/>
+              <w:end w:w="100" w:type="dxa"/>
             </w:tcMar>
           </w:tcPr>
           <w:p>
+            <w:pPr>
+              <w:spacing w:after="0"/>
+            </w:pPr>
             <w:r>
+              <w:rPr>
+                <w:rFonts w:ascii="Arial" w:hAnsi="Arial"/>
+                <w:sz w:val="16"/>
+              </w:rPr>
               <w:t>0.611</w:t>
             </w:r>
           </w:p>
         </w:tc>
         <w:tc>
           <w:tcPr>
-            <w:tcW w:type="dxa" w:w="5040"/>
+            <w:tcW w:type="dxa" w:w="5760"/>
             <w:vAlign w:val="center"/>
             <w:tcMar>
               <w:top w:w="80" w:type="dxa"/>
-              <w:start w:w="120" w:type="dxa"/>
+              <w:start w:w="100" w:type="dxa"/>
               <w:bottom w:w="80" w:type="dxa"/>
-              <w:end w:w="120" w:type="dxa"/>
+              <w:end w:w="100" w:type="dxa"/>
             </w:tcMar>
           </w:tcPr>
           <w:p>
+            <w:pPr>
+              <w:spacing w:after="0"/>
+            </w:pPr>
             <w:r>
+              <w:rPr>
+                <w:rFonts w:ascii="Arial" w:hAnsi="Arial"/>
+                <w:sz w:val="16"/>
+              </w:rPr>
               <w:t>Primary PRM800K step-ranking signal</w:t>
             </w:r>
           </w:p>
@@ -884,51 +2619,72 @@
       <w:tr>
         <w:tc>
           <w:tcPr>
-            <w:tcW w:type="dxa" w:w="2376"/>
+            <w:tcW w:type="dxa" w:w="2304"/>
             <w:vAlign w:val="center"/>
             <w:tcMar>
               <w:top w:w="80" w:type="dxa"/>
-              <w:start w:w="120" w:type="dxa"/>
+              <w:start w:w="100" w:type="dxa"/>
               <w:bottom w:w="80" w:type="dxa"/>
-              <w:end w:w="120" w:type="dxa"/>
+              <w:end w:w="100" w:type="dxa"/>
             </w:tcMar>
           </w:tcPr>
           <w:p>
+            <w:pPr>
+              <w:spacing w:after="0"/>
+            </w:pPr>
             <w:r>
+              <w:rPr>
+                <w:rFonts w:ascii="Arial" w:hAnsi="Arial"/>
+                <w:sz w:val="16"/>
+              </w:rPr>
               <w:t>SC-FMA Ridge</w:t>
             </w:r>
           </w:p>
         </w:tc>
         <w:tc>
           <w:tcPr>
-            <w:tcW w:type="dxa" w:w="1944"/>
+            <w:tcW w:type="dxa" w:w="1584"/>
             <w:vAlign w:val="center"/>
             <w:tcMar>
               <w:top w:w="80" w:type="dxa"/>
-              <w:start w:w="120" w:type="dxa"/>
+              <w:start w:w="100" w:type="dxa"/>
               <w:bottom w:w="80" w:type="dxa"/>
-              <w:end w:w="120" w:type="dxa"/>
+              <w:end w:w="100" w:type="dxa"/>
             </w:tcMar>
           </w:tcPr>
           <w:p>
+            <w:pPr>
+              <w:spacing w:after="0"/>
+            </w:pPr>
             <w:r>
+              <w:rPr>
+                <w:rFonts w:ascii="Arial" w:hAnsi="Arial"/>
+                <w:sz w:val="16"/>
+              </w:rPr>
               <w:t>0.604</w:t>
             </w:r>
           </w:p>
         </w:tc>
         <w:tc>
           <w:tcPr>
-            <w:tcW w:type="dxa" w:w="5040"/>
+            <w:tcW w:type="dxa" w:w="5760"/>
             <w:vAlign w:val="center"/>
             <w:tcMar>
               <w:top w:w="80" w:type="dxa"/>
-              <w:start w:w="120" w:type="dxa"/>
+              <w:start w:w="100" w:type="dxa"/>
               <w:bottom w:w="80" w:type="dxa"/>
-              <w:end w:w="120" w:type="dxa"/>
+              <w:end w:w="100" w:type="dxa"/>
             </w:tcMar>
           </w:tcPr>
           <w:p>
+            <w:pPr>
+              <w:spacing w:after="0"/>
+            </w:pPr>
             <w:r>
+              <w:rPr>
+                <w:rFonts w:ascii="Arial" w:hAnsi="Arial"/>
+                <w:sz w:val="16"/>
+              </w:rPr>
               <w:t>Closest SC-FMA preservation-with-decomposition approximation</w:t>
             </w:r>
           </w:p>
@@ -937,52 +2693,73 @@
       <w:tr>
         <w:tc>
           <w:tcPr>
-            <w:tcW w:type="dxa" w:w="2376"/>
+            <w:tcW w:type="dxa" w:w="2304"/>
             <w:vAlign w:val="center"/>
             <w:tcMar>
               <w:top w:w="80" w:type="dxa"/>
-              <w:start w:w="120" w:type="dxa"/>
+              <w:start w:w="100" w:type="dxa"/>
               <w:bottom w:w="80" w:type="dxa"/>
-              <w:end w:w="120" w:type="dxa"/>
+              <w:end w:w="100" w:type="dxa"/>
             </w:tcMar>
           </w:tcPr>
           <w:p>
+            <w:pPr>
+              <w:spacing w:after="0"/>
+            </w:pPr>
             <w:r>
+              <w:rPr>
+                <w:rFonts w:ascii="Arial" w:hAnsi="Arial"/>
+                <w:sz w:val="16"/>
+              </w:rPr>
               <w:t>SC-FMA QP</w:t>
             </w:r>
           </w:p>
         </w:tc>
         <w:tc>
           <w:tcPr>
-            <w:tcW w:type="dxa" w:w="1944"/>
+            <w:tcW w:type="dxa" w:w="1584"/>
             <w:vAlign w:val="center"/>
             <w:tcMar>
               <w:top w:w="80" w:type="dxa"/>
-              <w:start w:w="120" w:type="dxa"/>
+              <w:start w:w="100" w:type="dxa"/>
               <w:bottom w:w="80" w:type="dxa"/>
-              <w:end w:w="120" w:type="dxa"/>
+              <w:end w:w="100" w:type="dxa"/>
             </w:tcMar>
           </w:tcPr>
           <w:p>
+            <w:pPr>
+              <w:spacing w:after="0"/>
+            </w:pPr>
             <w:r>
-              <w:t>0.442</w:t>
+              <w:rPr>
+                <w:rFonts w:ascii="Arial" w:hAnsi="Arial"/>
+                <w:sz w:val="16"/>
+              </w:rPr>
+              <w:t>0.438</w:t>
             </w:r>
           </w:p>
         </w:tc>
         <w:tc>
           <w:tcPr>
-            <w:tcW w:type="dxa" w:w="5040"/>
+            <w:tcW w:type="dxa" w:w="5760"/>
             <w:vAlign w:val="center"/>
             <w:tcMar>
               <w:top w:w="80" w:type="dxa"/>
-              <w:start w:w="120" w:type="dxa"/>
+              <w:start w:w="100" w:type="dxa"/>
               <w:bottom w:w="80" w:type="dxa"/>
-              <w:end w:w="120" w:type="dxa"/>
+              <w:end w:w="100" w:type="dxa"/>
             </w:tcMar>
           </w:tcPr>
           <w:p>
+            <w:pPr>
+              <w:spacing w:after="0"/>
+            </w:pPr>
             <w:r>
-              <w:t>Downgraded on PRM800K; useful only when structural conflict is expected</w:t>
+              <w:rPr>
+                <w:rFonts w:ascii="Arial" w:hAnsi="Arial"/>
+                <w:sz w:val="16"/>
+              </w:rPr>
+              <w:t>Downgraded on PRM800K; reserved for structural-conflict settings</w:t>
             </w:r>
           </w:p>
         </w:tc>
@@ -990,52 +2767,73 @@
       <w:tr>
         <w:tc>
           <w:tcPr>
-            <w:tcW w:type="dxa" w:w="2376"/>
+            <w:tcW w:type="dxa" w:w="2304"/>
             <w:vAlign w:val="center"/>
             <w:tcMar>
               <w:top w:w="80" w:type="dxa"/>
-              <w:start w:w="120" w:type="dxa"/>
+              <w:start w:w="100" w:type="dxa"/>
               <w:bottom w:w="80" w:type="dxa"/>
-              <w:end w:w="120" w:type="dxa"/>
+              <w:end w:w="100" w:type="dxa"/>
             </w:tcMar>
           </w:tcPr>
           <w:p>
+            <w:pPr>
+              <w:spacing w:after="0"/>
+            </w:pPr>
             <w:r>
+              <w:rPr>
+                <w:rFonts w:ascii="Arial" w:hAnsi="Arial"/>
+                <w:sz w:val="16"/>
+              </w:rPr>
               <w:t>Raw local utility</w:t>
             </w:r>
           </w:p>
         </w:tc>
         <w:tc>
           <w:tcPr>
-            <w:tcW w:type="dxa" w:w="1944"/>
+            <w:tcW w:type="dxa" w:w="1584"/>
             <w:vAlign w:val="center"/>
             <w:tcMar>
               <w:top w:w="80" w:type="dxa"/>
-              <w:start w:w="120" w:type="dxa"/>
+              <w:start w:w="100" w:type="dxa"/>
               <w:bottom w:w="80" w:type="dxa"/>
-              <w:end w:w="120" w:type="dxa"/>
+              <w:end w:w="100" w:type="dxa"/>
             </w:tcMar>
           </w:tcPr>
           <w:p>
+            <w:pPr>
+              <w:spacing w:after="0"/>
+            </w:pPr>
             <w:r>
-              <w:t>-0.077</w:t>
+              <w:rPr>
+                <w:rFonts w:ascii="Arial" w:hAnsi="Arial"/>
+                <w:sz w:val="16"/>
+              </w:rPr>
+              <w:t>0.399</w:t>
             </w:r>
           </w:p>
         </w:tc>
         <w:tc>
           <w:tcPr>
-            <w:tcW w:type="dxa" w:w="5040"/>
+            <w:tcW w:type="dxa" w:w="5760"/>
             <w:vAlign w:val="center"/>
             <w:tcMar>
               <w:top w:w="80" w:type="dxa"/>
-              <w:start w:w="120" w:type="dxa"/>
+              <w:start w:w="100" w:type="dxa"/>
               <w:bottom w:w="80" w:type="dxa"/>
-              <w:end w:w="120" w:type="dxa"/>
+              <w:end w:w="100" w:type="dxa"/>
             </w:tcMar>
           </w:tcPr>
           <w:p>
+            <w:pPr>
+              <w:spacing w:after="0"/>
+            </w:pPr>
             <w:r>
-              <w:t>Insufficient alone for PRM800K annotation ordering</w:t>
+              <w:rPr>
+                <w:rFonts w:ascii="Arial" w:hAnsi="Arial"/>
+                <w:sz w:val="16"/>
+              </w:rPr>
+              <w:t>Weaker direct ranking baseline</w:t>
             </w:r>
           </w:p>
         </w:tc>
@@ -1043,52 +2841,73 @@
       <w:tr>
         <w:tc>
           <w:tcPr>
-            <w:tcW w:type="dxa" w:w="2376"/>
+            <w:tcW w:type="dxa" w:w="2304"/>
             <w:vAlign w:val="center"/>
             <w:tcMar>
               <w:top w:w="80" w:type="dxa"/>
-              <w:start w:w="120" w:type="dxa"/>
+              <w:start w:w="100" w:type="dxa"/>
               <w:bottom w:w="80" w:type="dxa"/>
-              <w:end w:w="120" w:type="dxa"/>
+              <w:end w:w="100" w:type="dxa"/>
             </w:tcMar>
           </w:tcPr>
           <w:p>
+            <w:pPr>
+              <w:spacing w:after="0"/>
+            </w:pPr>
             <w:r>
-              <w:t>Frozen PRM prefix score</w:t>
+              <w:rPr>
+                <w:rFonts w:ascii="Arial" w:hAnsi="Arial"/>
+                <w:sz w:val="16"/>
+              </w:rPr>
+              <w:t>Random</w:t>
             </w:r>
           </w:p>
         </w:tc>
         <w:tc>
           <w:tcPr>
-            <w:tcW w:type="dxa" w:w="1944"/>
+            <w:tcW w:type="dxa" w:w="1584"/>
             <w:vAlign w:val="center"/>
             <w:tcMar>
               <w:top w:w="80" w:type="dxa"/>
-              <w:start w:w="120" w:type="dxa"/>
+              <w:start w:w="100" w:type="dxa"/>
               <w:bottom w:w="80" w:type="dxa"/>
-              <w:end w:w="120" w:type="dxa"/>
+              <w:end w:w="100" w:type="dxa"/>
             </w:tcMar>
           </w:tcPr>
           <w:p>
+            <w:pPr>
+              <w:spacing w:after="0"/>
+            </w:pPr>
             <w:r>
-              <w:t>0.252</w:t>
+              <w:rPr>
+                <w:rFonts w:ascii="Arial" w:hAnsi="Arial"/>
+                <w:sz w:val="16"/>
+              </w:rPr>
+              <w:t>0.000</w:t>
             </w:r>
           </w:p>
         </w:tc>
         <w:tc>
           <w:tcPr>
-            <w:tcW w:type="dxa" w:w="5040"/>
+            <w:tcW w:type="dxa" w:w="5760"/>
             <w:vAlign w:val="center"/>
             <w:tcMar>
               <w:top w:w="80" w:type="dxa"/>
-              <w:start w:w="120" w:type="dxa"/>
+              <w:start w:w="100" w:type="dxa"/>
               <w:bottom w:w="80" w:type="dxa"/>
-              <w:end w:w="120" w:type="dxa"/>
+              <w:end w:w="100" w:type="dxa"/>
             </w:tcMar>
           </w:tcPr>
           <w:p>
+            <w:pPr>
+              <w:spacing w:after="0"/>
+            </w:pPr>
             <w:r>
-              <w:t>In-distribution baseline context only</w:t>
+              <w:rPr>
+                <w:rFonts w:ascii="Arial" w:hAnsi="Arial"/>
+                <w:sz w:val="16"/>
+              </w:rPr>
+              <w:t>Control</w:t>
             </w:r>
           </w:p>
         </w:tc>
@@ -1101,17 +2920,22 @@
       </w:pPr>
       <w:r>
         <w:rPr>
-          <w:color w:val="2E74B5"/>
+          <w:rFonts w:ascii="Arial" w:hAnsi="Arial"/>
+          <w:color w:val="1F4E79"/>
         </w:rPr>
         <w:t>WebQSP Fixed-Schema Trace-Audit Diagnostic</w:t>
       </w:r>
     </w:p>
     <w:p>
       <w:pPr>
-        <w:spacing w:after="120"/>
+        <w:spacing w:after="120" w:line="259" w:lineRule="auto"/>
       </w:pPr>
       <w:r>
-        <w:t>Development used 494 train traces and 2,964 steps. The locked diagnostic used 1,627 test traces and 9,762 steps. Data-audit counts for missing entities, disconnected subgraphs, duplicate traces, answer leakage, invalid traces, and replay failures were all zero.</w:t>
+        <w:rPr>
+          <w:rFonts w:ascii="Arial" w:hAnsi="Arial"/>
+          <w:sz w:val="19"/>
+        </w:rPr>
+        <w:t>Development used 494 train traces and 2,964 steps. The locked diagnostic used 1,627 test traces and 9,762 steps. Data-audit counts for missing entities, disconnected subgraphs, duplicate traces, and invalid logical forms are recorded before metric computation.</w:t>
       </w:r>
     </w:p>
     <w:tbl>
@@ -1123,28 +2947,30 @@
         <w:tblLook w:firstColumn="1" w:firstRow="1" w:lastColumn="0" w:lastRow="0" w:noHBand="0" w:noVBand="1" w:val="04A0"/>
       </w:tblPr>
       <w:tblGrid>
-        <w:gridCol w:w="2340"/>
-        <w:gridCol w:w="2340"/>
-        <w:gridCol w:w="2340"/>
-        <w:gridCol w:w="2340"/>
+        <w:gridCol w:w="2520"/>
+        <w:gridCol w:w="2520"/>
+        <w:gridCol w:w="2520"/>
+        <w:gridCol w:w="2520"/>
       </w:tblGrid>
       <w:tr>
         <w:tc>
           <w:tcPr>
-            <w:tcW w:type="dxa" w:w="2736"/>
+            <w:tcW w:type="dxa" w:w="2448"/>
+            <w:shd w:fill="D9EAF7"/>
             <w:vAlign w:val="center"/>
             <w:tcMar>
               <w:top w:w="80" w:type="dxa"/>
-              <w:start w:w="120" w:type="dxa"/>
+              <w:start w:w="100" w:type="dxa"/>
               <w:bottom w:w="80" w:type="dxa"/>
-              <w:end w:w="120" w:type="dxa"/>
+              <w:end w:w="100" w:type="dxa"/>
             </w:tcMar>
-            <w:shd w:fill="E8EEF5"/>
           </w:tcPr>
           <w:p>
             <w:r>
               <w:rPr>
+                <w:rFonts w:ascii="Arial" w:hAnsi="Arial"/>
                 <w:b/>
+                <w:sz w:val="17"/>
               </w:rPr>
               <w:t>Method</w:t>
             </w:r>
@@ -1152,20 +2978,22 @@
         </w:tc>
         <w:tc>
           <w:tcPr>
-            <w:tcW w:type="dxa" w:w="2016"/>
+            <w:tcW w:type="dxa" w:w="1728"/>
+            <w:shd w:fill="D9EAF7"/>
             <w:vAlign w:val="center"/>
             <w:tcMar>
               <w:top w:w="80" w:type="dxa"/>
-              <w:start w:w="120" w:type="dxa"/>
+              <w:start w:w="100" w:type="dxa"/>
               <w:bottom w:w="80" w:type="dxa"/>
-              <w:end w:w="120" w:type="dxa"/>
+              <w:end w:w="100" w:type="dxa"/>
             </w:tcMar>
-            <w:shd w:fill="E8EEF5"/>
           </w:tcPr>
           <w:p>
             <w:r>
               <w:rPr>
+                <w:rFonts w:ascii="Arial" w:hAnsi="Arial"/>
                 <w:b/>
+                <w:sz w:val="17"/>
               </w:rPr>
               <w:t>Spearman rho</w:t>
             </w:r>
@@ -1173,20 +3001,22 @@
         </w:tc>
         <w:tc>
           <w:tcPr>
-            <w:tcW w:type="dxa" w:w="2304"/>
+            <w:tcW w:type="dxa" w:w="1944"/>
+            <w:shd w:fill="D9EAF7"/>
             <w:vAlign w:val="center"/>
             <w:tcMar>
               <w:top w:w="80" w:type="dxa"/>
-              <w:start w:w="120" w:type="dxa"/>
+              <w:start w:w="100" w:type="dxa"/>
               <w:bottom w:w="80" w:type="dxa"/>
-              <w:end w:w="120" w:type="dxa"/>
+              <w:end w:w="100" w:type="dxa"/>
             </w:tcMar>
-            <w:shd w:fill="E8EEF5"/>
           </w:tcPr>
           <w:p>
             <w:r>
               <w:rPr>
+                <w:rFonts w:ascii="Arial" w:hAnsi="Arial"/>
                 <w:b/>
+                <w:sz w:val="17"/>
               </w:rPr>
               <w:t>Pairwise accuracy</w:t>
             </w:r>
@@ -1194,20 +3024,22 @@
         </w:tc>
         <w:tc>
           <w:tcPr>
-            <w:tcW w:type="dxa" w:w="2016"/>
+            <w:tcW w:type="dxa" w:w="1728"/>
+            <w:shd w:fill="D9EAF7"/>
             <w:vAlign w:val="center"/>
             <w:tcMar>
               <w:top w:w="80" w:type="dxa"/>
-              <w:start w:w="120" w:type="dxa"/>
+              <w:start w:w="100" w:type="dxa"/>
               <w:bottom w:w="80" w:type="dxa"/>
-              <w:end w:w="120" w:type="dxa"/>
+              <w:end w:w="100" w:type="dxa"/>
             </w:tcMar>
-            <w:shd w:fill="E8EEF5"/>
           </w:tcPr>
           <w:p>
             <w:r>
               <w:rPr>
+                <w:rFonts w:ascii="Arial" w:hAnsi="Arial"/>
                 <w:b/>
+                <w:sz w:val="17"/>
               </w:rPr>
               <w:t>NDCG@25%</w:t>
             </w:r>
@@ -1217,68 +3049,96 @@
       <w:tr>
         <w:tc>
           <w:tcPr>
-            <w:tcW w:type="dxa" w:w="2736"/>
+            <w:tcW w:type="dxa" w:w="2448"/>
             <w:vAlign w:val="center"/>
             <w:tcMar>
               <w:top w:w="80" w:type="dxa"/>
-              <w:start w:w="120" w:type="dxa"/>
+              <w:start w:w="100" w:type="dxa"/>
               <w:bottom w:w="80" w:type="dxa"/>
-              <w:end w:w="120" w:type="dxa"/>
+              <w:end w:w="100" w:type="dxa"/>
             </w:tcMar>
           </w:tcPr>
           <w:p>
+            <w:pPr>
+              <w:spacing w:after="0"/>
+            </w:pPr>
             <w:r>
+              <w:rPr>
+                <w:rFonts w:ascii="Arial" w:hAnsi="Arial"/>
+                <w:sz w:val="16"/>
+              </w:rPr>
               <w:t>Raw rule delta</w:t>
             </w:r>
           </w:p>
         </w:tc>
         <w:tc>
           <w:tcPr>
-            <w:tcW w:type="dxa" w:w="2016"/>
+            <w:tcW w:type="dxa" w:w="1728"/>
             <w:vAlign w:val="center"/>
             <w:tcMar>
               <w:top w:w="80" w:type="dxa"/>
-              <w:start w:w="120" w:type="dxa"/>
+              <w:start w:w="100" w:type="dxa"/>
               <w:bottom w:w="80" w:type="dxa"/>
-              <w:end w:w="120" w:type="dxa"/>
+              <w:end w:w="100" w:type="dxa"/>
             </w:tcMar>
           </w:tcPr>
           <w:p>
+            <w:pPr>
+              <w:spacing w:after="0"/>
+            </w:pPr>
             <w:r>
+              <w:rPr>
+                <w:rFonts w:ascii="Arial" w:hAnsi="Arial"/>
+                <w:sz w:val="16"/>
+              </w:rPr>
               <w:t>1.000</w:t>
             </w:r>
           </w:p>
         </w:tc>
         <w:tc>
           <w:tcPr>
-            <w:tcW w:type="dxa" w:w="2304"/>
+            <w:tcW w:type="dxa" w:w="1944"/>
             <w:vAlign w:val="center"/>
             <w:tcMar>
               <w:top w:w="80" w:type="dxa"/>
-              <w:start w:w="120" w:type="dxa"/>
+              <w:start w:w="100" w:type="dxa"/>
               <w:bottom w:w="80" w:type="dxa"/>
-              <w:end w:w="120" w:type="dxa"/>
+              <w:end w:w="100" w:type="dxa"/>
             </w:tcMar>
           </w:tcPr>
           <w:p>
+            <w:pPr>
+              <w:spacing w:after="0"/>
+            </w:pPr>
             <w:r>
+              <w:rPr>
+                <w:rFonts w:ascii="Arial" w:hAnsi="Arial"/>
+                <w:sz w:val="16"/>
+              </w:rPr>
               <w:t>1.000</w:t>
             </w:r>
           </w:p>
         </w:tc>
         <w:tc>
           <w:tcPr>
-            <w:tcW w:type="dxa" w:w="2016"/>
+            <w:tcW w:type="dxa" w:w="1728"/>
             <w:vAlign w:val="center"/>
             <w:tcMar>
               <w:top w:w="80" w:type="dxa"/>
-              <w:start w:w="120" w:type="dxa"/>
+              <w:start w:w="100" w:type="dxa"/>
               <w:bottom w:w="80" w:type="dxa"/>
-              <w:end w:w="120" w:type="dxa"/>
+              <w:end w:w="100" w:type="dxa"/>
             </w:tcMar>
           </w:tcPr>
           <w:p>
+            <w:pPr>
+              <w:spacing w:after="0"/>
+            </w:pPr>
             <w:r>
+              <w:rPr>
+                <w:rFonts w:ascii="Arial" w:hAnsi="Arial"/>
+                <w:sz w:val="16"/>
+              </w:rPr>
               <w:t>1.000</w:t>
             </w:r>
           </w:p>
@@ -1287,68 +3147,96 @@
       <w:tr>
         <w:tc>
           <w:tcPr>
-            <w:tcW w:type="dxa" w:w="2736"/>
+            <w:tcW w:type="dxa" w:w="2448"/>
             <w:vAlign w:val="center"/>
             <w:tcMar>
               <w:top w:w="80" w:type="dxa"/>
-              <w:start w:w="120" w:type="dxa"/>
+              <w:start w:w="100" w:type="dxa"/>
               <w:bottom w:w="80" w:type="dxa"/>
-              <w:end w:w="120" w:type="dxa"/>
+              <w:end w:w="100" w:type="dxa"/>
             </w:tcMar>
           </w:tcPr>
           <w:p>
+            <w:pPr>
+              <w:spacing w:after="0"/>
+            </w:pPr>
             <w:r>
+              <w:rPr>
+                <w:rFonts w:ascii="Arial" w:hAnsi="Arial"/>
+                <w:sz w:val="16"/>
+              </w:rPr>
               <w:t>SC-FMA Ridge</w:t>
             </w:r>
           </w:p>
         </w:tc>
         <w:tc>
           <w:tcPr>
-            <w:tcW w:type="dxa" w:w="2016"/>
+            <w:tcW w:type="dxa" w:w="1728"/>
             <w:vAlign w:val="center"/>
             <w:tcMar>
               <w:top w:w="80" w:type="dxa"/>
-              <w:start w:w="120" w:type="dxa"/>
+              <w:start w:w="100" w:type="dxa"/>
               <w:bottom w:w="80" w:type="dxa"/>
-              <w:end w:w="120" w:type="dxa"/>
+              <w:end w:w="100" w:type="dxa"/>
             </w:tcMar>
           </w:tcPr>
           <w:p>
+            <w:pPr>
+              <w:spacing w:after="0"/>
+            </w:pPr>
             <w:r>
+              <w:rPr>
+                <w:rFonts w:ascii="Arial" w:hAnsi="Arial"/>
+                <w:sz w:val="16"/>
+              </w:rPr>
               <w:t>0.878</w:t>
             </w:r>
           </w:p>
         </w:tc>
         <w:tc>
           <w:tcPr>
-            <w:tcW w:type="dxa" w:w="2304"/>
+            <w:tcW w:type="dxa" w:w="1944"/>
             <w:vAlign w:val="center"/>
             <w:tcMar>
               <w:top w:w="80" w:type="dxa"/>
-              <w:start w:w="120" w:type="dxa"/>
+              <w:start w:w="100" w:type="dxa"/>
               <w:bottom w:w="80" w:type="dxa"/>
-              <w:end w:w="120" w:type="dxa"/>
+              <w:end w:w="100" w:type="dxa"/>
             </w:tcMar>
           </w:tcPr>
           <w:p>
+            <w:pPr>
+              <w:spacing w:after="0"/>
+            </w:pPr>
             <w:r>
+              <w:rPr>
+                <w:rFonts w:ascii="Arial" w:hAnsi="Arial"/>
+                <w:sz w:val="16"/>
+              </w:rPr>
               <w:t>1.000</w:t>
             </w:r>
           </w:p>
         </w:tc>
         <w:tc>
           <w:tcPr>
-            <w:tcW w:type="dxa" w:w="2016"/>
+            <w:tcW w:type="dxa" w:w="1728"/>
             <w:vAlign w:val="center"/>
             <w:tcMar>
               <w:top w:w="80" w:type="dxa"/>
-              <w:start w:w="120" w:type="dxa"/>
+              <w:start w:w="100" w:type="dxa"/>
               <w:bottom w:w="80" w:type="dxa"/>
-              <w:end w:w="120" w:type="dxa"/>
+              <w:end w:w="100" w:type="dxa"/>
             </w:tcMar>
           </w:tcPr>
           <w:p>
+            <w:pPr>
+              <w:spacing w:after="0"/>
+            </w:pPr>
             <w:r>
+              <w:rPr>
+                <w:rFonts w:ascii="Arial" w:hAnsi="Arial"/>
+                <w:sz w:val="16"/>
+              </w:rPr>
               <w:t>1.000</w:t>
             </w:r>
           </w:p>
@@ -1357,138 +3245,96 @@
       <w:tr>
         <w:tc>
           <w:tcPr>
-            <w:tcW w:type="dxa" w:w="2736"/>
+            <w:tcW w:type="dxa" w:w="2448"/>
             <w:vAlign w:val="center"/>
             <w:tcMar>
               <w:top w:w="80" w:type="dxa"/>
-              <w:start w:w="120" w:type="dxa"/>
+              <w:start w:w="100" w:type="dxa"/>
               <w:bottom w:w="80" w:type="dxa"/>
-              <w:end w:w="120" w:type="dxa"/>
+              <w:end w:w="100" w:type="dxa"/>
             </w:tcMar>
           </w:tcPr>
           <w:p>
+            <w:pPr>
+              <w:spacing w:after="0"/>
+            </w:pPr>
             <w:r>
-              <w:t>SC-FMA QP</w:t>
-            </w:r>
-          </w:p>
-        </w:tc>
-        <w:tc>
-          <w:tcPr>
-            <w:tcW w:type="dxa" w:w="2016"/>
-            <w:vAlign w:val="center"/>
-            <w:tcMar>
-              <w:top w:w="80" w:type="dxa"/>
-              <w:start w:w="120" w:type="dxa"/>
-              <w:bottom w:w="80" w:type="dxa"/>
-              <w:end w:w="120" w:type="dxa"/>
-            </w:tcMar>
-          </w:tcPr>
-          <w:p>
-            <w:r>
-              <w:t>0.526</w:t>
-            </w:r>
-          </w:p>
-        </w:tc>
-        <w:tc>
-          <w:tcPr>
-            <w:tcW w:type="dxa" w:w="2304"/>
-            <w:vAlign w:val="center"/>
-            <w:tcMar>
-              <w:top w:w="80" w:type="dxa"/>
-              <w:start w:w="120" w:type="dxa"/>
-              <w:bottom w:w="80" w:type="dxa"/>
-              <w:end w:w="120" w:type="dxa"/>
-            </w:tcMar>
-          </w:tcPr>
-          <w:p>
-            <w:r>
-              <w:t>0.799</w:t>
-            </w:r>
-          </w:p>
-        </w:tc>
-        <w:tc>
-          <w:tcPr>
-            <w:tcW w:type="dxa" w:w="2016"/>
-            <w:vAlign w:val="center"/>
-            <w:tcMar>
-              <w:top w:w="80" w:type="dxa"/>
-              <w:start w:w="120" w:type="dxa"/>
-              <w:bottom w:w="80" w:type="dxa"/>
-              <w:end w:w="120" w:type="dxa"/>
-            </w:tcMar>
-          </w:tcPr>
-          <w:p>
-            <w:r>
-              <w:t>0.808</w:t>
-            </w:r>
-          </w:p>
-        </w:tc>
-      </w:tr>
-      <w:tr>
-        <w:tc>
-          <w:tcPr>
-            <w:tcW w:type="dxa" w:w="2736"/>
-            <w:vAlign w:val="center"/>
-            <w:tcMar>
-              <w:top w:w="80" w:type="dxa"/>
-              <w:start w:w="120" w:type="dxa"/>
-              <w:bottom w:w="80" w:type="dxa"/>
-              <w:end w:w="120" w:type="dxa"/>
-            </w:tcMar>
-          </w:tcPr>
-          <w:p>
-            <w:r>
+              <w:rPr>
+                <w:rFonts w:ascii="Arial" w:hAnsi="Arial"/>
+                <w:sz w:val="16"/>
+              </w:rPr>
               <w:t>Relative position</w:t>
             </w:r>
           </w:p>
         </w:tc>
         <w:tc>
           <w:tcPr>
-            <w:tcW w:type="dxa" w:w="2016"/>
+            <w:tcW w:type="dxa" w:w="1728"/>
             <w:vAlign w:val="center"/>
             <w:tcMar>
               <w:top w:w="80" w:type="dxa"/>
-              <w:start w:w="120" w:type="dxa"/>
+              <w:start w:w="100" w:type="dxa"/>
               <w:bottom w:w="80" w:type="dxa"/>
-              <w:end w:w="120" w:type="dxa"/>
+              <w:end w:w="100" w:type="dxa"/>
             </w:tcMar>
           </w:tcPr>
           <w:p>
+            <w:pPr>
+              <w:spacing w:after="0"/>
+            </w:pPr>
             <w:r>
-              <w:t>0.293</w:t>
+              <w:rPr>
+                <w:rFonts w:ascii="Arial" w:hAnsi="Arial"/>
+                <w:sz w:val="16"/>
+              </w:rPr>
+              <w:t>0.878</w:t>
             </w:r>
           </w:p>
         </w:tc>
         <w:tc>
           <w:tcPr>
-            <w:tcW w:type="dxa" w:w="2304"/>
+            <w:tcW w:type="dxa" w:w="1944"/>
             <w:vAlign w:val="center"/>
             <w:tcMar>
               <w:top w:w="80" w:type="dxa"/>
-              <w:start w:w="120" w:type="dxa"/>
+              <w:start w:w="100" w:type="dxa"/>
               <w:bottom w:w="80" w:type="dxa"/>
-              <w:end w:w="120" w:type="dxa"/>
+              <w:end w:w="100" w:type="dxa"/>
             </w:tcMar>
           </w:tcPr>
           <w:p>
+            <w:pPr>
+              <w:spacing w:after="0"/>
+            </w:pPr>
             <w:r>
+              <w:rPr>
+                <w:rFonts w:ascii="Arial" w:hAnsi="Arial"/>
+                <w:sz w:val="16"/>
+              </w:rPr>
               <w:t>0.667</w:t>
             </w:r>
           </w:p>
         </w:tc>
         <w:tc>
           <w:tcPr>
-            <w:tcW w:type="dxa" w:w="2016"/>
+            <w:tcW w:type="dxa" w:w="1728"/>
             <w:vAlign w:val="center"/>
             <w:tcMar>
               <w:top w:w="80" w:type="dxa"/>
-              <w:start w:w="120" w:type="dxa"/>
+              <w:start w:w="100" w:type="dxa"/>
               <w:bottom w:w="80" w:type="dxa"/>
-              <w:end w:w="120" w:type="dxa"/>
+              <w:end w:w="100" w:type="dxa"/>
             </w:tcMar>
           </w:tcPr>
           <w:p>
+            <w:pPr>
+              <w:spacing w:after="0"/>
+            </w:pPr>
             <w:r>
+              <w:rPr>
+                <w:rFonts w:ascii="Arial" w:hAnsi="Arial"/>
+                <w:sz w:val="16"/>
+              </w:rPr>
               <w:t>1.000</w:t>
             </w:r>
           </w:p>
@@ -1497,69 +3343,97 @@
       <w:tr>
         <w:tc>
           <w:tcPr>
-            <w:tcW w:type="dxa" w:w="2736"/>
+            <w:tcW w:type="dxa" w:w="2448"/>
             <w:vAlign w:val="center"/>
             <w:tcMar>
               <w:top w:w="80" w:type="dxa"/>
-              <w:start w:w="120" w:type="dxa"/>
+              <w:start w:w="100" w:type="dxa"/>
               <w:bottom w:w="80" w:type="dxa"/>
-              <w:end w:w="120" w:type="dxa"/>
+              <w:end w:w="100" w:type="dxa"/>
             </w:tcMar>
           </w:tcPr>
           <w:p>
+            <w:pPr>
+              <w:spacing w:after="0"/>
+            </w:pPr>
             <w:r>
-              <w:t>Random</w:t>
+              <w:rPr>
+                <w:rFonts w:ascii="Arial" w:hAnsi="Arial"/>
+                <w:sz w:val="16"/>
+              </w:rPr>
+              <w:t>SC-FMA QP</w:t>
             </w:r>
           </w:p>
         </w:tc>
         <w:tc>
           <w:tcPr>
-            <w:tcW w:type="dxa" w:w="2016"/>
+            <w:tcW w:type="dxa" w:w="1728"/>
             <w:vAlign w:val="center"/>
             <w:tcMar>
               <w:top w:w="80" w:type="dxa"/>
-              <w:start w:w="120" w:type="dxa"/>
+              <w:start w:w="100" w:type="dxa"/>
               <w:bottom w:w="80" w:type="dxa"/>
-              <w:end w:w="120" w:type="dxa"/>
+              <w:end w:w="100" w:type="dxa"/>
             </w:tcMar>
           </w:tcPr>
           <w:p>
+            <w:pPr>
+              <w:spacing w:after="0"/>
+            </w:pPr>
             <w:r>
-              <w:t>-0.007</w:t>
+              <w:rPr>
+                <w:rFonts w:ascii="Arial" w:hAnsi="Arial"/>
+                <w:sz w:val="16"/>
+              </w:rPr>
+              <w:t>0.293</w:t>
             </w:r>
           </w:p>
         </w:tc>
         <w:tc>
           <w:tcPr>
-            <w:tcW w:type="dxa" w:w="2304"/>
+            <w:tcW w:type="dxa" w:w="1944"/>
             <w:vAlign w:val="center"/>
             <w:tcMar>
               <w:top w:w="80" w:type="dxa"/>
-              <w:start w:w="120" w:type="dxa"/>
+              <w:start w:w="100" w:type="dxa"/>
               <w:bottom w:w="80" w:type="dxa"/>
-              <w:end w:w="120" w:type="dxa"/>
+              <w:end w:w="100" w:type="dxa"/>
             </w:tcMar>
           </w:tcPr>
           <w:p>
+            <w:pPr>
+              <w:spacing w:after="0"/>
+            </w:pPr>
             <w:r>
-              <w:t>0.496</w:t>
+              <w:rPr>
+                <w:rFonts w:ascii="Arial" w:hAnsi="Arial"/>
+                <w:sz w:val="16"/>
+              </w:rPr>
+              <w:t>0.556</w:t>
             </w:r>
           </w:p>
         </w:tc>
         <w:tc>
           <w:tcPr>
-            <w:tcW w:type="dxa" w:w="2016"/>
+            <w:tcW w:type="dxa" w:w="1728"/>
             <w:vAlign w:val="center"/>
             <w:tcMar>
               <w:top w:w="80" w:type="dxa"/>
-              <w:start w:w="120" w:type="dxa"/>
+              <w:start w:w="100" w:type="dxa"/>
               <w:bottom w:w="80" w:type="dxa"/>
-              <w:end w:w="120" w:type="dxa"/>
+              <w:end w:w="100" w:type="dxa"/>
             </w:tcMar>
           </w:tcPr>
           <w:p>
+            <w:pPr>
+              <w:spacing w:after="0"/>
+            </w:pPr>
             <w:r>
-              <w:t>0.582</w:t>
+              <w:rPr>
+                <w:rFonts w:ascii="Arial" w:hAnsi="Arial"/>
+                <w:sz w:val="16"/>
+              </w:rPr>
+              <w:t>0.613</w:t>
             </w:r>
           </w:p>
         </w:tc>
@@ -1567,69 +3441,195 @@
       <w:tr>
         <w:tc>
           <w:tcPr>
-            <w:tcW w:type="dxa" w:w="2736"/>
+            <w:tcW w:type="dxa" w:w="2448"/>
             <w:vAlign w:val="center"/>
             <w:tcMar>
               <w:top w:w="80" w:type="dxa"/>
-              <w:start w:w="120" w:type="dxa"/>
+              <w:start w:w="100" w:type="dxa"/>
               <w:bottom w:w="80" w:type="dxa"/>
-              <w:end w:w="120" w:type="dxa"/>
+              <w:end w:w="100" w:type="dxa"/>
             </w:tcMar>
           </w:tcPr>
           <w:p>
+            <w:pPr>
+              <w:spacing w:after="0"/>
+            </w:pPr>
             <w:r>
+              <w:rPr>
+                <w:rFonts w:ascii="Arial" w:hAnsi="Arial"/>
+                <w:sz w:val="16"/>
+              </w:rPr>
               <w:t>Graph degree</w:t>
             </w:r>
           </w:p>
         </w:tc>
         <w:tc>
           <w:tcPr>
-            <w:tcW w:type="dxa" w:w="2016"/>
+            <w:tcW w:type="dxa" w:w="1728"/>
             <w:vAlign w:val="center"/>
             <w:tcMar>
               <w:top w:w="80" w:type="dxa"/>
-              <w:start w:w="120" w:type="dxa"/>
+              <w:start w:w="100" w:type="dxa"/>
               <w:bottom w:w="80" w:type="dxa"/>
-              <w:end w:w="120" w:type="dxa"/>
+              <w:end w:w="100" w:type="dxa"/>
             </w:tcMar>
           </w:tcPr>
           <w:p>
+            <w:pPr>
+              <w:spacing w:after="0"/>
+            </w:pPr>
             <w:r>
-              <w:t>-0.726</w:t>
+              <w:rPr>
+                <w:rFonts w:ascii="Arial" w:hAnsi="Arial"/>
+                <w:sz w:val="16"/>
+              </w:rPr>
+              <w:t>-0.878</w:t>
             </w:r>
           </w:p>
         </w:tc>
         <w:tc>
           <w:tcPr>
-            <w:tcW w:type="dxa" w:w="2304"/>
+            <w:tcW w:type="dxa" w:w="1944"/>
             <w:vAlign w:val="center"/>
             <w:tcMar>
               <w:top w:w="80" w:type="dxa"/>
-              <w:start w:w="120" w:type="dxa"/>
+              <w:start w:w="100" w:type="dxa"/>
               <w:bottom w:w="80" w:type="dxa"/>
-              <w:end w:w="120" w:type="dxa"/>
+              <w:end w:w="100" w:type="dxa"/>
             </w:tcMar>
           </w:tcPr>
           <w:p>
+            <w:pPr>
+              <w:spacing w:after="0"/>
+            </w:pPr>
             <w:r>
+              <w:rPr>
+                <w:rFonts w:ascii="Arial" w:hAnsi="Arial"/>
+                <w:sz w:val="16"/>
+              </w:rPr>
               <w:t>0.111</w:t>
             </w:r>
           </w:p>
         </w:tc>
         <w:tc>
           <w:tcPr>
-            <w:tcW w:type="dxa" w:w="2016"/>
+            <w:tcW w:type="dxa" w:w="1728"/>
             <w:vAlign w:val="center"/>
             <w:tcMar>
               <w:top w:w="80" w:type="dxa"/>
-              <w:start w:w="120" w:type="dxa"/>
+              <w:start w:w="100" w:type="dxa"/>
               <w:bottom w:w="80" w:type="dxa"/>
-              <w:end w:w="120" w:type="dxa"/>
+              <w:end w:w="100" w:type="dxa"/>
             </w:tcMar>
           </w:tcPr>
           <w:p>
+            <w:pPr>
+              <w:spacing w:after="0"/>
+            </w:pPr>
             <w:r>
-              <w:t>0.493</w:t>
+              <w:rPr>
+                <w:rFonts w:ascii="Arial" w:hAnsi="Arial"/>
+                <w:sz w:val="16"/>
+              </w:rPr>
+              <w:t>0.387</w:t>
+            </w:r>
+          </w:p>
+        </w:tc>
+      </w:tr>
+      <w:tr>
+        <w:tc>
+          <w:tcPr>
+            <w:tcW w:type="dxa" w:w="2448"/>
+            <w:vAlign w:val="center"/>
+            <w:tcMar>
+              <w:top w:w="80" w:type="dxa"/>
+              <w:start w:w="100" w:type="dxa"/>
+              <w:bottom w:w="80" w:type="dxa"/>
+              <w:end w:w="100" w:type="dxa"/>
+            </w:tcMar>
+          </w:tcPr>
+          <w:p>
+            <w:pPr>
+              <w:spacing w:after="0"/>
+            </w:pPr>
+            <w:r>
+              <w:rPr>
+                <w:rFonts w:ascii="Arial" w:hAnsi="Arial"/>
+                <w:sz w:val="16"/>
+              </w:rPr>
+              <w:t>Random</w:t>
+            </w:r>
+          </w:p>
+        </w:tc>
+        <w:tc>
+          <w:tcPr>
+            <w:tcW w:type="dxa" w:w="1728"/>
+            <w:vAlign w:val="center"/>
+            <w:tcMar>
+              <w:top w:w="80" w:type="dxa"/>
+              <w:start w:w="100" w:type="dxa"/>
+              <w:bottom w:w="80" w:type="dxa"/>
+              <w:end w:w="100" w:type="dxa"/>
+            </w:tcMar>
+          </w:tcPr>
+          <w:p>
+            <w:pPr>
+              <w:spacing w:after="0"/>
+            </w:pPr>
+            <w:r>
+              <w:rPr>
+                <w:rFonts w:ascii="Arial" w:hAnsi="Arial"/>
+                <w:sz w:val="16"/>
+              </w:rPr>
+              <w:t>0.000</w:t>
+            </w:r>
+          </w:p>
+        </w:tc>
+        <w:tc>
+          <w:tcPr>
+            <w:tcW w:type="dxa" w:w="1944"/>
+            <w:vAlign w:val="center"/>
+            <w:tcMar>
+              <w:top w:w="80" w:type="dxa"/>
+              <w:start w:w="100" w:type="dxa"/>
+              <w:bottom w:w="80" w:type="dxa"/>
+              <w:end w:w="100" w:type="dxa"/>
+            </w:tcMar>
+          </w:tcPr>
+          <w:p>
+            <w:pPr>
+              <w:spacing w:after="0"/>
+            </w:pPr>
+            <w:r>
+              <w:rPr>
+                <w:rFonts w:ascii="Arial" w:hAnsi="Arial"/>
+                <w:sz w:val="16"/>
+              </w:rPr>
+              <w:t>0.500</w:t>
+            </w:r>
+          </w:p>
+        </w:tc>
+        <w:tc>
+          <w:tcPr>
+            <w:tcW w:type="dxa" w:w="1728"/>
+            <w:vAlign w:val="center"/>
+            <w:tcMar>
+              <w:top w:w="80" w:type="dxa"/>
+              <w:start w:w="100" w:type="dxa"/>
+              <w:bottom w:w="80" w:type="dxa"/>
+              <w:end w:w="100" w:type="dxa"/>
+            </w:tcMar>
+          </w:tcPr>
+          <w:p>
+            <w:pPr>
+              <w:spacing w:after="0"/>
+            </w:pPr>
+            <w:r>
+              <w:rPr>
+                <w:rFonts w:ascii="Arial" w:hAnsi="Arial"/>
+                <w:sz w:val="16"/>
+              </w:rPr>
+              <w:t>0.500</w:t>
             </w:r>
           </w:p>
         </w:tc>
@@ -1638,10 +3638,14 @@
     <w:p/>
     <w:p>
       <w:pPr>
-        <w:spacing w:after="120"/>
+        <w:spacing w:after="120" w:line="259" w:lineRule="auto"/>
       </w:pPr>
       <w:r>
-        <w:t>Safe interpretation: the fixed six-step schema makes replay-derived importance largely separable by step role and position, making complex policy optimization redundant under this schema. This is a transferability and evaluation-confound diagnostic, not evidence that SC-FMA improves KGQA, semantic parsing, or deployed KBS maintenance.</w:t>
+        <w:rPr>
+          <w:rFonts w:ascii="Arial" w:hAnsi="Arial"/>
+          <w:sz w:val="19"/>
+        </w:rPr>
+        <w:t>Safe interpretation: the fixed six-step schema makes replay-derived importance largely separable by step role and position, making complex policy optimization redundant under this schema. This is a transferability and evaluation-confound diagnostic, not evidence that SC-FMA improves KGQA, semantic parsing, or live KBS maintenance.</w:t>
       </w:r>
     </w:p>
     <w:p>
@@ -1650,17 +3654,22 @@
       </w:pPr>
       <w:r>
         <w:rPr>
-          <w:color w:val="2E74B5"/>
+          <w:rFonts w:ascii="Arial" w:hAnsi="Arial"/>
+          <w:color w:val="1F4E79"/>
         </w:rPr>
         <w:t>MuSiQue KBS-Style Knowledge-Audit Details</w:t>
       </w:r>
     </w:p>
     <w:p>
       <w:pPr>
-        <w:spacing w:after="120"/>
+        <w:spacing w:after="120" w:line="259" w:lineRule="auto"/>
       </w:pPr>
       <w:r>
-        <w:t>The MuSiQue route constructs trace records from decomposition evidence chains. The locked split contains 1,415 samples and 12,715 steps. No API calls are used. The field-level leakage audit is clean, but construction-level homology remains: labels and scoring features share step_type.</w:t>
+        <w:rPr>
+          <w:rFonts w:ascii="Arial" w:hAnsi="Arial"/>
+          <w:sz w:val="19"/>
+        </w:rPr>
+        <w:t>The MuSiQue route constructs trace records from decomposition evidence chains. The locked split contains 1,415 samples and 12,715 steps. No API calls are used. The field-level leakage check marks the route as feasibility-only because labels and scoring features share deterministic step-type sources.</w:t>
       </w:r>
     </w:p>
     <w:tbl>
@@ -1672,29 +3681,31 @@
         <w:tblLook w:firstColumn="1" w:firstRow="1" w:lastColumn="0" w:lastRow="0" w:noHBand="0" w:noVBand="1" w:val="04A0"/>
       </w:tblPr>
       <w:tblGrid>
-        <w:gridCol w:w="1872"/>
-        <w:gridCol w:w="1872"/>
-        <w:gridCol w:w="1872"/>
-        <w:gridCol w:w="1872"/>
-        <w:gridCol w:w="1872"/>
+        <w:gridCol w:w="2016"/>
+        <w:gridCol w:w="2016"/>
+        <w:gridCol w:w="2016"/>
+        <w:gridCol w:w="2016"/>
+        <w:gridCol w:w="2016"/>
       </w:tblGrid>
       <w:tr>
         <w:tc>
           <w:tcPr>
-            <w:tcW w:type="dxa" w:w="2448"/>
+            <w:tcW w:type="dxa" w:w="1944"/>
+            <w:shd w:fill="D9EAF7"/>
             <w:vAlign w:val="center"/>
             <w:tcMar>
               <w:top w:w="80" w:type="dxa"/>
-              <w:start w:w="120" w:type="dxa"/>
+              <w:start w:w="100" w:type="dxa"/>
               <w:bottom w:w="80" w:type="dxa"/>
-              <w:end w:w="120" w:type="dxa"/>
+              <w:end w:w="100" w:type="dxa"/>
             </w:tcMar>
-            <w:shd w:fill="E8EEF5"/>
           </w:tcPr>
           <w:p>
             <w:r>
               <w:rPr>
+                <w:rFonts w:ascii="Arial" w:hAnsi="Arial"/>
                 <w:b/>
+                <w:sz w:val="17"/>
               </w:rPr>
               <w:t>Method</w:t>
             </w:r>
@@ -1702,20 +3713,22 @@
         </w:tc>
         <w:tc>
           <w:tcPr>
-            <w:tcW w:type="dxa" w:w="1800"/>
+            <w:tcW w:type="dxa" w:w="1440"/>
+            <w:shd w:fill="D9EAF7"/>
             <w:vAlign w:val="center"/>
             <w:tcMar>
               <w:top w:w="80" w:type="dxa"/>
-              <w:start w:w="120" w:type="dxa"/>
+              <w:start w:w="100" w:type="dxa"/>
               <w:bottom w:w="80" w:type="dxa"/>
-              <w:end w:w="120" w:type="dxa"/>
+              <w:end w:w="100" w:type="dxa"/>
             </w:tcMar>
-            <w:shd w:fill="E8EEF5"/>
           </w:tcPr>
           <w:p>
             <w:r>
               <w:rPr>
+                <w:rFonts w:ascii="Arial" w:hAnsi="Arial"/>
                 <w:b/>
+                <w:sz w:val="17"/>
               </w:rPr>
               <w:t>Spearman rho</w:t>
             </w:r>
@@ -1723,20 +3736,22 @@
         </w:tc>
         <w:tc>
           <w:tcPr>
-            <w:tcW w:type="dxa" w:w="1656"/>
+            <w:tcW w:type="dxa" w:w="1152"/>
+            <w:shd w:fill="D9EAF7"/>
             <w:vAlign w:val="center"/>
             <w:tcMar>
               <w:top w:w="80" w:type="dxa"/>
-              <w:start w:w="120" w:type="dxa"/>
+              <w:start w:w="100" w:type="dxa"/>
               <w:bottom w:w="80" w:type="dxa"/>
-              <w:end w:w="120" w:type="dxa"/>
+              <w:end w:w="100" w:type="dxa"/>
             </w:tcMar>
-            <w:shd w:fill="E8EEF5"/>
           </w:tcPr>
           <w:p>
             <w:r>
               <w:rPr>
+                <w:rFonts w:ascii="Arial" w:hAnsi="Arial"/>
                 <w:b/>
+                <w:sz w:val="17"/>
               </w:rPr>
               <w:t>Top-1 hit</w:t>
             </w:r>
@@ -1744,20 +3759,22 @@
         </w:tc>
         <w:tc>
           <w:tcPr>
-            <w:tcW w:type="dxa" w:w="1656"/>
+            <w:tcW w:type="dxa" w:w="1368"/>
+            <w:shd w:fill="D9EAF7"/>
             <w:vAlign w:val="center"/>
             <w:tcMar>
               <w:top w:w="80" w:type="dxa"/>
-              <w:start w:w="120" w:type="dxa"/>
+              <w:start w:w="100" w:type="dxa"/>
               <w:bottom w:w="80" w:type="dxa"/>
-              <w:end w:w="120" w:type="dxa"/>
+              <w:end w:w="100" w:type="dxa"/>
             </w:tcMar>
-            <w:shd w:fill="E8EEF5"/>
           </w:tcPr>
           <w:p>
             <w:r>
               <w:rPr>
+                <w:rFonts w:ascii="Arial" w:hAnsi="Arial"/>
                 <w:b/>
+                <w:sz w:val="17"/>
               </w:rPr>
               <w:t>NDCG@25%</w:t>
             </w:r>
@@ -1765,20 +3782,22 @@
         </w:tc>
         <w:tc>
           <w:tcPr>
-            <w:tcW w:type="dxa" w:w="1800"/>
+            <w:tcW w:type="dxa" w:w="1944"/>
+            <w:shd w:fill="D9EAF7"/>
             <w:vAlign w:val="center"/>
             <w:tcMar>
               <w:top w:w="80" w:type="dxa"/>
-              <w:start w:w="120" w:type="dxa"/>
+              <w:start w:w="100" w:type="dxa"/>
               <w:bottom w:w="80" w:type="dxa"/>
-              <w:end w:w="120" w:type="dxa"/>
+              <w:end w:w="100" w:type="dxa"/>
             </w:tcMar>
-            <w:shd w:fill="E8EEF5"/>
           </w:tcPr>
           <w:p>
             <w:r>
               <w:rPr>
+                <w:rFonts w:ascii="Arial" w:hAnsi="Arial"/>
                 <w:b/>
+                <w:sz w:val="17"/>
               </w:rPr>
               <w:t>Boundary</w:t>
             </w:r>
@@ -1788,85 +3807,120 @@
       <w:tr>
         <w:tc>
           <w:tcPr>
-            <w:tcW w:type="dxa" w:w="2448"/>
+            <w:tcW w:type="dxa" w:w="1944"/>
             <w:vAlign w:val="center"/>
             <w:tcMar>
               <w:top w:w="80" w:type="dxa"/>
-              <w:start w:w="120" w:type="dxa"/>
+              <w:start w:w="100" w:type="dxa"/>
               <w:bottom w:w="80" w:type="dxa"/>
-              <w:end w:w="120" w:type="dxa"/>
+              <w:end w:w="100" w:type="dxa"/>
             </w:tcMar>
           </w:tcPr>
           <w:p>
+            <w:pPr>
+              <w:spacing w:after="0"/>
+            </w:pPr>
             <w:r>
+              <w:rPr>
+                <w:rFonts w:ascii="Arial" w:hAnsi="Arial"/>
+                <w:sz w:val="16"/>
+              </w:rPr>
               <w:t>w_struct</w:t>
             </w:r>
           </w:p>
         </w:tc>
         <w:tc>
           <w:tcPr>
-            <w:tcW w:type="dxa" w:w="1800"/>
+            <w:tcW w:type="dxa" w:w="1440"/>
             <w:vAlign w:val="center"/>
             <w:tcMar>
               <w:top w:w="80" w:type="dxa"/>
-              <w:start w:w="120" w:type="dxa"/>
+              <w:start w:w="100" w:type="dxa"/>
               <w:bottom w:w="80" w:type="dxa"/>
-              <w:end w:w="120" w:type="dxa"/>
+              <w:end w:w="100" w:type="dxa"/>
             </w:tcMar>
           </w:tcPr>
           <w:p>
+            <w:pPr>
+              <w:spacing w:after="0"/>
+            </w:pPr>
             <w:r>
+              <w:rPr>
+                <w:rFonts w:ascii="Arial" w:hAnsi="Arial"/>
+                <w:sz w:val="16"/>
+              </w:rPr>
               <w:t>0.9652</w:t>
             </w:r>
           </w:p>
         </w:tc>
         <w:tc>
           <w:tcPr>
-            <w:tcW w:type="dxa" w:w="1656"/>
+            <w:tcW w:type="dxa" w:w="1152"/>
             <w:vAlign w:val="center"/>
             <w:tcMar>
               <w:top w:w="80" w:type="dxa"/>
-              <w:start w:w="120" w:type="dxa"/>
+              <w:start w:w="100" w:type="dxa"/>
               <w:bottom w:w="80" w:type="dxa"/>
-              <w:end w:w="120" w:type="dxa"/>
+              <w:end w:w="100" w:type="dxa"/>
             </w:tcMar>
           </w:tcPr>
           <w:p>
+            <w:pPr>
+              <w:spacing w:after="0"/>
+            </w:pPr>
             <w:r>
+              <w:rPr>
+                <w:rFonts w:ascii="Arial" w:hAnsi="Arial"/>
+                <w:sz w:val="16"/>
+              </w:rPr>
               <w:t>1.0000</w:t>
             </w:r>
           </w:p>
         </w:tc>
         <w:tc>
           <w:tcPr>
-            <w:tcW w:type="dxa" w:w="1656"/>
+            <w:tcW w:type="dxa" w:w="1368"/>
             <w:vAlign w:val="center"/>
             <w:tcMar>
               <w:top w:w="80" w:type="dxa"/>
-              <w:start w:w="120" w:type="dxa"/>
+              <w:start w:w="100" w:type="dxa"/>
               <w:bottom w:w="80" w:type="dxa"/>
-              <w:end w:w="120" w:type="dxa"/>
+              <w:end w:w="100" w:type="dxa"/>
             </w:tcMar>
           </w:tcPr>
           <w:p>
+            <w:pPr>
+              <w:spacing w:after="0"/>
+            </w:pPr>
             <w:r>
+              <w:rPr>
+                <w:rFonts w:ascii="Arial" w:hAnsi="Arial"/>
+                <w:sz w:val="16"/>
+              </w:rPr>
               <w:t>1.0000</w:t>
             </w:r>
           </w:p>
         </w:tc>
         <w:tc>
           <w:tcPr>
-            <w:tcW w:type="dxa" w:w="1800"/>
+            <w:tcW w:type="dxa" w:w="1944"/>
             <w:vAlign w:val="center"/>
             <w:tcMar>
               <w:top w:w="80" w:type="dxa"/>
-              <w:start w:w="120" w:type="dxa"/>
+              <w:start w:w="100" w:type="dxa"/>
               <w:bottom w:w="80" w:type="dxa"/>
-              <w:end w:w="120" w:type="dxa"/>
+              <w:end w:w="100" w:type="dxa"/>
             </w:tcMar>
           </w:tcPr>
           <w:p>
+            <w:pPr>
+              <w:spacing w:after="0"/>
+            </w:pPr>
             <w:r>
+              <w:rPr>
+                <w:rFonts w:ascii="Arial" w:hAnsi="Arial"/>
+                <w:sz w:val="16"/>
+              </w:rPr>
               <w:t>feasibility only</w:t>
             </w:r>
           </w:p>
@@ -1875,85 +3929,120 @@
       <w:tr>
         <w:tc>
           <w:tcPr>
-            <w:tcW w:type="dxa" w:w="2448"/>
+            <w:tcW w:type="dxa" w:w="1944"/>
             <w:vAlign w:val="center"/>
             <w:tcMar>
               <w:top w:w="80" w:type="dxa"/>
-              <w:start w:w="120" w:type="dxa"/>
+              <w:start w:w="100" w:type="dxa"/>
               <w:bottom w:w="80" w:type="dxa"/>
-              <w:end w:w="120" w:type="dxa"/>
+              <w:end w:w="100" w:type="dxa"/>
             </w:tcMar>
           </w:tcPr>
           <w:p>
+            <w:pPr>
+              <w:spacing w:after="0"/>
+            </w:pPr>
             <w:r>
+              <w:rPr>
+                <w:rFonts w:ascii="Arial" w:hAnsi="Arial"/>
+                <w:sz w:val="16"/>
+              </w:rPr>
               <w:t>SC-FMA Ridge</w:t>
             </w:r>
           </w:p>
         </w:tc>
         <w:tc>
           <w:tcPr>
-            <w:tcW w:type="dxa" w:w="1800"/>
+            <w:tcW w:type="dxa" w:w="1440"/>
             <w:vAlign w:val="center"/>
             <w:tcMar>
               <w:top w:w="80" w:type="dxa"/>
-              <w:start w:w="120" w:type="dxa"/>
+              <w:start w:w="100" w:type="dxa"/>
               <w:bottom w:w="80" w:type="dxa"/>
-              <w:end w:w="120" w:type="dxa"/>
+              <w:end w:w="100" w:type="dxa"/>
             </w:tcMar>
           </w:tcPr>
           <w:p>
+            <w:pPr>
+              <w:spacing w:after="0"/>
+            </w:pPr>
             <w:r>
+              <w:rPr>
+                <w:rFonts w:ascii="Arial" w:hAnsi="Arial"/>
+                <w:sz w:val="16"/>
+              </w:rPr>
               <w:t>0.9653</w:t>
             </w:r>
           </w:p>
         </w:tc>
         <w:tc>
           <w:tcPr>
-            <w:tcW w:type="dxa" w:w="1656"/>
+            <w:tcW w:type="dxa" w:w="1152"/>
             <w:vAlign w:val="center"/>
             <w:tcMar>
               <w:top w:w="80" w:type="dxa"/>
-              <w:start w:w="120" w:type="dxa"/>
+              <w:start w:w="100" w:type="dxa"/>
               <w:bottom w:w="80" w:type="dxa"/>
-              <w:end w:w="120" w:type="dxa"/>
+              <w:end w:w="100" w:type="dxa"/>
             </w:tcMar>
           </w:tcPr>
           <w:p>
+            <w:pPr>
+              <w:spacing w:after="0"/>
+            </w:pPr>
             <w:r>
+              <w:rPr>
+                <w:rFonts w:ascii="Arial" w:hAnsi="Arial"/>
+                <w:sz w:val="16"/>
+              </w:rPr>
               <w:t>1.0000</w:t>
             </w:r>
           </w:p>
         </w:tc>
         <w:tc>
           <w:tcPr>
-            <w:tcW w:type="dxa" w:w="1656"/>
+            <w:tcW w:type="dxa" w:w="1368"/>
             <w:vAlign w:val="center"/>
             <w:tcMar>
               <w:top w:w="80" w:type="dxa"/>
-              <w:start w:w="120" w:type="dxa"/>
+              <w:start w:w="100" w:type="dxa"/>
               <w:bottom w:w="80" w:type="dxa"/>
-              <w:end w:w="120" w:type="dxa"/>
+              <w:end w:w="100" w:type="dxa"/>
             </w:tcMar>
           </w:tcPr>
           <w:p>
+            <w:pPr>
+              <w:spacing w:after="0"/>
+            </w:pPr>
             <w:r>
+              <w:rPr>
+                <w:rFonts w:ascii="Arial" w:hAnsi="Arial"/>
+                <w:sz w:val="16"/>
+              </w:rPr>
               <w:t>1.0000</w:t>
             </w:r>
           </w:p>
         </w:tc>
         <w:tc>
           <w:tcPr>
-            <w:tcW w:type="dxa" w:w="1800"/>
+            <w:tcW w:type="dxa" w:w="1944"/>
             <w:vAlign w:val="center"/>
             <w:tcMar>
               <w:top w:w="80" w:type="dxa"/>
-              <w:start w:w="120" w:type="dxa"/>
+              <w:start w:w="100" w:type="dxa"/>
               <w:bottom w:w="80" w:type="dxa"/>
-              <w:end w:w="120" w:type="dxa"/>
+              <w:end w:w="100" w:type="dxa"/>
             </w:tcMar>
           </w:tcPr>
           <w:p>
+            <w:pPr>
+              <w:spacing w:after="0"/>
+            </w:pPr>
             <w:r>
+              <w:rPr>
+                <w:rFonts w:ascii="Arial" w:hAnsi="Arial"/>
+                <w:sz w:val="16"/>
+              </w:rPr>
               <w:t>feasibility only</w:t>
             </w:r>
           </w:p>
@@ -1962,85 +4051,120 @@
       <w:tr>
         <w:tc>
           <w:tcPr>
-            <w:tcW w:type="dxa" w:w="2448"/>
+            <w:tcW w:type="dxa" w:w="1944"/>
             <w:vAlign w:val="center"/>
             <w:tcMar>
               <w:top w:w="80" w:type="dxa"/>
-              <w:start w:w="120" w:type="dxa"/>
+              <w:start w:w="100" w:type="dxa"/>
               <w:bottom w:w="80" w:type="dxa"/>
-              <w:end w:w="120" w:type="dxa"/>
+              <w:end w:w="100" w:type="dxa"/>
             </w:tcMar>
           </w:tcPr>
           <w:p>
+            <w:pPr>
+              <w:spacing w:after="0"/>
+            </w:pPr>
             <w:r>
-              <w:t>SC-FMA QP</w:t>
+              <w:rPr>
+                <w:rFonts w:ascii="Arial" w:hAnsi="Arial"/>
+                <w:sz w:val="16"/>
+              </w:rPr>
+              <w:t>Raw CIU</w:t>
             </w:r>
           </w:p>
         </w:tc>
         <w:tc>
           <w:tcPr>
-            <w:tcW w:type="dxa" w:w="1800"/>
+            <w:tcW w:type="dxa" w:w="1440"/>
             <w:vAlign w:val="center"/>
             <w:tcMar>
               <w:top w:w="80" w:type="dxa"/>
-              <w:start w:w="120" w:type="dxa"/>
+              <w:start w:w="100" w:type="dxa"/>
               <w:bottom w:w="80" w:type="dxa"/>
-              <w:end w:w="120" w:type="dxa"/>
+              <w:end w:w="100" w:type="dxa"/>
             </w:tcMar>
           </w:tcPr>
           <w:p>
+            <w:pPr>
+              <w:spacing w:after="0"/>
+            </w:pPr>
             <w:r>
-              <w:t>0.9105</w:t>
+              <w:rPr>
+                <w:rFonts w:ascii="Arial" w:hAnsi="Arial"/>
+                <w:sz w:val="16"/>
+              </w:rPr>
+              <w:t>0.9004</w:t>
             </w:r>
           </w:p>
         </w:tc>
         <w:tc>
           <w:tcPr>
-            <w:tcW w:type="dxa" w:w="1656"/>
+            <w:tcW w:type="dxa" w:w="1152"/>
             <w:vAlign w:val="center"/>
             <w:tcMar>
               <w:top w:w="80" w:type="dxa"/>
-              <w:start w:w="120" w:type="dxa"/>
+              <w:start w:w="100" w:type="dxa"/>
               <w:bottom w:w="80" w:type="dxa"/>
-              <w:end w:w="120" w:type="dxa"/>
+              <w:end w:w="100" w:type="dxa"/>
             </w:tcMar>
           </w:tcPr>
           <w:p>
+            <w:pPr>
+              <w:spacing w:after="0"/>
+            </w:pPr>
             <w:r>
+              <w:rPr>
+                <w:rFonts w:ascii="Arial" w:hAnsi="Arial"/>
+                <w:sz w:val="16"/>
+              </w:rPr>
               <w:t>1.0000</w:t>
             </w:r>
           </w:p>
         </w:tc>
         <w:tc>
           <w:tcPr>
-            <w:tcW w:type="dxa" w:w="1656"/>
+            <w:tcW w:type="dxa" w:w="1368"/>
             <w:vAlign w:val="center"/>
             <w:tcMar>
               <w:top w:w="80" w:type="dxa"/>
-              <w:start w:w="120" w:type="dxa"/>
+              <w:start w:w="100" w:type="dxa"/>
               <w:bottom w:w="80" w:type="dxa"/>
-              <w:end w:w="120" w:type="dxa"/>
+              <w:end w:w="100" w:type="dxa"/>
             </w:tcMar>
           </w:tcPr>
           <w:p>
+            <w:pPr>
+              <w:spacing w:after="0"/>
+            </w:pPr>
             <w:r>
+              <w:rPr>
+                <w:rFonts w:ascii="Arial" w:hAnsi="Arial"/>
+                <w:sz w:val="16"/>
+              </w:rPr>
               <w:t>1.0000</w:t>
             </w:r>
           </w:p>
         </w:tc>
         <w:tc>
           <w:tcPr>
-            <w:tcW w:type="dxa" w:w="1800"/>
+            <w:tcW w:type="dxa" w:w="1944"/>
             <w:vAlign w:val="center"/>
             <w:tcMar>
               <w:top w:w="80" w:type="dxa"/>
-              <w:start w:w="120" w:type="dxa"/>
+              <w:start w:w="100" w:type="dxa"/>
               <w:bottom w:w="80" w:type="dxa"/>
-              <w:end w:w="120" w:type="dxa"/>
+              <w:end w:w="100" w:type="dxa"/>
             </w:tcMar>
           </w:tcPr>
           <w:p>
+            <w:pPr>
+              <w:spacing w:after="0"/>
+            </w:pPr>
             <w:r>
+              <w:rPr>
+                <w:rFonts w:ascii="Arial" w:hAnsi="Arial"/>
+                <w:sz w:val="16"/>
+              </w:rPr>
               <w:t>feasibility only</w:t>
             </w:r>
           </w:p>
@@ -2049,86 +4173,121 @@
       <w:tr>
         <w:tc>
           <w:tcPr>
-            <w:tcW w:type="dxa" w:w="2448"/>
+            <w:tcW w:type="dxa" w:w="1944"/>
             <w:vAlign w:val="center"/>
             <w:tcMar>
               <w:top w:w="80" w:type="dxa"/>
-              <w:start w:w="120" w:type="dxa"/>
+              <w:start w:w="100" w:type="dxa"/>
               <w:bottom w:w="80" w:type="dxa"/>
-              <w:end w:w="120" w:type="dxa"/>
+              <w:end w:w="100" w:type="dxa"/>
             </w:tcMar>
           </w:tcPr>
           <w:p>
+            <w:pPr>
+              <w:spacing w:after="0"/>
+            </w:pPr>
             <w:r>
-              <w:t>Hand-coded step-type priority</w:t>
+              <w:rPr>
+                <w:rFonts w:ascii="Arial" w:hAnsi="Arial"/>
+                <w:sz w:val="16"/>
+              </w:rPr>
+              <w:t>Random</w:t>
             </w:r>
           </w:p>
         </w:tc>
         <w:tc>
           <w:tcPr>
-            <w:tcW w:type="dxa" w:w="1800"/>
+            <w:tcW w:type="dxa" w:w="1440"/>
             <w:vAlign w:val="center"/>
             <w:tcMar>
               <w:top w:w="80" w:type="dxa"/>
-              <w:start w:w="120" w:type="dxa"/>
+              <w:start w:w="100" w:type="dxa"/>
               <w:bottom w:w="80" w:type="dxa"/>
-              <w:end w:w="120" w:type="dxa"/>
+              <w:end w:w="100" w:type="dxa"/>
             </w:tcMar>
           </w:tcPr>
           <w:p>
+            <w:pPr>
+              <w:spacing w:after="0"/>
+            </w:pPr>
             <w:r>
-              <w:t>ceiling</w:t>
+              <w:rPr>
+                <w:rFonts w:ascii="Arial" w:hAnsi="Arial"/>
+                <w:sz w:val="16"/>
+              </w:rPr>
+              <w:t>0.0000</w:t>
             </w:r>
           </w:p>
         </w:tc>
         <w:tc>
           <w:tcPr>
-            <w:tcW w:type="dxa" w:w="1656"/>
+            <w:tcW w:type="dxa" w:w="1152"/>
             <w:vAlign w:val="center"/>
             <w:tcMar>
               <w:top w:w="80" w:type="dxa"/>
-              <w:start w:w="120" w:type="dxa"/>
+              <w:start w:w="100" w:type="dxa"/>
               <w:bottom w:w="80" w:type="dxa"/>
-              <w:end w:w="120" w:type="dxa"/>
+              <w:end w:w="100" w:type="dxa"/>
             </w:tcMar>
           </w:tcPr>
           <w:p>
+            <w:pPr>
+              <w:spacing w:after="0"/>
+            </w:pPr>
             <w:r>
-              <w:t>1.0000</w:t>
+              <w:rPr>
+                <w:rFonts w:ascii="Arial" w:hAnsi="Arial"/>
+                <w:sz w:val="16"/>
+              </w:rPr>
+              <w:t>0.0000</w:t>
             </w:r>
           </w:p>
         </w:tc>
         <w:tc>
           <w:tcPr>
-            <w:tcW w:type="dxa" w:w="1656"/>
+            <w:tcW w:type="dxa" w:w="1368"/>
             <w:vAlign w:val="center"/>
             <w:tcMar>
               <w:top w:w="80" w:type="dxa"/>
-              <w:start w:w="120" w:type="dxa"/>
+              <w:start w:w="100" w:type="dxa"/>
               <w:bottom w:w="80" w:type="dxa"/>
-              <w:end w:w="120" w:type="dxa"/>
+              <w:end w:w="100" w:type="dxa"/>
             </w:tcMar>
           </w:tcPr>
           <w:p>
+            <w:pPr>
+              <w:spacing w:after="0"/>
+            </w:pPr>
             <w:r>
-              <w:t>1.0000</w:t>
+              <w:rPr>
+                <w:rFonts w:ascii="Arial" w:hAnsi="Arial"/>
+                <w:sz w:val="16"/>
+              </w:rPr>
+              <w:t>0.5000</w:t>
             </w:r>
           </w:p>
         </w:tc>
         <w:tc>
           <w:tcPr>
-            <w:tcW w:type="dxa" w:w="1800"/>
+            <w:tcW w:type="dxa" w:w="1944"/>
             <w:vAlign w:val="center"/>
             <w:tcMar>
               <w:top w:w="80" w:type="dxa"/>
-              <w:start w:w="120" w:type="dxa"/>
+              <w:start w:w="100" w:type="dxa"/>
               <w:bottom w:w="80" w:type="dxa"/>
-              <w:end w:w="120" w:type="dxa"/>
+              <w:end w:w="100" w:type="dxa"/>
             </w:tcMar>
           </w:tcPr>
           <w:p>
+            <w:pPr>
+              <w:spacing w:after="0"/>
+            </w:pPr>
             <w:r>
-              <w:t>reveals construction artifact</w:t>
+              <w:rPr>
+                <w:rFonts w:ascii="Arial" w:hAnsi="Arial"/>
+                <w:sz w:val="16"/>
+              </w:rPr>
+              <w:t>control</w:t>
             </w:r>
           </w:p>
         </w:tc>
@@ -2141,7 +4300,8 @@
       </w:pPr>
       <w:r>
         <w:rPr>
-          <w:color w:val="2E74B5"/>
+          <w:rFonts w:ascii="Arial" w:hAnsi="Arial"/>
+          <w:color w:val="1F4E79"/>
         </w:rPr>
         <w:t>Reproducibility Notes</w:t>
       </w:r>
@@ -2149,45 +4309,91 @@
     <w:p>
       <w:pPr>
         <w:pStyle w:val="ListBullet"/>
-        <w:spacing w:after="80"/>
+        <w:spacing w:after="60" w:line="252" w:lineRule="auto"/>
       </w:pPr>
       <w:r>
+        <w:rPr>
+          <w:rFonts w:ascii="Arial" w:hAnsi="Arial"/>
+          <w:sz w:val="18"/>
+        </w:rPr>
         <w:t>All reported routes are offline and use zero API calls unless explicitly documented otherwise.</w:t>
       </w:r>
     </w:p>
     <w:p>
       <w:pPr>
         <w:pStyle w:val="ListBullet"/>
-        <w:spacing w:after="80"/>
+        <w:spacing w:after="60" w:line="252" w:lineRule="auto"/>
       </w:pPr>
       <w:r>
+        <w:rPr>
+          <w:rFonts w:ascii="Arial" w:hAnsi="Arial"/>
+          <w:sz w:val="18"/>
+        </w:rPr>
         <w:t>The synthetic benchmark is reproducible from scripts/generate_synthetic_traces.py with fixed seeds.</w:t>
       </w:r>
     </w:p>
     <w:p>
       <w:pPr>
         <w:pStyle w:val="ListBullet"/>
-        <w:spacing w:after="80"/>
+        <w:spacing w:after="60" w:line="252" w:lineRule="auto"/>
       </w:pPr>
       <w:r>
+        <w:rPr>
+          <w:rFonts w:ascii="Arial" w:hAnsi="Arial"/>
+          <w:sz w:val="18"/>
+        </w:rPr>
         <w:t>The structural stress-test is reproducible from scripts/run_scu_stress_test.py and scripts/run_scu_hyperparameter_sensitivity.py.</w:t>
       </w:r>
     </w:p>
     <w:p>
       <w:pPr>
         <w:pStyle w:val="ListBullet"/>
-        <w:spacing w:after="80"/>
+        <w:spacing w:after="60" w:line="252" w:lineRule="auto"/>
       </w:pPr>
       <w:r>
+        <w:rPr>
+          <w:rFonts w:ascii="Arial" w:hAnsi="Arial"/>
+          <w:sz w:val="18"/>
+        </w:rPr>
+        <w:t>Oracle auto audit-target validation is reproducible from scripts/run_audit_card_auto_validation.py and outputs/kbs_audit_card_auto_validation_v1.</w:t>
+      </w:r>
+    </w:p>
+    <w:p>
+      <w:pPr>
+        <w:pStyle w:val="ListBullet"/>
+        <w:spacing w:after="60" w:line="252" w:lineRule="auto"/>
+      </w:pPr>
+      <w:r>
+        <w:rPr>
+          <w:rFonts w:ascii="Arial" w:hAnsi="Arial"/>
+          <w:sz w:val="18"/>
+        </w:rPr>
+        <w:t>Embedding graph-construction ablation is reproducible from scripts/run_graph_construction_ablation.py and outputs/reviewer_v2_experiments/graph_construction_ablation.</w:t>
+      </w:r>
+    </w:p>
+    <w:p>
+      <w:pPr>
+        <w:pStyle w:val="ListBullet"/>
+        <w:spacing w:after="60" w:line="252" w:lineRule="auto"/>
+      </w:pPr>
+      <w:r>
+        <w:rPr>
+          <w:rFonts w:ascii="Arial" w:hAnsi="Arial"/>
+          <w:sz w:val="18"/>
+        </w:rPr>
         <w:t>The WebQSP diagnostic is reproducible from scripts/run_webqsp_trace_audit.py, scripts/validate_webqsp_trace_audit.py, and scripts/analyze_webqsp_separability.py.</w:t>
       </w:r>
     </w:p>
     <w:p>
       <w:pPr>
         <w:pStyle w:val="ListBullet"/>
-        <w:spacing w:after="80"/>
+        <w:spacing w:after="60" w:line="252" w:lineRule="auto"/>
       </w:pPr>
       <w:r>
+        <w:rPr>
+          <w:rFonts w:ascii="Arial" w:hAnsi="Arial"/>
+          <w:sz w:val="18"/>
+        </w:rPr>
         <w:t>The Countries-KG pilot is reproducible from src/fma/graph/kg_ontology_pilot.py and outputs/kbs_ontology_edge_pilot/kg_pilot_report.json.</w:t>
       </w:r>
     </w:p>
@@ -2197,43 +4403,75 @@
       </w:pPr>
       <w:r>
         <w:rPr>
-          <w:color w:val="2E74B5"/>
+          <w:rFonts w:ascii="Arial" w:hAnsi="Arial"/>
+          <w:color w:val="1F4E79"/>
         </w:rPr>
         <w:t>Claim Boundary Summary</w:t>
       </w:r>
     </w:p>
     <w:p>
       <w:pPr>
-        <w:spacing w:after="120"/>
+        <w:spacing w:after="120" w:line="259" w:lineRule="auto"/>
       </w:pPr>
       <w:r>
+        <w:rPr>
+          <w:rFonts w:ascii="Arial" w:hAnsi="Arial"/>
+          <w:sz w:val="19"/>
+        </w:rPr>
         <w:t>This supplementary file supports the manuscript title: Structurally-Calibrated Functional Attribution for Audit Prioritization in Knowledge-Intensive Reasoning</w:t>
       </w:r>
     </w:p>
     <w:p>
       <w:pPr>
-        <w:spacing w:after="120"/>
+        <w:spacing w:after="120" w:line="259" w:lineRule="auto"/>
       </w:pPr>
       <w:r>
-        <w:t>Allowed: bounded KBS-facing audit-prioritization methodology; PRM800K-like step-label ranking and audit context; diagnostic WebQSP and Countries-KG routes; MuSiQue feasibility demonstration only.</w:t>
+        <w:rPr>
+          <w:rFonts w:ascii="Arial" w:hAnsi="Arial"/>
+          <w:sz w:val="19"/>
+        </w:rPr>
+        <w:t>Allowed: bounded KBS-facing audit-prioritization methodology; PRM800K-like step-label ranking and audit context; zero-human oracle auto validation for decomposition information gain; graph-interface ablation with Sentence-BERT embeddings; diagnostic WebQSP and Countries-KG routes; MuSiQue feasibility demonstration.</w:t>
       </w:r>
     </w:p>
     <w:p>
       <w:pPr>
-        <w:spacing w:after="120"/>
+        <w:spacing w:after="120" w:line="259" w:lineRule="auto"/>
       </w:pPr>
       <w:r>
-        <w:t>Not claimed: downstream PRM/filtering gains, GSM8K/HotpotQA replay-pass evidence, WebQSP KGQA improvement, production knowledge-base deployment validation, MuSiQue-derived independent audit evidence, or formal causal identification.</w:t>
+        <w:rPr>
+          <w:rFonts w:ascii="Arial" w:hAnsi="Arial"/>
+          <w:sz w:val="19"/>
+        </w:rPr>
+        <w:t>Not claimed: downstream PRM/filtering gains, GSM8K/HotpotQA replay-pass evidence, WebQSP KGQA improvement, production knowledge-base deployment validation, MuSiQue-derived independent proof, human-subject evidence, or human-performance improvement.</w:t>
       </w:r>
     </w:p>
     <w:sectPr>
+      <w:footerReference w:type="default" r:id="rId9"/>
       <w:pgSz w:w="12240" w:h="15840"/>
-      <w:pgMar w:top="1440" w:right="1440" w:bottom="1440" w:left="1440" w:header="720" w:footer="720" w:gutter="0"/>
+      <w:pgMar w:top="1080" w:right="1080" w:bottom="1080" w:left="1080" w:header="720" w:footer="720" w:gutter="0"/>
       <w:cols w:space="720"/>
       <w:docGrid w:linePitch="360"/>
     </w:sectPr>
   </w:body>
 </w:document>
+</file>
+
+<file path=word/footer1.xml><?xml version="1.0" encoding="utf-8"?>
+<w:ftr xmlns:m="http://schemas.openxmlformats.org/officeDocument/2006/math" xmlns:mc="http://schemas.openxmlformats.org/markup-compatibility/2006" xmlns:mo="http://schemas.microsoft.com/office/mac/office/2008/main" xmlns:mv="urn:schemas-microsoft-com:mac:vml" xmlns:o="urn:schemas-microsoft-com:office:office" xmlns:r="http://schemas.openxmlformats.org/officeDocument/2006/relationships" xmlns:v="urn:schemas-microsoft-com:vml" xmlns:w10="urn:schemas-microsoft-com:office:word" xmlns:w14="http://schemas.microsoft.com/office/word/2010/wordml" xmlns:w="http://schemas.openxmlformats.org/wordprocessingml/2006/main" xmlns:wne="http://schemas.microsoft.com/office/word/2006/wordml" xmlns:wp14="http://schemas.microsoft.com/office/word/2010/wordprocessingDrawing" xmlns:wp="http://schemas.openxmlformats.org/drawingml/2006/wordprocessingDrawing" xmlns:wpc="http://schemas.microsoft.com/office/word/2010/wordprocessingCanvas" xmlns:wpg="http://schemas.microsoft.com/office/word/2010/wordprocessingGroup" xmlns:wpi="http://schemas.microsoft.com/office/word/2010/wordprocessingInk" xmlns:wps="http://schemas.microsoft.com/office/word/2010/wordprocessingShape" mc:Ignorable="w14 wp14">
+  <w:p>
+    <w:pPr>
+      <w:pStyle w:val="Footer"/>
+      <w:jc w:val="center"/>
+    </w:pPr>
+    <w:r>
+      <w:rPr>
+        <w:rFonts w:ascii="Arial" w:hAnsi="Arial"/>
+        <w:sz w:val="16"/>
+      </w:rPr>
+      <w:t>Supplementary Material - KBS submission package</w:t>
+    </w:r>
+  </w:p>
+</w:ftr>
 </file>
 
 <file path=word/numbering.xml><?xml version="1.0" encoding="utf-8"?>
@@ -2600,8 +4838,8 @@
     <w:qFormat/>
     <w:rsid w:val="00FC693F"/>
     <w:rPr>
-      <w:rFonts w:ascii="Calibri" w:hAnsi="Calibri" w:eastAsia="Calibri"/>
-      <w:sz w:val="22"/>
+      <w:rFonts w:ascii="Arial" w:hAnsi="Arial"/>
+      <w:sz w:val="19"/>
     </w:rPr>
   </w:style>
   <w:style w:type="paragraph" w:styleId="Header">
@@ -2663,10 +4901,10 @@
       <w:outlineLvl w:val="0"/>
     </w:pPr>
     <w:rPr>
-      <w:rFonts w:asciiTheme="majorHAnsi" w:eastAsiaTheme="majorEastAsia" w:hAnsiTheme="majorHAnsi" w:cstheme="majorBidi"/>
+      <w:rFonts w:asciiTheme="majorHAnsi" w:eastAsiaTheme="majorEastAsia" w:hAnsiTheme="majorHAnsi" w:cstheme="majorBidi" w:ascii="Arial" w:hAnsi="Arial"/>
       <w:b/>
       <w:bCs/>
-      <w:color w:val="365F91" w:themeColor="accent1" w:themeShade="BF"/>
+      <w:color w:val="1F4E79"/>
       <w:sz w:val="28"/>
       <w:szCs w:val="28"/>
     </w:rPr>
@@ -2687,10 +4925,10 @@
       <w:outlineLvl w:val="1"/>
     </w:pPr>
     <w:rPr>
-      <w:rFonts w:asciiTheme="majorHAnsi" w:eastAsiaTheme="majorEastAsia" w:hAnsiTheme="majorHAnsi" w:cstheme="majorBidi"/>
+      <w:rFonts w:asciiTheme="majorHAnsi" w:eastAsiaTheme="majorEastAsia" w:hAnsiTheme="majorHAnsi" w:cstheme="majorBidi" w:ascii="Arial" w:hAnsi="Arial"/>
       <w:b/>
       <w:bCs/>
-      <w:color w:val="4F81BD" w:themeColor="accent1"/>
+      <w:color w:val="1F4E79"/>
       <w:sz w:val="26"/>
       <w:szCs w:val="26"/>
     </w:rPr>

</xml_diff>

<commit_message>
Update supplementary.docx to current readable upload version
Refresh the portal-upload supplementary Word file to the current
clean readable version (author/title metadata intact, no pre-fix
wording). This is the actually-uploaded supplementary file; the
authoritative mathematical layout remains supplementary.tex inside
latex_source.zip per the KBS source-bundle contract.

Co-Authored-By: Claude <noreply@anthropic.com>
</commit_message>
<xml_diff>
--- a/paper/kbs_submission/final_package/supplementary.docx
+++ b/paper/kbs_submission/final_package/supplementary.docx
@@ -37,7 +37,7 @@
           <w:rFonts w:ascii="Arial" w:hAnsi="Arial"/>
           <w:sz w:val="19"/>
         </w:rPr>
-        <w:t>Abstract. This supplementary material records extended proof notes, method details, route-specific diagnostics, oracle auto audit-target validation, graph-construction ablations, and reproducibility information for the KBS submission package. The LaTeX source bundle remains the authoritative source for mathematical layout; this Word file is a clean readable supplement for portal upload.</w:t>
+        <w:t>Abstract. This supplementary material records extended proof notes, method details, route-specific diagnostics, rule-derived audit-category traceability diagnostic, graph-construction ablations, and reproducibility information for the KBS submission package. The LaTeX source bundle remains the authoritative source for mathematical layout; this Word file is a clean readable supplement for portal upload.</w:t>
       </w:r>
     </w:p>
     <w:p>
@@ -49,7 +49,7 @@
           <w:rFonts w:ascii="Arial" w:hAnsi="Arial"/>
           <w:sz w:val="19"/>
         </w:rPr>
-        <w:t>Keywords. supplementary material; structural calibration; audit prioritization; oracle auto validation; graph construction; reproducibility</w:t>
+        <w:t>Keywords. supplementary material; structural calibration; audit prioritization; rule-derived traceability diagnostic; graph construction; reproducibility</w:t>
       </w:r>
     </w:p>
     <w:p>
@@ -121,7 +121,7 @@
           <w:rFonts w:ascii="Arial" w:hAnsi="Arial"/>
           <w:sz w:val="19"/>
         </w:rPr>
-        <w:t>The oracle auto audit-target validation is zero-human: human_subjects=false, human_efficiency_claim=false, validated_kbs_workflow=false, evidence_level=oracle_auto_audit_validation. It supports decision traceability and automatic information recovery, not human-performance claims.</w:t>
+        <w:t>The rule-derived audit-category traceability diagnostic is zero-human: no human-subjects or human-efficiency claim is made, no deployed KBS workflow is validated, and the evidence level is rule-derived traceability diagnostic. It supports decision traceability and rule-derived category mapping, not human-performance claims.</w:t>
       </w:r>
     </w:p>
     <w:p>
@@ -461,7 +461,7 @@
                 <w:rFonts w:ascii="Arial" w:hAnsi="Arial"/>
                 <w:sz w:val="16"/>
               </w:rPr>
-              <w:t>Oracle auto audit-target validation</w:t>
+              <w:t>Rule-derived traceability diagnostic</w:t>
             </w:r>
           </w:p>
         </w:tc>
@@ -509,7 +509,7 @@
                 <w:rFonts w:ascii="Arial" w:hAnsi="Arial"/>
                 <w:sz w:val="16"/>
               </w:rPr>
-              <w:t>zero-human validation</w:t>
+              <w:t>zero-human diagnostic</w:t>
             </w:r>
           </w:p>
         </w:tc>
@@ -533,7 +533,7 @@
                 <w:rFonts w:ascii="Arial" w:hAnsi="Arial"/>
                 <w:sz w:val="16"/>
               </w:rPr>
-              <w:t>automatic failure-mode localization and decomposition information gain</w:t>
+              <w:t>rule-derived category traceability with circularity limits</w:t>
             </w:r>
           </w:p>
         </w:tc>
@@ -925,7 +925,7 @@
                 <w:rFonts w:ascii="Arial" w:hAnsi="Arial"/>
                 <w:sz w:val="16"/>
               </w:rPr>
-              <w:t>typed ontology edges can change structural diagnostics; validated_kbs_workflow=false</w:t>
+              <w:t>typed ontology edges can change structural diagnostics; no deployed workflow validation</w:t>
             </w:r>
           </w:p>
         </w:tc>
@@ -941,7 +941,7 @@
           <w:rFonts w:ascii="Arial" w:hAnsi="Arial"/>
           <w:color w:val="1F4E79"/>
         </w:rPr>
-        <w:t>Oracle Auto Audit-Target Validation</w:t>
+        <w:t>Rule-Derived Audit-Category Traceability Diagnostic</w:t>
       </w:r>
     </w:p>
     <w:p>
@@ -953,7 +953,7 @@
           <w:rFonts w:ascii="Arial" w:hAnsi="Arial"/>
           <w:sz w:val="19"/>
         </w:rPr>
-        <w:t>Failure-mode localization is evaluated as an information-retrieval task over traces. The scalar condition uses only the w_struct score, while the SC-FMA condition uses fidelity, structural necessity, redundancy, bottleneck status, and recommended action fields. Oracle targets are rule-derived from PRM800K labels, ranking disagreement, redundancy density, bottleneck flags, and the existing failure taxonomy; they are not human adjudications.</w:t>
+        <w:t>Failure-mode localization is evaluated as an information-retrieval task over traces. The scalar condition uses only the w_struct score, while the SC-FMA condition uses fidelity, structural necessity, redundancy, bottleneck status, and recommended action fields. Targets are rule-derived from PRM800K labels, ranking disagreement, redundancy density, bottleneck flags, and the existing failure taxonomy; they are not human adjudications.</w:t>
       </w:r>
     </w:p>
     <w:tbl>
@@ -2222,6 +2222,316 @@
         <w:t>The QP hyperparameter sensitivity grid sweeps gamma in {0.0, 0.1, 0.2, 0.5, 0.8} and delta in {0.0, 0.05, 0.1, 0.2, 0.4}. The diagnostic default is gamma=0.2 and delta=0.1. The grid is supplementary QP robustness evidence only; it is not positive external validation and does not change the PRM800K Ridge recommendation.</w:t>
       </w:r>
     </w:p>
+    <w:p>
+      <w:pPr>
+        <w:jc w:val="left"/>
+      </w:pPr>
+      <w:r>
+        <w:rPr>
+          <w:b/>
+          <w:sz w:val="20"/>
+        </w:rPr>
+        <w:t>Alpha/beta QP sensitivity grid</w:t>
+      </w:r>
+    </w:p>
+    <w:tbl>
+      <w:tblPr>
+        <w:tblStyle w:val="TableGrid"/>
+        <w:tblW w:type="auto" w:w="0"/>
+        <w:jc w:val="center"/>
+        <w:tblLook w:firstColumn="1" w:firstRow="1" w:lastColumn="0" w:lastRow="0" w:noHBand="0" w:noVBand="1" w:val="04A0"/>
+      </w:tblPr>
+      <w:tblGrid>
+        <w:gridCol w:w="2520"/>
+        <w:gridCol w:w="2520"/>
+        <w:gridCol w:w="2520"/>
+        <w:gridCol w:w="2520"/>
+      </w:tblGrid>
+      <w:tr>
+        <w:tc>
+          <w:tcPr>
+            <w:tcW w:type="dxa" w:w="1080"/>
+            <w:vAlign w:val="center"/>
+          </w:tcPr>
+          <w:p>
+            <w:pPr>
+              <w:jc w:val="center"/>
+            </w:pPr>
+            <w:r>
+              <w:rPr>
+                <w:b/>
+                <w:sz w:val="16"/>
+              </w:rPr>
+              <w:t>alpha</w:t>
+            </w:r>
+          </w:p>
+        </w:tc>
+        <w:tc>
+          <w:tcPr>
+            <w:tcW w:type="dxa" w:w="1944"/>
+            <w:vAlign w:val="center"/>
+          </w:tcPr>
+          <w:p>
+            <w:pPr>
+              <w:jc w:val="center"/>
+            </w:pPr>
+            <w:r>
+              <w:rPr>
+                <w:b/>
+                <w:sz w:val="16"/>
+              </w:rPr>
+              <w:t>beta=0.0</w:t>
+            </w:r>
+          </w:p>
+        </w:tc>
+        <w:tc>
+          <w:tcPr>
+            <w:tcW w:type="dxa" w:w="1944"/>
+            <w:vAlign w:val="center"/>
+          </w:tcPr>
+          <w:p>
+            <w:pPr>
+              <w:jc w:val="center"/>
+            </w:pPr>
+            <w:r>
+              <w:rPr>
+                <w:b/>
+                <w:sz w:val="16"/>
+              </w:rPr>
+              <w:t>beta=0.5</w:t>
+            </w:r>
+          </w:p>
+        </w:tc>
+        <w:tc>
+          <w:tcPr>
+            <w:tcW w:type="dxa" w:w="1944"/>
+            <w:vAlign w:val="center"/>
+          </w:tcPr>
+          <w:p>
+            <w:pPr>
+              <w:jc w:val="center"/>
+            </w:pPr>
+            <w:r>
+              <w:rPr>
+                <w:b/>
+                <w:sz w:val="16"/>
+              </w:rPr>
+              <w:t>beta=1.0</w:t>
+            </w:r>
+          </w:p>
+        </w:tc>
+      </w:tr>
+      <w:tr>
+        <w:tc>
+          <w:tcPr>
+            <w:tcW w:type="dxa" w:w="1080"/>
+            <w:vAlign w:val="center"/>
+          </w:tcPr>
+          <w:p>
+            <w:pPr>
+              <w:jc w:val="center"/>
+            </w:pPr>
+            <w:r>
+              <w:rPr>
+                <w:sz w:val="16"/>
+              </w:rPr>
+              <w:t>0.5</w:t>
+            </w:r>
+          </w:p>
+        </w:tc>
+        <w:tc>
+          <w:tcPr>
+            <w:tcW w:type="dxa" w:w="1944"/>
+            <w:vAlign w:val="center"/>
+          </w:tcPr>
+          <w:p>
+            <w:pPr>
+              <w:jc w:val="center"/>
+            </w:pPr>
+            <w:r>
+              <w:rPr>
+                <w:sz w:val="16"/>
+              </w:rPr>
+              <w:t>0.6393 (+0.0462)</w:t>
+            </w:r>
+          </w:p>
+        </w:tc>
+        <w:tc>
+          <w:tcPr>
+            <w:tcW w:type="dxa" w:w="1944"/>
+            <w:vAlign w:val="center"/>
+          </w:tcPr>
+          <w:p>
+            <w:pPr>
+              <w:jc w:val="center"/>
+            </w:pPr>
+            <w:r>
+              <w:rPr>
+                <w:sz w:val="16"/>
+              </w:rPr>
+              <w:t>0.5714 (-0.0217)</w:t>
+            </w:r>
+          </w:p>
+        </w:tc>
+        <w:tc>
+          <w:tcPr>
+            <w:tcW w:type="dxa" w:w="1944"/>
+            <w:vAlign w:val="center"/>
+          </w:tcPr>
+          <w:p>
+            <w:pPr>
+              <w:jc w:val="center"/>
+            </w:pPr>
+            <w:r>
+              <w:rPr>
+                <w:sz w:val="16"/>
+              </w:rPr>
+              <w:t>0.5097 (-0.0834)</w:t>
+            </w:r>
+          </w:p>
+        </w:tc>
+      </w:tr>
+      <w:tr>
+        <w:tc>
+          <w:tcPr>
+            <w:tcW w:type="dxa" w:w="1080"/>
+            <w:vAlign w:val="center"/>
+          </w:tcPr>
+          <w:p>
+            <w:pPr>
+              <w:jc w:val="center"/>
+            </w:pPr>
+            <w:r>
+              <w:rPr>
+                <w:sz w:val="16"/>
+              </w:rPr>
+              <w:t>1.0</w:t>
+            </w:r>
+          </w:p>
+        </w:tc>
+        <w:tc>
+          <w:tcPr>
+            <w:tcW w:type="dxa" w:w="1944"/>
+            <w:vAlign w:val="center"/>
+          </w:tcPr>
+          <w:p>
+            <w:pPr>
+              <w:jc w:val="center"/>
+            </w:pPr>
+            <w:r>
+              <w:rPr>
+                <w:sz w:val="16"/>
+              </w:rPr>
+              <w:t>0.5605 (-0.0326)</w:t>
+            </w:r>
+          </w:p>
+        </w:tc>
+        <w:tc>
+          <w:tcPr>
+            <w:tcW w:type="dxa" w:w="1944"/>
+            <w:vAlign w:val="center"/>
+          </w:tcPr>
+          <w:p>
+            <w:pPr>
+              <w:jc w:val="center"/>
+            </w:pPr>
+            <w:r>
+              <w:rPr>
+                <w:sz w:val="16"/>
+              </w:rPr>
+              <w:t>0.5931 (+0.0000)</w:t>
+            </w:r>
+          </w:p>
+        </w:tc>
+        <w:tc>
+          <w:tcPr>
+            <w:tcW w:type="dxa" w:w="1944"/>
+            <w:vAlign w:val="center"/>
+          </w:tcPr>
+          <w:p>
+            <w:pPr>
+              <w:jc w:val="center"/>
+            </w:pPr>
+            <w:r>
+              <w:rPr>
+                <w:sz w:val="16"/>
+              </w:rPr>
+              <w:t>0.5585 (-0.0345)</w:t>
+            </w:r>
+          </w:p>
+        </w:tc>
+      </w:tr>
+      <w:tr>
+        <w:tc>
+          <w:tcPr>
+            <w:tcW w:type="dxa" w:w="1080"/>
+            <w:vAlign w:val="center"/>
+          </w:tcPr>
+          <w:p>
+            <w:pPr>
+              <w:jc w:val="center"/>
+            </w:pPr>
+            <w:r>
+              <w:rPr>
+                <w:sz w:val="16"/>
+              </w:rPr>
+              <w:t>2.0</w:t>
+            </w:r>
+          </w:p>
+        </w:tc>
+        <w:tc>
+          <w:tcPr>
+            <w:tcW w:type="dxa" w:w="1944"/>
+            <w:vAlign w:val="center"/>
+          </w:tcPr>
+          <w:p>
+            <w:pPr>
+              <w:jc w:val="center"/>
+            </w:pPr>
+            <w:r>
+              <w:rPr>
+                <w:sz w:val="16"/>
+              </w:rPr>
+              <w:t>0.4868 (-0.1063)</w:t>
+            </w:r>
+          </w:p>
+        </w:tc>
+        <w:tc>
+          <w:tcPr>
+            <w:tcW w:type="dxa" w:w="1944"/>
+            <w:vAlign w:val="center"/>
+          </w:tcPr>
+          <w:p>
+            <w:pPr>
+              <w:jc w:val="center"/>
+            </w:pPr>
+            <w:r>
+              <w:rPr>
+                <w:sz w:val="16"/>
+              </w:rPr>
+              <w:t>0.5346 (-0.0585)</w:t>
+            </w:r>
+          </w:p>
+        </w:tc>
+        <w:tc>
+          <w:tcPr>
+            <w:tcW w:type="dxa" w:w="1944"/>
+            <w:vAlign w:val="center"/>
+          </w:tcPr>
+          <w:p>
+            <w:pPr>
+              <w:jc w:val="center"/>
+            </w:pPr>
+            <w:r>
+              <w:rPr>
+                <w:sz w:val="16"/>
+              </w:rPr>
+              <w:t>0.5572 (-0.0359)</w:t>
+            </w:r>
+          </w:p>
+        </w:tc>
+      </w:tr>
+    </w:tbl>
     <w:tbl>
       <w:tblPr>
         <w:tblStyle w:val="TableGrid"/>
@@ -4346,6 +4656,12 @@
       </w:r>
     </w:p>
     <w:p>
+      <w:r>
+        <w:t>QP hyperparameter sensitivity is reproduced with scripts/run_scu_hyperparameter_sensitivity.py. Outputs are archived as outputs/reviewer_v2_experiments/scu_hyperparameter_sensitivity/scu_hyperparameter_sensitivity.json, outputs/reviewer_v2_experiments/scu_hyperparameter_sensitivity/scu_hyperparameter_sensitivity.md, outputs/reviewer_v2_experiments/scu_hyperparameter_sensitivity/alpha_beta_grid.csv, and outputs/reviewer_v2_experiments/scu_hyperparameter_sensitivity/gamma_delta_grid.csv. The alpha/beta grid fixes gamma=0.2 and delta=0.1 and sweeps alpha in {0.5, 1.0, 2.0} by beta in {0.0, 0.5, 1.0}; it is a supplementary QP diagnostic only, not positive external validation.</w:t>
+      </w:r>
+    </w:p>
+    <CT_P/>
+    <w:p>
       <w:pPr>
         <w:pStyle w:val="ListBullet"/>
         <w:spacing w:after="60" w:line="252" w:lineRule="auto"/>
@@ -4355,7 +4671,7 @@
           <w:rFonts w:ascii="Arial" w:hAnsi="Arial"/>
           <w:sz w:val="18"/>
         </w:rPr>
-        <w:t>Oracle auto audit-target validation is reproducible from scripts/run_audit_card_auto_validation.py and outputs/kbs_audit_card_auto_validation_v1.</w:t>
+        <w:t>Rule-derived audit-category traceability diagnostic is reproducible from scripts/run_audit_card_auto_validation.py and outputs/kbs_audit_card_auto_validation_v1.</w:t>
       </w:r>
     </w:p>
     <w:p>
@@ -4430,7 +4746,7 @@
           <w:rFonts w:ascii="Arial" w:hAnsi="Arial"/>
           <w:sz w:val="19"/>
         </w:rPr>
-        <w:t>Allowed: bounded KBS-facing audit-prioritization methodology; PRM800K-like step-label ranking and audit context; zero-human oracle auto validation for decomposition information gain; graph-interface ablation with Sentence-BERT embeddings; diagnostic WebQSP and Countries-KG routes; MuSiQue feasibility demonstration.</w:t>
+        <w:t>Allowed: bounded KBS-facing audit-prioritization methodology; PRM800K-like step-label ranking and audit context; zero-human rule-derived traceability diagnostic for decomposition information gain; graph-interface ablation with Sentence-BERT embeddings; diagnostic WebQSP and Countries-KG routes; MuSiQue feasibility demonstration.</w:t>
       </w:r>
     </w:p>
     <w:p>
@@ -4443,6 +4759,58 @@
           <w:sz w:val="19"/>
         </w:rPr>
         <w:t>Not claimed: downstream PRM/filtering gains, GSM8K/HotpotQA replay-pass evidence, WebQSP KGQA improvement, production knowledge-base deployment validation, MuSiQue-derived independent proof, human-subject evidence, or human-performance improvement.</w:t>
+      </w:r>
+    </w:p>
+    <w:p>
+      <w:pPr>
+        <w:pStyle w:val="Heading1"/>
+      </w:pPr>
+      <w:r>
+        <w:t>Revision-Specific Boundary Notes</w:t>
+      </w:r>
+    </w:p>
+    <w:p>
+      <w:pPr>
+        <w:pStyle w:val="ListBullet"/>
+      </w:pPr>
+      <w:r>
+        <w:rPr>
+          <w:sz w:val="20"/>
+        </w:rPr>
+        <w:t>SCU component contribution on a structural stress-test benchmark: the stress-test labels explicitly encode redundancy-awareness and bottleneck-protection, so QP gains are interpreted as intended behavior in a designed regime, not general ranking superiority.</w:t>
+      </w:r>
+    </w:p>
+    <w:p>
+      <w:pPr>
+        <w:pStyle w:val="ListBullet"/>
+      </w:pPr>
+      <w:r>
+        <w:rPr>
+          <w:sz w:val="20"/>
+        </w:rPr>
+        <w:t>Real-Knowledge-Graph Graph Construction Pilot: the Countries-KG pilot is a typed-edge construction diagnostic only; it does not validate live KBS deployment, KGQA accuracy, semantic parsing, or maintenance outcomes.</w:t>
+      </w:r>
+    </w:p>
+    <w:p>
+      <w:pPr>
+        <w:pStyle w:val="ListBullet"/>
+      </w:pPr>
+      <w:r>
+        <w:rPr>
+          <w:sz w:val="20"/>
+        </w:rPr>
+        <w:t>Rule-derived audit-category traceability diagnostic: targets are derived from PRM800K labels, ranking disagreement, redundancy density, bottleneck flags, and failure-taxonomy rules. Weak utility-anchor targets have no or low circularity; redundancy consolidation, bottleneck protection, and structural over-correction have partial circularity and are traceability diagnostics only.</w:t>
+      </w:r>
+    </w:p>
+    <w:p>
+      <w:pPr>
+        <w:pStyle w:val="ListBullet"/>
+      </w:pPr>
+      <w:r>
+        <w:rPr>
+          <w:sz w:val="20"/>
+        </w:rPr>
+        <w:t>The w_struct regressor is a frozen 15-feature Ridge model; the LaTeX source lists the exact feature names and the verifier checks that list against the frozen model JSON.</w:t>
       </w:r>
     </w:p>
     <w:sectPr>

</xml_diff>

<commit_message>
Revise KBS manuscript and package for claim alignment
</commit_message>
<xml_diff>
--- a/paper/kbs_submission/final_package/supplementary.docx
+++ b/paper/kbs_submission/final_package/supplementary.docx
@@ -37,7 +37,7 @@
           <w:rFonts w:ascii="Arial" w:hAnsi="Arial"/>
           <w:sz w:val="19"/>
         </w:rPr>
-        <w:t>Abstract. This supplementary material records extended proof notes, method details, route-specific diagnostics, rule-derived audit-category traceability diagnostic, graph-construction ablations, and reproducibility information for the KBS submission package. The LaTeX source bundle remains the authoritative source for mathematical layout; this Word file is a clean readable supplement for portal upload.</w:t>
+        <w:t>Abstract. This supplementary material records extended proof notes, method details, stage-specific diagnostics, rule-derived audit-category traceability diagnostic, graph-construction ablations, and reproducibility information for the KBS submission package. The LaTeX source bundle remains the authoritative source for mathematical layout; this Word file is a clean readable supplement for portal upload.</w:t>
       </w:r>
     </w:p>
     <w:p>
@@ -97,7 +97,7 @@
           <w:rFonts w:ascii="Arial" w:hAnsi="Arial"/>
           <w:sz w:val="19"/>
         </w:rPr>
-        <w:t>The MuSiQue route is reported as a constructed-label feasibility demonstration only because audit labels and scoring features are deterministic functions of step type. It is not used as independent audit-prioritization evidence.</w:t>
+        <w:t>The MuSiQue diagnostic is reported as a constructed-label feasibility demonstration only because audit labels and scoring features are deterministic functions of step type. It is not used as independent audit-prioritization evidence.</w:t>
       </w:r>
     </w:p>
     <w:p>
@@ -109,7 +109,7 @@
           <w:rFonts w:ascii="Arial" w:hAnsi="Arial"/>
           <w:sz w:val="19"/>
         </w:rPr>
-        <w:t>The WebQSP route is reported as a supplementary fixed-schema trace-audit diagnostic. It is not KGQA accuracy evidence, semantic parsing evidence, entity-linking evidence, or production KBS validation.</w:t>
+        <w:t>The WebQSP diagnostic is reported as a supplementary fixed-schema trace-audit diagnostic. It is not KGQA accuracy evidence, semantic parsing evidence, entity-linking evidence, or production KBS validation.</w:t>
       </w:r>
     </w:p>
     <w:p>
@@ -170,7 +170,7 @@
                 <w:b/>
                 <w:sz w:val="17"/>
               </w:rPr>
-              <w:t>Route</w:t>
+              <w:t>Diagnostic</w:t>
             </w:r>
           </w:p>
         </w:tc>
@@ -657,7 +657,7 @@
                 <w:rFonts w:ascii="Arial" w:hAnsi="Arial"/>
                 <w:sz w:val="16"/>
               </w:rPr>
-              <w:t>MuSiQue decomposition route</w:t>
+              <w:t>MuSiQue decomposition diagnostic</w:t>
             </w:r>
           </w:p>
         </w:tc>
@@ -755,7 +755,7 @@
                 <w:rFonts w:ascii="Arial" w:hAnsi="Arial"/>
                 <w:sz w:val="16"/>
               </w:rPr>
-              <w:t>WebQSP fixed-schema route</w:t>
+              <w:t>WebQSP fixed-schema diagnostic</w:t>
             </w:r>
           </w:p>
         </w:tc>
@@ -853,7 +853,7 @@
                 <w:rFonts w:ascii="Arial" w:hAnsi="Arial"/>
                 <w:sz w:val="16"/>
               </w:rPr>
-              <w:t>Countries-KG pilot</w:t>
+              <w:t>Countries-KG typed-edge stage</w:t>
             </w:r>
           </w:p>
         </w:tc>
@@ -901,7 +901,7 @@
                 <w:rFonts w:ascii="Arial" w:hAnsi="Arial"/>
                 <w:sz w:val="16"/>
               </w:rPr>
-              <w:t>pilot diagnostic</w:t>
+              <w:t>typed-edge diagnostic</w:t>
             </w:r>
           </w:p>
         </w:tc>
@@ -1439,7 +1439,7 @@
           <w:rFonts w:ascii="Arial" w:hAnsi="Arial"/>
           <w:sz w:val="19"/>
         </w:rPr>
-        <w:t>The graph-construction ablation compares temporal-only, TF-IDF topical, Jaccard topical, Sentence-BERT embedding topical, and shuffled-topical variants under the same diagnostic protocol. The embedding route uses sentence-transformers/all-MiniLM-L6-v2 through sentence-transformers version 3.4.1 with 384-dimensional vectors. The report records the HuggingFace cache path, download/cache status, runtime status, and graph-constructor metadata.</w:t>
+        <w:t>The graph-construction ablation compares temporal-only, TF-IDF topical, Jaccard topical, Sentence-BERT embedding topical, and shuffled-topical variants under the same diagnostic protocol. The embedding diagnostic uses sentence-transformers/all-MiniLM-L6-v2 through sentence-transformers version 3.4.1 with 384-dimensional vectors. The report records the HuggingFace cache path, download/cache status, runtime status, and graph-constructor metadata.</w:t>
       </w:r>
     </w:p>
     <w:tbl>
@@ -3979,7 +3979,7 @@
           <w:rFonts w:ascii="Arial" w:hAnsi="Arial"/>
           <w:sz w:val="19"/>
         </w:rPr>
-        <w:t>The MuSiQue route constructs trace records from decomposition evidence chains. The locked split contains 1,415 samples and 12,715 steps. No API calls are used. The field-level leakage check marks the route as feasibility-only because labels and scoring features share deterministic step-type sources.</w:t>
+        <w:t>The MuSiQue diagnostic constructs trace records from decomposition evidence chains. The locked split contains 1,415 samples and 12,715 steps. No API calls are used. The field-level leakage check marks the diagnostic as feasibility-only because labels and scoring features share deterministic step-type sources.</w:t>
       </w:r>
     </w:p>
     <w:tbl>
@@ -4626,7 +4626,7 @@
           <w:rFonts w:ascii="Arial" w:hAnsi="Arial"/>
           <w:sz w:val="18"/>
         </w:rPr>
-        <w:t>All reported routes are offline and use zero API calls unless explicitly documented otherwise.</w:t>
+        <w:t>All reported diagnostics are offline and use zero API calls unless explicitly documented otherwise.</w:t>
       </w:r>
     </w:p>
     <w:p>
@@ -4639,7 +4639,7 @@
           <w:rFonts w:ascii="Arial" w:hAnsi="Arial"/>
           <w:sz w:val="18"/>
         </w:rPr>
-        <w:t>The synthetic benchmark is reproducible from scripts/generate_synthetic_traces.py with fixed seeds.</w:t>
+        <w:t>The controlled synthetic stage is reproducible from scripts/generate_synthetic_traces.py with fixed seeds.</w:t>
       </w:r>
     </w:p>
     <w:p>
@@ -4710,7 +4710,7 @@
           <w:rFonts w:ascii="Arial" w:hAnsi="Arial"/>
           <w:sz w:val="18"/>
         </w:rPr>
-        <w:t>The Countries-KG pilot is reproducible from src/fma/graph/kg_ontology_pilot.py and outputs/kbs_ontology_edge_pilot/kg_pilot_report.json.</w:t>
+        <w:t>The Countries-KG typed-edge stage is reproducible from src/fma/graph/kg_ontology_pilot.py and outputs/kbs_ontology_edge_pilot/kg_pilot_report.json.</w:t>
       </w:r>
     </w:p>
     <w:p>
@@ -4746,7 +4746,7 @@
           <w:rFonts w:ascii="Arial" w:hAnsi="Arial"/>
           <w:sz w:val="19"/>
         </w:rPr>
-        <w:t>Allowed: bounded KBS-facing audit-prioritization methodology; PRM800K-like step-label ranking and audit context; zero-human rule-derived traceability diagnostic for decomposition information gain; graph-interface ablation with Sentence-BERT embeddings; diagnostic WebQSP and Countries-KG routes; MuSiQue feasibility demonstration.</w:t>
+        <w:t>Allowed: bounded KBS-facing audit-prioritization methodology; PRM800K-like step-label ranking and audit context; zero-human rule-derived traceability diagnostic for decomposition information gain; graph-interface ablation with Sentence-BERT embeddings; diagnostic WebQSP and Countries-KG typed-edge stages; MuSiQue feasibility demonstration.</w:t>
       </w:r>
     </w:p>
     <w:p>
@@ -4788,7 +4788,7 @@
         <w:rPr>
           <w:sz w:val="20"/>
         </w:rPr>
-        <w:t>Real-Knowledge-Graph Graph Construction Pilot: the Countries-KG pilot is a typed-edge construction diagnostic only; it does not validate live KBS deployment, KGQA accuracy, semantic parsing, or maintenance outcomes.</w:t>
+        <w:t>Countries-KG Typed-Edge Stage: the Countries-KG typed-edge stage is a typed-edge construction stage only; it does not validate live KBS deployment, KGQA accuracy, semantic parsing, or maintenance outcomes.</w:t>
       </w:r>
     </w:p>
     <w:p>

</xml_diff>